<commit_message>
FIX: Refactor person and author entities
</commit_message>
<xml_diff>
--- a/Optimization.docx
+++ b/Optimization.docx
@@ -42,7 +42,23 @@
     </w:p>
     <w:p>
       <w:r>
-        <w:t>Compare AddAuthor's national code check to AddMember's:</w:t>
+        <w:t xml:space="preserve">Compare </w:t>
+      </w:r>
+      <w:proofErr w:type="spellStart"/>
+      <w:r>
+        <w:t>AddAuthor's</w:t>
+      </w:r>
+      <w:proofErr w:type="spellEnd"/>
+      <w:r>
+        <w:t xml:space="preserve"> national code check to </w:t>
+      </w:r>
+      <w:proofErr w:type="spellStart"/>
+      <w:r>
+        <w:t>AddMember's</w:t>
+      </w:r>
+      <w:proofErr w:type="spellEnd"/>
+      <w:r>
+        <w:t>:</w:t>
       </w:r>
     </w:p>
     <w:p>
@@ -95,8 +111,19 @@
           <w:sz w:val="17"/>
           <w:szCs w:val="17"/>
         </w:rPr>
-        <w:t>// AddAuthor</w:t>
-      </w:r>
+        <w:t xml:space="preserve">// </w:t>
+      </w:r>
+      <w:proofErr w:type="spellStart"/>
+      <w:r>
+        <w:rPr>
+          <w:rFonts w:ascii="Consolas" w:hAnsi="Consolas" w:cs="Courier New"/>
+          <w:color w:val="880000"/>
+          <w:sz w:val="17"/>
+          <w:szCs w:val="17"/>
+        </w:rPr>
+        <w:t>AddAuthor</w:t>
+      </w:r>
+      <w:proofErr w:type="spellEnd"/>
     </w:p>
     <w:p>
       <w:pPr>
@@ -175,7 +202,18 @@
           <w:sz w:val="17"/>
           <w:szCs w:val="17"/>
         </w:rPr>
-        <w:t>_authors</w:t>
+        <w:t>_</w:t>
+      </w:r>
+      <w:proofErr w:type="spellStart"/>
+      <w:proofErr w:type="gramStart"/>
+      <w:r>
+        <w:rPr>
+          <w:rFonts w:ascii="Consolas" w:hAnsi="Consolas" w:cs="Courier New"/>
+          <w:color w:val="000000"/>
+          <w:sz w:val="17"/>
+          <w:szCs w:val="17"/>
+        </w:rPr>
+        <w:t>authors</w:t>
       </w:r>
       <w:r>
         <w:rPr>
@@ -195,6 +233,8 @@
         </w:rPr>
         <w:t>Any</w:t>
       </w:r>
+      <w:proofErr w:type="spellEnd"/>
+      <w:proofErr w:type="gramEnd"/>
       <w:r>
         <w:rPr>
           <w:rFonts w:ascii="Consolas" w:hAnsi="Consolas" w:cs="Courier New"/>
@@ -229,7 +269,18 @@
           <w:sz w:val="17"/>
           <w:szCs w:val="17"/>
         </w:rPr>
-        <w:t xml:space="preserve"> author</w:t>
+        <w:t xml:space="preserve"> </w:t>
+      </w:r>
+      <w:proofErr w:type="spellStart"/>
+      <w:proofErr w:type="gramStart"/>
+      <w:r>
+        <w:rPr>
+          <w:rFonts w:ascii="Consolas" w:hAnsi="Consolas" w:cs="Courier New"/>
+          <w:color w:val="000000"/>
+          <w:sz w:val="17"/>
+          <w:szCs w:val="17"/>
+        </w:rPr>
+        <w:t>author</w:t>
       </w:r>
       <w:r>
         <w:rPr>
@@ -249,6 +300,8 @@
         </w:rPr>
         <w:t>NationalCode</w:t>
       </w:r>
+      <w:proofErr w:type="spellEnd"/>
+      <w:proofErr w:type="gramEnd"/>
       <w:r>
         <w:rPr>
           <w:rFonts w:ascii="Consolas" w:hAnsi="Consolas" w:cs="Courier New"/>
@@ -274,7 +327,18 @@
           <w:sz w:val="17"/>
           <w:szCs w:val="17"/>
         </w:rPr>
-        <w:t xml:space="preserve"> dto</w:t>
+        <w:t xml:space="preserve"> </w:t>
+      </w:r>
+      <w:proofErr w:type="spellStart"/>
+      <w:proofErr w:type="gramStart"/>
+      <w:r>
+        <w:rPr>
+          <w:rFonts w:ascii="Consolas" w:hAnsi="Consolas" w:cs="Courier New"/>
+          <w:color w:val="000000"/>
+          <w:sz w:val="17"/>
+          <w:szCs w:val="17"/>
+        </w:rPr>
+        <w:t>dto</w:t>
       </w:r>
       <w:r>
         <w:rPr>
@@ -294,6 +358,8 @@
         </w:rPr>
         <w:t>NationalCode</w:t>
       </w:r>
+      <w:proofErr w:type="spellEnd"/>
+      <w:proofErr w:type="gramEnd"/>
       <w:r>
         <w:rPr>
           <w:rFonts w:ascii="Consolas" w:hAnsi="Consolas" w:cs="Courier New"/>
@@ -374,6 +440,7 @@
         </w:rPr>
         <w:t xml:space="preserve"> </w:t>
       </w:r>
+      <w:proofErr w:type="spellStart"/>
       <w:r>
         <w:rPr>
           <w:rFonts w:ascii="Consolas" w:hAnsi="Consolas" w:cs="Courier New"/>
@@ -383,6 +450,7 @@
         </w:rPr>
         <w:t>ServiceResult</w:t>
       </w:r>
+      <w:proofErr w:type="spellEnd"/>
       <w:r>
         <w:rPr>
           <w:rFonts w:ascii="Consolas" w:hAnsi="Consolas" w:cs="Courier New"/>
@@ -532,8 +600,19 @@
           <w:sz w:val="17"/>
           <w:szCs w:val="17"/>
         </w:rPr>
-        <w:t>// AddMember</w:t>
-      </w:r>
+        <w:t xml:space="preserve">// </w:t>
+      </w:r>
+      <w:proofErr w:type="spellStart"/>
+      <w:r>
+        <w:rPr>
+          <w:rFonts w:ascii="Consolas" w:hAnsi="Consolas" w:cs="Courier New"/>
+          <w:color w:val="880000"/>
+          <w:sz w:val="17"/>
+          <w:szCs w:val="17"/>
+        </w:rPr>
+        <w:t>AddMember</w:t>
+      </w:r>
+      <w:proofErr w:type="spellEnd"/>
     </w:p>
     <w:p>
       <w:pPr>
@@ -612,7 +691,18 @@
           <w:sz w:val="17"/>
           <w:szCs w:val="17"/>
         </w:rPr>
-        <w:t>_members</w:t>
+        <w:t>_</w:t>
+      </w:r>
+      <w:proofErr w:type="spellStart"/>
+      <w:proofErr w:type="gramStart"/>
+      <w:r>
+        <w:rPr>
+          <w:rFonts w:ascii="Consolas" w:hAnsi="Consolas" w:cs="Courier New"/>
+          <w:color w:val="000000"/>
+          <w:sz w:val="17"/>
+          <w:szCs w:val="17"/>
+        </w:rPr>
+        <w:t>members</w:t>
       </w:r>
       <w:r>
         <w:rPr>
@@ -632,6 +722,8 @@
         </w:rPr>
         <w:t>Any</w:t>
       </w:r>
+      <w:proofErr w:type="spellEnd"/>
+      <w:proofErr w:type="gramEnd"/>
       <w:r>
         <w:rPr>
           <w:rFonts w:ascii="Consolas" w:hAnsi="Consolas" w:cs="Courier New"/>
@@ -666,7 +758,18 @@
           <w:sz w:val="17"/>
           <w:szCs w:val="17"/>
         </w:rPr>
-        <w:t xml:space="preserve"> member</w:t>
+        <w:t xml:space="preserve"> </w:t>
+      </w:r>
+      <w:proofErr w:type="spellStart"/>
+      <w:proofErr w:type="gramStart"/>
+      <w:r>
+        <w:rPr>
+          <w:rFonts w:ascii="Consolas" w:hAnsi="Consolas" w:cs="Courier New"/>
+          <w:color w:val="000000"/>
+          <w:sz w:val="17"/>
+          <w:szCs w:val="17"/>
+        </w:rPr>
+        <w:t>member</w:t>
       </w:r>
       <w:r>
         <w:rPr>
@@ -686,6 +789,8 @@
         </w:rPr>
         <w:t>NationalCode</w:t>
       </w:r>
+      <w:proofErr w:type="spellEnd"/>
+      <w:proofErr w:type="gramEnd"/>
       <w:r>
         <w:rPr>
           <w:rFonts w:ascii="Consolas" w:hAnsi="Consolas" w:cs="Courier New"/>
@@ -711,7 +816,18 @@
           <w:sz w:val="17"/>
           <w:szCs w:val="17"/>
         </w:rPr>
-        <w:t xml:space="preserve"> dto</w:t>
+        <w:t xml:space="preserve"> </w:t>
+      </w:r>
+      <w:proofErr w:type="spellStart"/>
+      <w:proofErr w:type="gramStart"/>
+      <w:r>
+        <w:rPr>
+          <w:rFonts w:ascii="Consolas" w:hAnsi="Consolas" w:cs="Courier New"/>
+          <w:color w:val="000000"/>
+          <w:sz w:val="17"/>
+          <w:szCs w:val="17"/>
+        </w:rPr>
+        <w:t>dto</w:t>
       </w:r>
       <w:r>
         <w:rPr>
@@ -731,6 +847,8 @@
         </w:rPr>
         <w:t>NationalCode</w:t>
       </w:r>
+      <w:proofErr w:type="spellEnd"/>
+      <w:proofErr w:type="gramEnd"/>
       <w:r>
         <w:rPr>
           <w:rFonts w:ascii="Consolas" w:hAnsi="Consolas" w:cs="Courier New"/>
@@ -811,6 +929,7 @@
         </w:rPr>
         <w:t xml:space="preserve"> </w:t>
       </w:r>
+      <w:proofErr w:type="spellStart"/>
       <w:r>
         <w:rPr>
           <w:rFonts w:ascii="Consolas" w:hAnsi="Consolas" w:cs="Courier New"/>
@@ -820,6 +939,7 @@
         </w:rPr>
         <w:t>ServiceResult</w:t>
       </w:r>
+      <w:proofErr w:type="spellEnd"/>
       <w:r>
         <w:rPr>
           <w:rFonts w:ascii="Consolas" w:hAnsi="Consolas" w:cs="Courier New"/>
@@ -868,7 +988,23 @@
     </w:p>
     <w:p>
       <w:r>
-        <w:t>And the UpdateAuthor/UpdateMember versions follow the identical structural pattern too — same for email and name checks. This is a strong duplication signal.</w:t>
+        <w:t xml:space="preserve">And the </w:t>
+      </w:r>
+      <w:proofErr w:type="spellStart"/>
+      <w:r>
+        <w:t>UpdateAuthor</w:t>
+      </w:r>
+      <w:proofErr w:type="spellEnd"/>
+      <w:r>
+        <w:t>/</w:t>
+      </w:r>
+      <w:proofErr w:type="spellStart"/>
+      <w:r>
+        <w:t>UpdateMember</w:t>
+      </w:r>
+      <w:proofErr w:type="spellEnd"/>
+      <w:r>
+        <w:t xml:space="preserve"> versions follow the identical structural pattern too — same for email and name checks. This is a strong duplication signal.</w:t>
       </w:r>
     </w:p>
     <w:p>
@@ -898,7 +1034,15 @@
         <w:t>generic private helper methods</w:t>
       </w:r>
       <w:r>
-        <w:t xml:space="preserve"> that operate on any List&lt;T&gt; where T : Person:</w:t>
+        <w:t xml:space="preserve"> that operate on any List&lt;T&gt; where </w:t>
+      </w:r>
+      <w:proofErr w:type="gramStart"/>
+      <w:r>
+        <w:t>T :</w:t>
+      </w:r>
+      <w:proofErr w:type="gramEnd"/>
+      <w:r>
+        <w:t xml:space="preserve"> Person:</w:t>
       </w:r>
     </w:p>
     <w:p>
@@ -998,6 +1142,7 @@
         </w:rPr>
         <w:t xml:space="preserve"> </w:t>
       </w:r>
+      <w:proofErr w:type="spellStart"/>
       <w:r>
         <w:rPr>
           <w:rFonts w:ascii="Consolas" w:hAnsi="Consolas" w:cs="Courier New"/>
@@ -1007,6 +1152,7 @@
         </w:rPr>
         <w:t>IsDuplicateNationalCode</w:t>
       </w:r>
+      <w:proofErr w:type="spellEnd"/>
       <w:r>
         <w:rPr>
           <w:rFonts w:ascii="Consolas" w:hAnsi="Consolas" w:cs="Courier New"/>
@@ -1034,6 +1180,7 @@
         </w:rPr>
         <w:t>&gt;(</w:t>
       </w:r>
+      <w:proofErr w:type="spellStart"/>
       <w:r>
         <w:rPr>
           <w:rFonts w:ascii="Consolas" w:hAnsi="Consolas" w:cs="Courier New"/>
@@ -1043,6 +1190,7 @@
         </w:rPr>
         <w:t>IEnumerable</w:t>
       </w:r>
+      <w:proofErr w:type="spellEnd"/>
       <w:r>
         <w:rPr>
           <w:rFonts w:ascii="Consolas" w:hAnsi="Consolas" w:cs="Courier New"/>
@@ -1113,8 +1261,19 @@
           <w:sz w:val="17"/>
           <w:szCs w:val="17"/>
         </w:rPr>
-        <w:t xml:space="preserve"> nationalCode</w:t>
-      </w:r>
+        <w:t xml:space="preserve"> </w:t>
+      </w:r>
+      <w:proofErr w:type="spellStart"/>
+      <w:r>
+        <w:rPr>
+          <w:rFonts w:ascii="Consolas" w:hAnsi="Consolas" w:cs="Courier New"/>
+          <w:color w:val="000000"/>
+          <w:sz w:val="17"/>
+          <w:szCs w:val="17"/>
+        </w:rPr>
+        <w:t>nationalCode</w:t>
+      </w:r>
+      <w:proofErr w:type="spellEnd"/>
       <w:r>
         <w:rPr>
           <w:rFonts w:ascii="Consolas" w:hAnsi="Consolas" w:cs="Courier New"/>
@@ -1149,7 +1308,27 @@
           <w:sz w:val="17"/>
           <w:szCs w:val="17"/>
         </w:rPr>
-        <w:t xml:space="preserve"> excludeId </w:t>
+        <w:t xml:space="preserve"> </w:t>
+      </w:r>
+      <w:proofErr w:type="spellStart"/>
+      <w:r>
+        <w:rPr>
+          <w:rFonts w:ascii="Consolas" w:hAnsi="Consolas" w:cs="Courier New"/>
+          <w:color w:val="000000"/>
+          <w:sz w:val="17"/>
+          <w:szCs w:val="17"/>
+        </w:rPr>
+        <w:t>excludeId</w:t>
+      </w:r>
+      <w:proofErr w:type="spellEnd"/>
+      <w:r>
+        <w:rPr>
+          <w:rFonts w:ascii="Consolas" w:hAnsi="Consolas" w:cs="Courier New"/>
+          <w:color w:val="000000"/>
+          <w:sz w:val="17"/>
+          <w:szCs w:val="17"/>
+        </w:rPr>
+        <w:t xml:space="preserve"> </w:t>
       </w:r>
       <w:r>
         <w:rPr>
@@ -1265,7 +1444,17 @@
           <w:sz w:val="17"/>
           <w:szCs w:val="17"/>
         </w:rPr>
-        <w:t xml:space="preserve"> T </w:t>
+        <w:t xml:space="preserve"> </w:t>
+      </w:r>
+      <w:proofErr w:type="gramStart"/>
+      <w:r>
+        <w:rPr>
+          <w:rFonts w:ascii="Consolas" w:hAnsi="Consolas" w:cs="Courier New"/>
+          <w:color w:val="000000"/>
+          <w:sz w:val="17"/>
+          <w:szCs w:val="17"/>
+        </w:rPr>
+        <w:t xml:space="preserve">T </w:t>
       </w:r>
       <w:r>
         <w:rPr>
@@ -1276,6 +1465,7 @@
         </w:rPr>
         <w:t>:</w:t>
       </w:r>
+      <w:proofErr w:type="gramEnd"/>
       <w:r>
         <w:rPr>
           <w:rFonts w:ascii="Consolas" w:hAnsi="Consolas" w:cs="Courier New"/>
@@ -1416,7 +1606,18 @@
           <w:sz w:val="17"/>
           <w:szCs w:val="17"/>
         </w:rPr>
-        <w:t xml:space="preserve"> items</w:t>
+        <w:t xml:space="preserve"> </w:t>
+      </w:r>
+      <w:proofErr w:type="spellStart"/>
+      <w:proofErr w:type="gramStart"/>
+      <w:r>
+        <w:rPr>
+          <w:rFonts w:ascii="Consolas" w:hAnsi="Consolas" w:cs="Courier New"/>
+          <w:color w:val="000000"/>
+          <w:sz w:val="17"/>
+          <w:szCs w:val="17"/>
+        </w:rPr>
+        <w:t>items</w:t>
       </w:r>
       <w:r>
         <w:rPr>
@@ -1436,6 +1637,8 @@
         </w:rPr>
         <w:t>Any</w:t>
       </w:r>
+      <w:proofErr w:type="spellEnd"/>
+      <w:proofErr w:type="gramEnd"/>
       <w:r>
         <w:rPr>
           <w:rFonts w:ascii="Consolas" w:hAnsi="Consolas" w:cs="Courier New"/>
@@ -1470,7 +1673,18 @@
           <w:sz w:val="17"/>
           <w:szCs w:val="17"/>
         </w:rPr>
-        <w:t xml:space="preserve"> item</w:t>
+        <w:t xml:space="preserve"> </w:t>
+      </w:r>
+      <w:proofErr w:type="spellStart"/>
+      <w:proofErr w:type="gramStart"/>
+      <w:r>
+        <w:rPr>
+          <w:rFonts w:ascii="Consolas" w:hAnsi="Consolas" w:cs="Courier New"/>
+          <w:color w:val="000000"/>
+          <w:sz w:val="17"/>
+          <w:szCs w:val="17"/>
+        </w:rPr>
+        <w:t>item</w:t>
       </w:r>
       <w:r>
         <w:rPr>
@@ -1490,6 +1704,7 @@
         </w:rPr>
         <w:t>Id</w:t>
       </w:r>
+      <w:proofErr w:type="spellEnd"/>
       <w:r>
         <w:rPr>
           <w:rFonts w:ascii="Consolas" w:hAnsi="Consolas" w:cs="Courier New"/>
@@ -1508,14 +1723,35 @@
         </w:rPr>
         <w:t>!=</w:t>
       </w:r>
-      <w:r>
-        <w:rPr>
-          <w:rFonts w:ascii="Consolas" w:hAnsi="Consolas" w:cs="Courier New"/>
-          <w:color w:val="000000"/>
-          <w:sz w:val="17"/>
-          <w:szCs w:val="17"/>
-        </w:rPr>
-        <w:t xml:space="preserve"> excludeId </w:t>
+      <w:proofErr w:type="gramEnd"/>
+      <w:r>
+        <w:rPr>
+          <w:rFonts w:ascii="Consolas" w:hAnsi="Consolas" w:cs="Courier New"/>
+          <w:color w:val="000000"/>
+          <w:sz w:val="17"/>
+          <w:szCs w:val="17"/>
+        </w:rPr>
+        <w:t xml:space="preserve"> </w:t>
+      </w:r>
+      <w:proofErr w:type="spellStart"/>
+      <w:r>
+        <w:rPr>
+          <w:rFonts w:ascii="Consolas" w:hAnsi="Consolas" w:cs="Courier New"/>
+          <w:color w:val="000000"/>
+          <w:sz w:val="17"/>
+          <w:szCs w:val="17"/>
+        </w:rPr>
+        <w:t>excludeId</w:t>
+      </w:r>
+      <w:proofErr w:type="spellEnd"/>
+      <w:r>
+        <w:rPr>
+          <w:rFonts w:ascii="Consolas" w:hAnsi="Consolas" w:cs="Courier New"/>
+          <w:color w:val="000000"/>
+          <w:sz w:val="17"/>
+          <w:szCs w:val="17"/>
+        </w:rPr>
+        <w:t xml:space="preserve"> </w:t>
       </w:r>
       <w:r>
         <w:rPr>
@@ -1533,7 +1769,18 @@
           <w:sz w:val="17"/>
           <w:szCs w:val="17"/>
         </w:rPr>
-        <w:t xml:space="preserve"> item</w:t>
+        <w:t xml:space="preserve"> </w:t>
+      </w:r>
+      <w:proofErr w:type="spellStart"/>
+      <w:proofErr w:type="gramStart"/>
+      <w:r>
+        <w:rPr>
+          <w:rFonts w:ascii="Consolas" w:hAnsi="Consolas" w:cs="Courier New"/>
+          <w:color w:val="000000"/>
+          <w:sz w:val="17"/>
+          <w:szCs w:val="17"/>
+        </w:rPr>
+        <w:t>item</w:t>
       </w:r>
       <w:r>
         <w:rPr>
@@ -1553,6 +1800,8 @@
         </w:rPr>
         <w:t>NationalCode</w:t>
       </w:r>
+      <w:proofErr w:type="spellEnd"/>
+      <w:proofErr w:type="gramEnd"/>
       <w:r>
         <w:rPr>
           <w:rFonts w:ascii="Consolas" w:hAnsi="Consolas" w:cs="Courier New"/>
@@ -1578,8 +1827,19 @@
           <w:sz w:val="17"/>
           <w:szCs w:val="17"/>
         </w:rPr>
-        <w:t xml:space="preserve"> nationalCode</w:t>
-      </w:r>
+        <w:t xml:space="preserve"> </w:t>
+      </w:r>
+      <w:proofErr w:type="spellStart"/>
+      <w:r>
+        <w:rPr>
+          <w:rFonts w:ascii="Consolas" w:hAnsi="Consolas" w:cs="Courier New"/>
+          <w:color w:val="000000"/>
+          <w:sz w:val="17"/>
+          <w:szCs w:val="17"/>
+        </w:rPr>
+        <w:t>nationalCode</w:t>
+      </w:r>
+      <w:proofErr w:type="spellEnd"/>
       <w:r>
         <w:rPr>
           <w:rFonts w:ascii="Consolas" w:hAnsi="Consolas" w:cs="Courier New"/>
@@ -1631,7 +1891,16 @@
           <w:sz w:val="17"/>
           <w:szCs w:val="17"/>
         </w:rPr>
-        <w:t xml:space="preserve"> 5. </w:t>
+        <w:t xml:space="preserve"> </w:t>
+      </w:r>
+      <w:proofErr w:type="gramStart"/>
+      <w:r>
+        <w:rPr>
+          <w:rFonts w:ascii="Consolas" w:hAnsi="Consolas" w:cs="Courier New"/>
+          <w:sz w:val="17"/>
+          <w:szCs w:val="17"/>
+        </w:rPr>
+        <w:t xml:space="preserve">5. </w:t>
       </w:r>
       <w:r>
         <w:rPr>
@@ -1642,6 +1911,7 @@
         </w:rPr>
         <w:t>}</w:t>
       </w:r>
+      <w:proofErr w:type="gramEnd"/>
     </w:p>
     <w:p>
       <w:pPr>
@@ -1793,6 +2063,7 @@
         </w:rPr>
         <w:t xml:space="preserve"> </w:t>
       </w:r>
+      <w:proofErr w:type="spellStart"/>
       <w:r>
         <w:rPr>
           <w:rFonts w:ascii="Consolas" w:hAnsi="Consolas" w:cs="Courier New"/>
@@ -1802,6 +2073,7 @@
         </w:rPr>
         <w:t>IsDuplicateEmail</w:t>
       </w:r>
+      <w:proofErr w:type="spellEnd"/>
       <w:r>
         <w:rPr>
           <w:rFonts w:ascii="Consolas" w:hAnsi="Consolas" w:cs="Courier New"/>
@@ -1829,6 +2101,7 @@
         </w:rPr>
         <w:t>&gt;(</w:t>
       </w:r>
+      <w:proofErr w:type="spellStart"/>
       <w:r>
         <w:rPr>
           <w:rFonts w:ascii="Consolas" w:hAnsi="Consolas" w:cs="Courier New"/>
@@ -1838,6 +2111,7 @@
         </w:rPr>
         <w:t>IEnumerable</w:t>
       </w:r>
+      <w:proofErr w:type="spellEnd"/>
       <w:r>
         <w:rPr>
           <w:rFonts w:ascii="Consolas" w:hAnsi="Consolas" w:cs="Courier New"/>
@@ -1944,7 +2218,27 @@
           <w:sz w:val="17"/>
           <w:szCs w:val="17"/>
         </w:rPr>
-        <w:t xml:space="preserve"> excludeId </w:t>
+        <w:t xml:space="preserve"> </w:t>
+      </w:r>
+      <w:proofErr w:type="spellStart"/>
+      <w:r>
+        <w:rPr>
+          <w:rFonts w:ascii="Consolas" w:hAnsi="Consolas" w:cs="Courier New"/>
+          <w:color w:val="000000"/>
+          <w:sz w:val="17"/>
+          <w:szCs w:val="17"/>
+        </w:rPr>
+        <w:t>excludeId</w:t>
+      </w:r>
+      <w:proofErr w:type="spellEnd"/>
+      <w:r>
+        <w:rPr>
+          <w:rFonts w:ascii="Consolas" w:hAnsi="Consolas" w:cs="Courier New"/>
+          <w:color w:val="000000"/>
+          <w:sz w:val="17"/>
+          <w:szCs w:val="17"/>
+        </w:rPr>
+        <w:t xml:space="preserve"> </w:t>
       </w:r>
       <w:r>
         <w:rPr>
@@ -2060,7 +2354,17 @@
           <w:sz w:val="17"/>
           <w:szCs w:val="17"/>
         </w:rPr>
-        <w:t xml:space="preserve"> T </w:t>
+        <w:t xml:space="preserve"> </w:t>
+      </w:r>
+      <w:proofErr w:type="gramStart"/>
+      <w:r>
+        <w:rPr>
+          <w:rFonts w:ascii="Consolas" w:hAnsi="Consolas" w:cs="Courier New"/>
+          <w:color w:val="000000"/>
+          <w:sz w:val="17"/>
+          <w:szCs w:val="17"/>
+        </w:rPr>
+        <w:t xml:space="preserve">T </w:t>
       </w:r>
       <w:r>
         <w:rPr>
@@ -2071,6 +2375,7 @@
         </w:rPr>
         <w:t>:</w:t>
       </w:r>
+      <w:proofErr w:type="gramEnd"/>
       <w:r>
         <w:rPr>
           <w:rFonts w:ascii="Consolas" w:hAnsi="Consolas" w:cs="Courier New"/>
@@ -2211,7 +2516,18 @@
           <w:sz w:val="17"/>
           <w:szCs w:val="17"/>
         </w:rPr>
-        <w:t xml:space="preserve"> items</w:t>
+        <w:t xml:space="preserve"> </w:t>
+      </w:r>
+      <w:proofErr w:type="spellStart"/>
+      <w:proofErr w:type="gramStart"/>
+      <w:r>
+        <w:rPr>
+          <w:rFonts w:ascii="Consolas" w:hAnsi="Consolas" w:cs="Courier New"/>
+          <w:color w:val="000000"/>
+          <w:sz w:val="17"/>
+          <w:szCs w:val="17"/>
+        </w:rPr>
+        <w:t>items</w:t>
       </w:r>
       <w:r>
         <w:rPr>
@@ -2231,6 +2547,8 @@
         </w:rPr>
         <w:t>Any</w:t>
       </w:r>
+      <w:proofErr w:type="spellEnd"/>
+      <w:proofErr w:type="gramEnd"/>
       <w:r>
         <w:rPr>
           <w:rFonts w:ascii="Consolas" w:hAnsi="Consolas" w:cs="Courier New"/>
@@ -2265,7 +2583,18 @@
           <w:sz w:val="17"/>
           <w:szCs w:val="17"/>
         </w:rPr>
-        <w:t xml:space="preserve"> item</w:t>
+        <w:t xml:space="preserve"> </w:t>
+      </w:r>
+      <w:proofErr w:type="spellStart"/>
+      <w:proofErr w:type="gramStart"/>
+      <w:r>
+        <w:rPr>
+          <w:rFonts w:ascii="Consolas" w:hAnsi="Consolas" w:cs="Courier New"/>
+          <w:color w:val="000000"/>
+          <w:sz w:val="17"/>
+          <w:szCs w:val="17"/>
+        </w:rPr>
+        <w:t>item</w:t>
       </w:r>
       <w:r>
         <w:rPr>
@@ -2285,6 +2614,7 @@
         </w:rPr>
         <w:t>Id</w:t>
       </w:r>
+      <w:proofErr w:type="spellEnd"/>
       <w:r>
         <w:rPr>
           <w:rFonts w:ascii="Consolas" w:hAnsi="Consolas" w:cs="Courier New"/>
@@ -2303,14 +2633,35 @@
         </w:rPr>
         <w:t>!=</w:t>
       </w:r>
-      <w:r>
-        <w:rPr>
-          <w:rFonts w:ascii="Consolas" w:hAnsi="Consolas" w:cs="Courier New"/>
-          <w:color w:val="000000"/>
-          <w:sz w:val="17"/>
-          <w:szCs w:val="17"/>
-        </w:rPr>
-        <w:t xml:space="preserve"> excludeId </w:t>
+      <w:proofErr w:type="gramEnd"/>
+      <w:r>
+        <w:rPr>
+          <w:rFonts w:ascii="Consolas" w:hAnsi="Consolas" w:cs="Courier New"/>
+          <w:color w:val="000000"/>
+          <w:sz w:val="17"/>
+          <w:szCs w:val="17"/>
+        </w:rPr>
+        <w:t xml:space="preserve"> </w:t>
+      </w:r>
+      <w:proofErr w:type="spellStart"/>
+      <w:r>
+        <w:rPr>
+          <w:rFonts w:ascii="Consolas" w:hAnsi="Consolas" w:cs="Courier New"/>
+          <w:color w:val="000000"/>
+          <w:sz w:val="17"/>
+          <w:szCs w:val="17"/>
+        </w:rPr>
+        <w:t>excludeId</w:t>
+      </w:r>
+      <w:proofErr w:type="spellEnd"/>
+      <w:r>
+        <w:rPr>
+          <w:rFonts w:ascii="Consolas" w:hAnsi="Consolas" w:cs="Courier New"/>
+          <w:color w:val="000000"/>
+          <w:sz w:val="17"/>
+          <w:szCs w:val="17"/>
+        </w:rPr>
+        <w:t xml:space="preserve"> </w:t>
       </w:r>
       <w:r>
         <w:rPr>
@@ -2328,7 +2679,18 @@
           <w:sz w:val="17"/>
           <w:szCs w:val="17"/>
         </w:rPr>
-        <w:t xml:space="preserve"> item</w:t>
+        <w:t xml:space="preserve"> </w:t>
+      </w:r>
+      <w:proofErr w:type="spellStart"/>
+      <w:proofErr w:type="gramStart"/>
+      <w:r>
+        <w:rPr>
+          <w:rFonts w:ascii="Consolas" w:hAnsi="Consolas" w:cs="Courier New"/>
+          <w:color w:val="000000"/>
+          <w:sz w:val="17"/>
+          <w:szCs w:val="17"/>
+        </w:rPr>
+        <w:t>item</w:t>
       </w:r>
       <w:r>
         <w:rPr>
@@ -2366,6 +2728,8 @@
         </w:rPr>
         <w:t>Equals</w:t>
       </w:r>
+      <w:proofErr w:type="spellEnd"/>
+      <w:proofErr w:type="gramEnd"/>
       <w:r>
         <w:rPr>
           <w:rFonts w:ascii="Consolas" w:hAnsi="Consolas" w:cs="Courier New"/>
@@ -2402,6 +2766,7 @@
         </w:rPr>
         <w:t xml:space="preserve"> </w:t>
       </w:r>
+      <w:proofErr w:type="spellStart"/>
       <w:r>
         <w:rPr>
           <w:rFonts w:ascii="Consolas" w:hAnsi="Consolas" w:cs="Courier New"/>
@@ -2429,6 +2794,7 @@
         </w:rPr>
         <w:t>OrdinalIgnoreCase</w:t>
       </w:r>
+      <w:proofErr w:type="spellEnd"/>
       <w:r>
         <w:rPr>
           <w:rFonts w:ascii="Consolas" w:hAnsi="Consolas" w:cs="Courier New"/>
@@ -2474,6 +2840,7 @@
           <w:szCs w:val="17"/>
         </w:rPr>
       </w:pPr>
+      <w:proofErr w:type="gramStart"/>
       <w:r>
         <w:rPr>
           <w:rFonts w:ascii="Consolas" w:hAnsi="Consolas" w:cs="Courier New"/>
@@ -2491,15 +2858,52 @@
         </w:rPr>
         <w:t>}</w:t>
       </w:r>
+      <w:proofErr w:type="gramEnd"/>
     </w:p>
     <w:p>
       <w:r>
-        <w:t>This assumes Id lives on Person (which it appears to, based on author.Id and member.Id both being used) — confirm this by checking Person.cs.</w:t>
+        <w:t xml:space="preserve">This assumes Id lives on Person (which it appears to, based on </w:t>
+      </w:r>
+      <w:proofErr w:type="spellStart"/>
+      <w:proofErr w:type="gramStart"/>
+      <w:r>
+        <w:t>author.Id</w:t>
+      </w:r>
+      <w:proofErr w:type="spellEnd"/>
+      <w:proofErr w:type="gramEnd"/>
+      <w:r>
+        <w:t xml:space="preserve"> and </w:t>
+      </w:r>
+      <w:proofErr w:type="spellStart"/>
+      <w:proofErr w:type="gramStart"/>
+      <w:r>
+        <w:t>member.Id</w:t>
+      </w:r>
+      <w:proofErr w:type="spellEnd"/>
+      <w:proofErr w:type="gramEnd"/>
+      <w:r>
+        <w:t xml:space="preserve"> both being used) — confirm this by checking </w:t>
+      </w:r>
+      <w:proofErr w:type="spellStart"/>
+      <w:r>
+        <w:t>Person.cs</w:t>
+      </w:r>
+      <w:proofErr w:type="spellEnd"/>
+      <w:r>
+        <w:t>.</w:t>
       </w:r>
     </w:p>
     <w:p>
       <w:r>
-        <w:t>Usage in AddAuthor:</w:t>
+        <w:t xml:space="preserve">Usage in </w:t>
+      </w:r>
+      <w:proofErr w:type="spellStart"/>
+      <w:r>
+        <w:t>AddAuthor</w:t>
+      </w:r>
+      <w:proofErr w:type="spellEnd"/>
+      <w:r>
+        <w:t>:</w:t>
       </w:r>
     </w:p>
     <w:p>
@@ -2572,6 +2976,8 @@
         </w:rPr>
         <w:t>(</w:t>
       </w:r>
+      <w:proofErr w:type="spellStart"/>
+      <w:proofErr w:type="gramStart"/>
       <w:r>
         <w:rPr>
           <w:rFonts w:ascii="Consolas" w:hAnsi="Consolas" w:cs="Courier New"/>
@@ -2581,6 +2987,7 @@
         </w:rPr>
         <w:t>IsDuplicateNationalCode</w:t>
       </w:r>
+      <w:proofErr w:type="spellEnd"/>
       <w:r>
         <w:rPr>
           <w:rFonts w:ascii="Consolas" w:hAnsi="Consolas" w:cs="Courier New"/>
@@ -2590,6 +2997,7 @@
         </w:rPr>
         <w:t>(</w:t>
       </w:r>
+      <w:proofErr w:type="gramEnd"/>
       <w:r>
         <w:rPr>
           <w:rFonts w:ascii="Consolas" w:hAnsi="Consolas" w:cs="Courier New"/>
@@ -2615,7 +3023,18 @@
           <w:sz w:val="17"/>
           <w:szCs w:val="17"/>
         </w:rPr>
-        <w:t xml:space="preserve"> dto</w:t>
+        <w:t xml:space="preserve"> </w:t>
+      </w:r>
+      <w:proofErr w:type="spellStart"/>
+      <w:proofErr w:type="gramStart"/>
+      <w:r>
+        <w:rPr>
+          <w:rFonts w:ascii="Consolas" w:hAnsi="Consolas" w:cs="Courier New"/>
+          <w:color w:val="000000"/>
+          <w:sz w:val="17"/>
+          <w:szCs w:val="17"/>
+        </w:rPr>
+        <w:t>dto</w:t>
       </w:r>
       <w:r>
         <w:rPr>
@@ -2635,6 +3054,8 @@
         </w:rPr>
         <w:t>NationalCode</w:t>
       </w:r>
+      <w:proofErr w:type="spellEnd"/>
+      <w:proofErr w:type="gramEnd"/>
       <w:r>
         <w:rPr>
           <w:rFonts w:ascii="Consolas" w:hAnsi="Consolas" w:cs="Courier New"/>
@@ -2715,6 +3136,7 @@
         </w:rPr>
         <w:t xml:space="preserve"> </w:t>
       </w:r>
+      <w:proofErr w:type="spellStart"/>
       <w:r>
         <w:rPr>
           <w:rFonts w:ascii="Consolas" w:hAnsi="Consolas" w:cs="Courier New"/>
@@ -2724,6 +3146,7 @@
         </w:rPr>
         <w:t>ServiceResult</w:t>
       </w:r>
+      <w:proofErr w:type="spellEnd"/>
       <w:r>
         <w:rPr>
           <w:rFonts w:ascii="Consolas" w:hAnsi="Consolas" w:cs="Courier New"/>
@@ -2772,7 +3195,15 @@
     </w:p>
     <w:p>
       <w:r>
-        <w:t>Usage in UpdateAuthor:</w:t>
+        <w:t xml:space="preserve">Usage in </w:t>
+      </w:r>
+      <w:proofErr w:type="spellStart"/>
+      <w:r>
+        <w:t>UpdateAuthor</w:t>
+      </w:r>
+      <w:proofErr w:type="spellEnd"/>
+      <w:r>
+        <w:t>:</w:t>
       </w:r>
     </w:p>
     <w:p>
@@ -2845,6 +3276,8 @@
         </w:rPr>
         <w:t>(</w:t>
       </w:r>
+      <w:proofErr w:type="spellStart"/>
+      <w:proofErr w:type="gramStart"/>
       <w:r>
         <w:rPr>
           <w:rFonts w:ascii="Consolas" w:hAnsi="Consolas" w:cs="Courier New"/>
@@ -2872,6 +3305,8 @@
         </w:rPr>
         <w:t>NationalCode</w:t>
       </w:r>
+      <w:proofErr w:type="spellEnd"/>
+      <w:proofErr w:type="gramEnd"/>
       <w:r>
         <w:rPr>
           <w:rFonts w:ascii="Consolas" w:hAnsi="Consolas" w:cs="Courier New"/>
@@ -2953,6 +3388,8 @@
         </w:rPr>
         <w:t xml:space="preserve"> </w:t>
       </w:r>
+      <w:proofErr w:type="spellStart"/>
+      <w:proofErr w:type="gramStart"/>
       <w:r>
         <w:rPr>
           <w:rFonts w:ascii="Consolas" w:hAnsi="Consolas" w:cs="Courier New"/>
@@ -2962,6 +3399,7 @@
         </w:rPr>
         <w:t>IsDuplicateNationalCode</w:t>
       </w:r>
+      <w:proofErr w:type="spellEnd"/>
       <w:r>
         <w:rPr>
           <w:rFonts w:ascii="Consolas" w:hAnsi="Consolas" w:cs="Courier New"/>
@@ -2971,6 +3409,7 @@
         </w:rPr>
         <w:t>(</w:t>
       </w:r>
+      <w:proofErr w:type="gramEnd"/>
       <w:r>
         <w:rPr>
           <w:rFonts w:ascii="Consolas" w:hAnsi="Consolas" w:cs="Courier New"/>
@@ -2996,7 +3435,18 @@
           <w:sz w:val="17"/>
           <w:szCs w:val="17"/>
         </w:rPr>
-        <w:t xml:space="preserve"> dto</w:t>
+        <w:t xml:space="preserve"> </w:t>
+      </w:r>
+      <w:proofErr w:type="spellStart"/>
+      <w:proofErr w:type="gramStart"/>
+      <w:r>
+        <w:rPr>
+          <w:rFonts w:ascii="Consolas" w:hAnsi="Consolas" w:cs="Courier New"/>
+          <w:color w:val="000000"/>
+          <w:sz w:val="17"/>
+          <w:szCs w:val="17"/>
+        </w:rPr>
+        <w:t>dto</w:t>
       </w:r>
       <w:r>
         <w:rPr>
@@ -3016,6 +3466,8 @@
         </w:rPr>
         <w:t>NationalCode</w:t>
       </w:r>
+      <w:proofErr w:type="spellEnd"/>
+      <w:proofErr w:type="gramEnd"/>
       <w:r>
         <w:rPr>
           <w:rFonts w:ascii="Consolas" w:hAnsi="Consolas" w:cs="Courier New"/>
@@ -3032,8 +3484,19 @@
           <w:sz w:val="17"/>
           <w:szCs w:val="17"/>
         </w:rPr>
-        <w:t xml:space="preserve"> authorId</w:t>
-      </w:r>
+        <w:t xml:space="preserve"> </w:t>
+      </w:r>
+      <w:proofErr w:type="spellStart"/>
+      <w:r>
+        <w:rPr>
+          <w:rFonts w:ascii="Consolas" w:hAnsi="Consolas" w:cs="Courier New"/>
+          <w:color w:val="000000"/>
+          <w:sz w:val="17"/>
+          <w:szCs w:val="17"/>
+        </w:rPr>
+        <w:t>authorId</w:t>
+      </w:r>
+      <w:proofErr w:type="spellEnd"/>
       <w:r>
         <w:rPr>
           <w:rFonts w:ascii="Consolas" w:hAnsi="Consolas" w:cs="Courier New"/>
@@ -3114,6 +3577,7 @@
         </w:rPr>
         <w:t xml:space="preserve"> </w:t>
       </w:r>
+      <w:proofErr w:type="spellStart"/>
       <w:r>
         <w:rPr>
           <w:rFonts w:ascii="Consolas" w:hAnsi="Consolas" w:cs="Courier New"/>
@@ -3123,6 +3587,7 @@
         </w:rPr>
         <w:t>ServiceResult</w:t>
       </w:r>
+      <w:proofErr w:type="spellEnd"/>
       <w:r>
         <w:rPr>
           <w:rFonts w:ascii="Consolas" w:hAnsi="Consolas" w:cs="Courier New"/>
@@ -3171,7 +3636,15 @@
     </w:p>
     <w:p>
       <w:r>
-        <w:t>The excludeId = -1 default handles the "Add" case (nothing to exclude, since -1 never matches a real ID), while passing the actual ID handles the "Update" case (excluding the record being edited). One method, works for both Author and Member, both add and update scenarios.</w:t>
+        <w:t xml:space="preserve">The </w:t>
+      </w:r>
+      <w:proofErr w:type="spellStart"/>
+      <w:r>
+        <w:t>excludeId</w:t>
+      </w:r>
+      <w:proofErr w:type="spellEnd"/>
+      <w:r>
+        <w:t xml:space="preserve"> = -1 default handles the "Add" case (nothing to exclude, since -1 never matches a real ID), while passing the actual ID handles the "Update" case (excluding the record being edited). One method, works for both Author and Member, both add and update scenarios.</w:t>
       </w:r>
     </w:p>
     <w:p>
@@ -3207,7 +3680,31 @@
         <w:t>generic repository pattern</w:t>
       </w:r>
       <w:r>
-        <w:t xml:space="preserve"> (Repository&lt;T&gt; where T : Person with Add, Update, Remove, GetAll) right now. Here is why: when you move to Entity Framework in version 2, DbSet&lt;T&gt; </w:t>
+        <w:t xml:space="preserve"> (Repository&lt;T&gt; where </w:t>
+      </w:r>
+      <w:proofErr w:type="gramStart"/>
+      <w:r>
+        <w:t>T :</w:t>
+      </w:r>
+      <w:proofErr w:type="gramEnd"/>
+      <w:r>
+        <w:t xml:space="preserve"> Person with Add, Update, Remove, </w:t>
+      </w:r>
+      <w:proofErr w:type="spellStart"/>
+      <w:r>
+        <w:t>GetAll</w:t>
+      </w:r>
+      <w:proofErr w:type="spellEnd"/>
+      <w:r>
+        <w:t xml:space="preserve">) right now. Here is why: when you move to Entity Framework in version 2, </w:t>
+      </w:r>
+      <w:proofErr w:type="spellStart"/>
+      <w:r>
+        <w:t>DbSet</w:t>
+      </w:r>
+      <w:proofErr w:type="spellEnd"/>
+      <w:r>
+        <w:t xml:space="preserve">&lt;T&gt; </w:t>
       </w:r>
       <w:r>
         <w:rPr>
@@ -3236,8 +3733,69 @@
       </w:r>
     </w:p>
     <w:p>
-      <w:r>
-        <w:t>AddAuthor, UpdateAuthor, RemoveAuthor, SearchAuthors are almost line-for-line copies of AddMember, UpdateMember, RemoveMember, SearchMember.</w:t>
+      <w:proofErr w:type="spellStart"/>
+      <w:r>
+        <w:t>AddAuthor</w:t>
+      </w:r>
+      <w:proofErr w:type="spellEnd"/>
+      <w:r>
+        <w:t>, </w:t>
+      </w:r>
+      <w:proofErr w:type="spellStart"/>
+      <w:r>
+        <w:t>UpdateAuthor</w:t>
+      </w:r>
+      <w:proofErr w:type="spellEnd"/>
+      <w:r>
+        <w:t>, </w:t>
+      </w:r>
+      <w:proofErr w:type="spellStart"/>
+      <w:r>
+        <w:t>RemoveAuthor</w:t>
+      </w:r>
+      <w:proofErr w:type="spellEnd"/>
+      <w:r>
+        <w:t>, </w:t>
+      </w:r>
+      <w:proofErr w:type="spellStart"/>
+      <w:r>
+        <w:t>SearchAuthors</w:t>
+      </w:r>
+      <w:proofErr w:type="spellEnd"/>
+      <w:r>
+        <w:t> are almost line-for-line copies of </w:t>
+      </w:r>
+      <w:proofErr w:type="spellStart"/>
+      <w:r>
+        <w:t>AddMember</w:t>
+      </w:r>
+      <w:proofErr w:type="spellEnd"/>
+      <w:r>
+        <w:t>, </w:t>
+      </w:r>
+      <w:proofErr w:type="spellStart"/>
+      <w:r>
+        <w:t>UpdateMember</w:t>
+      </w:r>
+      <w:proofErr w:type="spellEnd"/>
+      <w:r>
+        <w:t>, </w:t>
+      </w:r>
+      <w:proofErr w:type="spellStart"/>
+      <w:r>
+        <w:t>RemoveMember</w:t>
+      </w:r>
+      <w:proofErr w:type="spellEnd"/>
+      <w:r>
+        <w:t>, </w:t>
+      </w:r>
+      <w:proofErr w:type="spellStart"/>
+      <w:r>
+        <w:t>SearchMember</w:t>
+      </w:r>
+      <w:proofErr w:type="spellEnd"/>
+      <w:r>
+        <w:t>.</w:t>
       </w:r>
     </w:p>
     <w:p>
@@ -3250,7 +3808,31 @@
       </w:r>
       <w:r>
         <w:br/>
-        <w:t>You can create a PersonService&lt;T&gt; where T : Person (or LibraryUser if you have that) to handle shared CRUD logic.</w:t>
+        <w:t>You can create a </w:t>
+      </w:r>
+      <w:proofErr w:type="spellStart"/>
+      <w:r>
+        <w:t>PersonService</w:t>
+      </w:r>
+      <w:proofErr w:type="spellEnd"/>
+      <w:r>
+        <w:t>&lt;T&gt; where </w:t>
+      </w:r>
+      <w:proofErr w:type="gramStart"/>
+      <w:r>
+        <w:t>T :</w:t>
+      </w:r>
+      <w:proofErr w:type="gramEnd"/>
+      <w:r>
+        <w:t xml:space="preserve"> Person (or </w:t>
+      </w:r>
+      <w:proofErr w:type="spellStart"/>
+      <w:r>
+        <w:t>LibraryUser</w:t>
+      </w:r>
+      <w:proofErr w:type="spellEnd"/>
+      <w:r>
+        <w:t> if you have that) to handle shared CRUD logic.</w:t>
       </w:r>
     </w:p>
     <w:p>
@@ -3412,6 +3994,7 @@
         </w:rPr>
         <w:t xml:space="preserve"> </w:t>
       </w:r>
+      <w:proofErr w:type="spellStart"/>
       <w:r>
         <w:rPr>
           <w:rFonts w:ascii="Consolas" w:hAnsi="Consolas" w:cs="Courier New"/>
@@ -3421,6 +4004,7 @@
         </w:rPr>
         <w:t>PersonService</w:t>
       </w:r>
+      <w:proofErr w:type="spellEnd"/>
       <w:r>
         <w:rPr>
           <w:rFonts w:ascii="Consolas" w:hAnsi="Consolas" w:cs="Courier New"/>
@@ -3473,7 +4057,17 @@
           <w:sz w:val="17"/>
           <w:szCs w:val="17"/>
         </w:rPr>
-        <w:t xml:space="preserve"> T </w:t>
+        <w:t xml:space="preserve"> </w:t>
+      </w:r>
+      <w:proofErr w:type="gramStart"/>
+      <w:r>
+        <w:rPr>
+          <w:rFonts w:ascii="Consolas" w:hAnsi="Consolas" w:cs="Courier New"/>
+          <w:color w:val="000000"/>
+          <w:sz w:val="17"/>
+          <w:szCs w:val="17"/>
+        </w:rPr>
+        <w:t xml:space="preserve">T </w:t>
       </w:r>
       <w:r>
         <w:rPr>
@@ -3484,6 +4078,7 @@
         </w:rPr>
         <w:t>:</w:t>
       </w:r>
+      <w:proofErr w:type="gramEnd"/>
       <w:r>
         <w:rPr>
           <w:rFonts w:ascii="Consolas" w:hAnsi="Consolas" w:cs="Courier New"/>
@@ -3520,6 +4115,7 @@
         </w:rPr>
         <w:t xml:space="preserve"> </w:t>
       </w:r>
+      <w:proofErr w:type="gramStart"/>
       <w:r>
         <w:rPr>
           <w:rFonts w:ascii="Consolas" w:hAnsi="Consolas" w:cs="Courier New"/>
@@ -3536,7 +4132,17 @@
           <w:sz w:val="17"/>
           <w:szCs w:val="17"/>
         </w:rPr>
-        <w:t>()</w:t>
+        <w:t>(</w:t>
+      </w:r>
+      <w:proofErr w:type="gramEnd"/>
+      <w:r>
+        <w:rPr>
+          <w:rFonts w:ascii="Consolas" w:hAnsi="Consolas" w:cs="Courier New"/>
+          <w:color w:val="666600"/>
+          <w:sz w:val="17"/>
+          <w:szCs w:val="17"/>
+        </w:rPr>
+        <w:t>)</w:t>
       </w:r>
     </w:p>
     <w:p>
@@ -3725,6 +4331,7 @@
         </w:rPr>
         <w:t xml:space="preserve"> </w:t>
       </w:r>
+      <w:proofErr w:type="gramStart"/>
       <w:r>
         <w:rPr>
           <w:rFonts w:ascii="Consolas" w:hAnsi="Consolas" w:cs="Courier New"/>
@@ -3741,7 +4348,17 @@
           <w:sz w:val="17"/>
           <w:szCs w:val="17"/>
         </w:rPr>
-        <w:t>();</w:t>
+        <w:t>(</w:t>
+      </w:r>
+      <w:proofErr w:type="gramEnd"/>
+      <w:r>
+        <w:rPr>
+          <w:rFonts w:ascii="Consolas" w:hAnsi="Consolas" w:cs="Courier New"/>
+          <w:color w:val="666600"/>
+          <w:sz w:val="17"/>
+          <w:szCs w:val="17"/>
+        </w:rPr>
+        <w:t>);</w:t>
       </w:r>
     </w:p>
     <w:p>
@@ -3885,6 +4502,7 @@
         </w:rPr>
         <w:t xml:space="preserve"> </w:t>
       </w:r>
+      <w:proofErr w:type="spellStart"/>
       <w:r>
         <w:rPr>
           <w:rFonts w:ascii="Consolas" w:hAnsi="Consolas" w:cs="Courier New"/>
@@ -3894,6 +4512,7 @@
         </w:rPr>
         <w:t>ServiceResult</w:t>
       </w:r>
+      <w:proofErr w:type="spellEnd"/>
       <w:r>
         <w:rPr>
           <w:rFonts w:ascii="Consolas" w:hAnsi="Consolas" w:cs="Courier New"/>
@@ -3930,6 +4549,7 @@
         </w:rPr>
         <w:t xml:space="preserve"> </w:t>
       </w:r>
+      <w:proofErr w:type="gramStart"/>
       <w:r>
         <w:rPr>
           <w:rFonts w:ascii="Consolas" w:hAnsi="Consolas" w:cs="Courier New"/>
@@ -3948,15 +4568,27 @@
         </w:rPr>
         <w:t>(</w:t>
       </w:r>
-      <w:r>
-        <w:rPr>
-          <w:rFonts w:ascii="Consolas" w:hAnsi="Consolas" w:cs="Courier New"/>
-          <w:color w:val="000000"/>
-          <w:sz w:val="17"/>
-          <w:szCs w:val="17"/>
-        </w:rPr>
-        <w:t>T dto</w:t>
-      </w:r>
+      <w:proofErr w:type="gramEnd"/>
+      <w:r>
+        <w:rPr>
+          <w:rFonts w:ascii="Consolas" w:hAnsi="Consolas" w:cs="Courier New"/>
+          <w:color w:val="000000"/>
+          <w:sz w:val="17"/>
+          <w:szCs w:val="17"/>
+        </w:rPr>
+        <w:t xml:space="preserve">T </w:t>
+      </w:r>
+      <w:proofErr w:type="spellStart"/>
+      <w:r>
+        <w:rPr>
+          <w:rFonts w:ascii="Consolas" w:hAnsi="Consolas" w:cs="Courier New"/>
+          <w:color w:val="000000"/>
+          <w:sz w:val="17"/>
+          <w:szCs w:val="17"/>
+        </w:rPr>
+        <w:t>dto</w:t>
+      </w:r>
+      <w:proofErr w:type="spellEnd"/>
       <w:r>
         <w:rPr>
           <w:rFonts w:ascii="Consolas" w:hAnsi="Consolas" w:cs="Courier New"/>
@@ -4045,8 +4677,19 @@
           <w:sz w:val="17"/>
           <w:szCs w:val="17"/>
         </w:rPr>
-        <w:t xml:space="preserve"> isDuplicateNationalCode</w:t>
-      </w:r>
+        <w:t xml:space="preserve"> </w:t>
+      </w:r>
+      <w:proofErr w:type="spellStart"/>
+      <w:r>
+        <w:rPr>
+          <w:rFonts w:ascii="Consolas" w:hAnsi="Consolas" w:cs="Courier New"/>
+          <w:color w:val="000000"/>
+          <w:sz w:val="17"/>
+          <w:szCs w:val="17"/>
+        </w:rPr>
+        <w:t>isDuplicateNationalCode</w:t>
+      </w:r>
+      <w:proofErr w:type="spellEnd"/>
       <w:r>
         <w:rPr>
           <w:rFonts w:ascii="Consolas" w:hAnsi="Consolas" w:cs="Courier New"/>
@@ -4065,6 +4708,7 @@
         </w:rPr>
         <w:t xml:space="preserve"> </w:t>
       </w:r>
+      <w:proofErr w:type="gramStart"/>
       <w:r>
         <w:rPr>
           <w:rFonts w:ascii="Consolas" w:hAnsi="Consolas" w:cs="Courier New"/>
@@ -4092,15 +4736,17 @@
         </w:rPr>
         <w:t>)</w:t>
       </w:r>
-      <w:r>
-        <w:rPr>
-          <w:rFonts w:ascii="Consolas" w:hAnsi="Consolas" w:cs="Courier New"/>
-          <w:color w:val="000000"/>
-          <w:sz w:val="17"/>
-          <w:szCs w:val="17"/>
-        </w:rPr>
-        <w:t xml:space="preserve"> </w:t>
-      </w:r>
+      <w:proofErr w:type="gramEnd"/>
+      <w:r>
+        <w:rPr>
+          <w:rFonts w:ascii="Consolas" w:hAnsi="Consolas" w:cs="Courier New"/>
+          <w:color w:val="000000"/>
+          <w:sz w:val="17"/>
+          <w:szCs w:val="17"/>
+        </w:rPr>
+        <w:t xml:space="preserve"> </w:t>
+      </w:r>
+      <w:proofErr w:type="gramStart"/>
       <w:r>
         <w:rPr>
           <w:rFonts w:ascii="Consolas" w:hAnsi="Consolas" w:cs="Courier New"/>
@@ -4128,6 +4774,7 @@
         </w:rPr>
         <w:t>...</w:t>
       </w:r>
+      <w:proofErr w:type="gramEnd"/>
       <w:r>
         <w:rPr>
           <w:rFonts w:ascii="Consolas" w:hAnsi="Consolas" w:cs="Courier New"/>
@@ -4235,6 +4882,7 @@
         </w:rPr>
         <w:t xml:space="preserve"> </w:t>
       </w:r>
+      <w:proofErr w:type="spellStart"/>
       <w:r>
         <w:rPr>
           <w:rFonts w:ascii="Consolas" w:hAnsi="Consolas" w:cs="Courier New"/>
@@ -4244,6 +4892,7 @@
         </w:rPr>
         <w:t>ServiceResult</w:t>
       </w:r>
+      <w:proofErr w:type="spellEnd"/>
       <w:r>
         <w:rPr>
           <w:rFonts w:ascii="Consolas" w:hAnsi="Consolas" w:cs="Courier New"/>
@@ -4280,6 +4929,7 @@
         </w:rPr>
         <w:t xml:space="preserve"> </w:t>
       </w:r>
+      <w:proofErr w:type="gramStart"/>
       <w:r>
         <w:rPr>
           <w:rFonts w:ascii="Consolas" w:hAnsi="Consolas" w:cs="Courier New"/>
@@ -4298,6 +4948,7 @@
         </w:rPr>
         <w:t>(</w:t>
       </w:r>
+      <w:proofErr w:type="gramEnd"/>
       <w:r>
         <w:rPr>
           <w:rFonts w:ascii="Consolas" w:hAnsi="Consolas" w:cs="Courier New"/>
@@ -4352,6 +5003,7 @@
         </w:rPr>
         <w:t xml:space="preserve"> </w:t>
       </w:r>
+      <w:proofErr w:type="gramStart"/>
       <w:r>
         <w:rPr>
           <w:rFonts w:ascii="Consolas" w:hAnsi="Consolas" w:cs="Courier New"/>
@@ -4379,6 +5031,7 @@
         </w:rPr>
         <w:t>...</w:t>
       </w:r>
+      <w:proofErr w:type="gramEnd"/>
       <w:r>
         <w:rPr>
           <w:rFonts w:ascii="Consolas" w:hAnsi="Consolas" w:cs="Courier New"/>
@@ -4486,6 +5139,7 @@
         </w:rPr>
         <w:t xml:space="preserve"> </w:t>
       </w:r>
+      <w:proofErr w:type="spellStart"/>
       <w:r>
         <w:rPr>
           <w:rFonts w:ascii="Consolas" w:hAnsi="Consolas" w:cs="Courier New"/>
@@ -4495,6 +5149,7 @@
         </w:rPr>
         <w:t>IReadOnlyList</w:t>
       </w:r>
+      <w:proofErr w:type="spellEnd"/>
       <w:r>
         <w:rPr>
           <w:rFonts w:ascii="Consolas" w:hAnsi="Consolas" w:cs="Courier New"/>
@@ -4531,6 +5186,7 @@
         </w:rPr>
         <w:t xml:space="preserve"> </w:t>
       </w:r>
+      <w:proofErr w:type="gramStart"/>
       <w:r>
         <w:rPr>
           <w:rFonts w:ascii="Consolas" w:hAnsi="Consolas" w:cs="Courier New"/>
@@ -4549,6 +5205,7 @@
         </w:rPr>
         <w:t>(</w:t>
       </w:r>
+      <w:proofErr w:type="gramEnd"/>
       <w:r>
         <w:rPr>
           <w:rFonts w:ascii="Consolas" w:hAnsi="Consolas" w:cs="Courier New"/>
@@ -4675,6 +5332,7 @@
         </w:rPr>
         <w:t xml:space="preserve"> </w:t>
       </w:r>
+      <w:proofErr w:type="gramStart"/>
       <w:r>
         <w:rPr>
           <w:rFonts w:ascii="Consolas" w:hAnsi="Consolas" w:cs="Courier New"/>
@@ -4702,6 +5360,7 @@
         </w:rPr>
         <w:t>...</w:t>
       </w:r>
+      <w:proofErr w:type="gramEnd"/>
       <w:r>
         <w:rPr>
           <w:rFonts w:ascii="Consolas" w:hAnsi="Consolas" w:cs="Courier New"/>
@@ -4762,7 +5421,16 @@
           <w:sz w:val="17"/>
           <w:szCs w:val="17"/>
         </w:rPr>
-        <w:t xml:space="preserve"> 9. </w:t>
+        <w:t xml:space="preserve"> </w:t>
+      </w:r>
+      <w:proofErr w:type="gramStart"/>
+      <w:r>
+        <w:rPr>
+          <w:rFonts w:ascii="Consolas" w:hAnsi="Consolas" w:cs="Courier New"/>
+          <w:sz w:val="17"/>
+          <w:szCs w:val="17"/>
+        </w:rPr>
+        <w:t xml:space="preserve">9. </w:t>
       </w:r>
       <w:r>
         <w:rPr>
@@ -4773,6 +5441,7 @@
         </w:rPr>
         <w:t>}</w:t>
       </w:r>
+      <w:proofErr w:type="gramEnd"/>
     </w:p>
     <w:p>
       <w:r>
@@ -4946,6 +5615,7 @@
         </w:rPr>
         <w:t xml:space="preserve"> </w:t>
       </w:r>
+      <w:proofErr w:type="spellStart"/>
       <w:r>
         <w:rPr>
           <w:rFonts w:ascii="Consolas" w:hAnsi="Consolas" w:cs="Courier New"/>
@@ -4955,6 +5625,7 @@
         </w:rPr>
         <w:t>PersonHelper</w:t>
       </w:r>
+      <w:proofErr w:type="spellEnd"/>
     </w:p>
     <w:p>
       <w:pPr>
@@ -5115,6 +5786,7 @@
         </w:rPr>
         <w:t xml:space="preserve"> </w:t>
       </w:r>
+      <w:proofErr w:type="spellStart"/>
       <w:r>
         <w:rPr>
           <w:rFonts w:ascii="Consolas" w:hAnsi="Consolas" w:cs="Courier New"/>
@@ -5124,6 +5796,7 @@
         </w:rPr>
         <w:t>IsDuplicateName</w:t>
       </w:r>
+      <w:proofErr w:type="spellEnd"/>
       <w:r>
         <w:rPr>
           <w:rFonts w:ascii="Consolas" w:hAnsi="Consolas" w:cs="Courier New"/>
@@ -5151,6 +5824,7 @@
         </w:rPr>
         <w:t>&gt;(</w:t>
       </w:r>
+      <w:proofErr w:type="spellStart"/>
       <w:r>
         <w:rPr>
           <w:rFonts w:ascii="Consolas" w:hAnsi="Consolas" w:cs="Courier New"/>
@@ -5160,6 +5834,7 @@
         </w:rPr>
         <w:t>IEnumerable</w:t>
       </w:r>
+      <w:proofErr w:type="spellEnd"/>
       <w:r>
         <w:rPr>
           <w:rFonts w:ascii="Consolas" w:hAnsi="Consolas" w:cs="Courier New"/>
@@ -5257,7 +5932,27 @@
           <w:sz w:val="17"/>
           <w:szCs w:val="17"/>
         </w:rPr>
-        <w:t xml:space="preserve"> excludeId </w:t>
+        <w:t xml:space="preserve"> </w:t>
+      </w:r>
+      <w:proofErr w:type="spellStart"/>
+      <w:r>
+        <w:rPr>
+          <w:rFonts w:ascii="Consolas" w:hAnsi="Consolas" w:cs="Courier New"/>
+          <w:color w:val="000000"/>
+          <w:sz w:val="17"/>
+          <w:szCs w:val="17"/>
+        </w:rPr>
+        <w:t>excludeId</w:t>
+      </w:r>
+      <w:proofErr w:type="spellEnd"/>
+      <w:r>
+        <w:rPr>
+          <w:rFonts w:ascii="Consolas" w:hAnsi="Consolas" w:cs="Courier New"/>
+          <w:color w:val="000000"/>
+          <w:sz w:val="17"/>
+          <w:szCs w:val="17"/>
+        </w:rPr>
+        <w:t xml:space="preserve"> </w:t>
       </w:r>
       <w:r>
         <w:rPr>
@@ -5364,7 +6059,17 @@
           <w:sz w:val="17"/>
           <w:szCs w:val="17"/>
         </w:rPr>
-        <w:t xml:space="preserve"> T </w:t>
+        <w:t xml:space="preserve"> </w:t>
+      </w:r>
+      <w:proofErr w:type="gramStart"/>
+      <w:r>
+        <w:rPr>
+          <w:rFonts w:ascii="Consolas" w:hAnsi="Consolas" w:cs="Courier New"/>
+          <w:color w:val="000000"/>
+          <w:sz w:val="17"/>
+          <w:szCs w:val="17"/>
+        </w:rPr>
+        <w:t xml:space="preserve">T </w:t>
       </w:r>
       <w:r>
         <w:rPr>
@@ -5375,6 +6080,7 @@
         </w:rPr>
         <w:t>:</w:t>
       </w:r>
+      <w:proofErr w:type="gramEnd"/>
       <w:r>
         <w:rPr>
           <w:rFonts w:ascii="Consolas" w:hAnsi="Consolas" w:cs="Courier New"/>
@@ -5444,7 +6150,17 @@
           <w:sz w:val="17"/>
           <w:szCs w:val="17"/>
         </w:rPr>
-        <w:t xml:space="preserve">    </w:t>
+        <w:t xml:space="preserve"> </w:t>
+      </w:r>
+      <w:proofErr w:type="gramStart"/>
+      <w:r>
+        <w:rPr>
+          <w:rFonts w:ascii="Consolas" w:hAnsi="Consolas" w:cs="Courier New"/>
+          <w:color w:val="000000"/>
+          <w:sz w:val="17"/>
+          <w:szCs w:val="17"/>
+        </w:rPr>
+        <w:t xml:space="preserve">   </w:t>
       </w:r>
       <w:r>
         <w:rPr>
@@ -5455,6 +6171,7 @@
         </w:rPr>
         <w:t>{</w:t>
       </w:r>
+      <w:proofErr w:type="gramEnd"/>
     </w:p>
     <w:p>
       <w:pPr>
@@ -5524,7 +6241,18 @@
           <w:sz w:val="17"/>
           <w:szCs w:val="17"/>
         </w:rPr>
-        <w:t xml:space="preserve"> people</w:t>
+        <w:t xml:space="preserve"> </w:t>
+      </w:r>
+      <w:proofErr w:type="spellStart"/>
+      <w:proofErr w:type="gramStart"/>
+      <w:r>
+        <w:rPr>
+          <w:rFonts w:ascii="Consolas" w:hAnsi="Consolas" w:cs="Courier New"/>
+          <w:color w:val="000000"/>
+          <w:sz w:val="17"/>
+          <w:szCs w:val="17"/>
+        </w:rPr>
+        <w:t>people</w:t>
       </w:r>
       <w:r>
         <w:rPr>
@@ -5544,6 +6272,8 @@
         </w:rPr>
         <w:t>Any</w:t>
       </w:r>
+      <w:proofErr w:type="spellEnd"/>
+      <w:proofErr w:type="gramEnd"/>
       <w:r>
         <w:rPr>
           <w:rFonts w:ascii="Consolas" w:hAnsi="Consolas" w:cs="Courier New"/>
@@ -5578,7 +6308,18 @@
           <w:sz w:val="17"/>
           <w:szCs w:val="17"/>
         </w:rPr>
-        <w:t xml:space="preserve"> p</w:t>
+        <w:t xml:space="preserve"> </w:t>
+      </w:r>
+      <w:proofErr w:type="spellStart"/>
+      <w:proofErr w:type="gramStart"/>
+      <w:r>
+        <w:rPr>
+          <w:rFonts w:ascii="Consolas" w:hAnsi="Consolas" w:cs="Courier New"/>
+          <w:color w:val="000000"/>
+          <w:sz w:val="17"/>
+          <w:szCs w:val="17"/>
+        </w:rPr>
+        <w:t>p</w:t>
       </w:r>
       <w:r>
         <w:rPr>
@@ -5598,6 +6339,7 @@
         </w:rPr>
         <w:t>Id</w:t>
       </w:r>
+      <w:proofErr w:type="spellEnd"/>
       <w:r>
         <w:rPr>
           <w:rFonts w:ascii="Consolas" w:hAnsi="Consolas" w:cs="Courier New"/>
@@ -5616,14 +6358,35 @@
         </w:rPr>
         <w:t>!=</w:t>
       </w:r>
-      <w:r>
-        <w:rPr>
-          <w:rFonts w:ascii="Consolas" w:hAnsi="Consolas" w:cs="Courier New"/>
-          <w:color w:val="000000"/>
-          <w:sz w:val="17"/>
-          <w:szCs w:val="17"/>
-        </w:rPr>
-        <w:t xml:space="preserve"> excludeId </w:t>
+      <w:proofErr w:type="gramEnd"/>
+      <w:r>
+        <w:rPr>
+          <w:rFonts w:ascii="Consolas" w:hAnsi="Consolas" w:cs="Courier New"/>
+          <w:color w:val="000000"/>
+          <w:sz w:val="17"/>
+          <w:szCs w:val="17"/>
+        </w:rPr>
+        <w:t xml:space="preserve"> </w:t>
+      </w:r>
+      <w:proofErr w:type="spellStart"/>
+      <w:r>
+        <w:rPr>
+          <w:rFonts w:ascii="Consolas" w:hAnsi="Consolas" w:cs="Courier New"/>
+          <w:color w:val="000000"/>
+          <w:sz w:val="17"/>
+          <w:szCs w:val="17"/>
+        </w:rPr>
+        <w:t>excludeId</w:t>
+      </w:r>
+      <w:proofErr w:type="spellEnd"/>
+      <w:r>
+        <w:rPr>
+          <w:rFonts w:ascii="Consolas" w:hAnsi="Consolas" w:cs="Courier New"/>
+          <w:color w:val="000000"/>
+          <w:sz w:val="17"/>
+          <w:szCs w:val="17"/>
+        </w:rPr>
+        <w:t xml:space="preserve"> </w:t>
       </w:r>
       <w:r>
         <w:rPr>
@@ -5694,7 +6457,18 @@
           <w:sz w:val="17"/>
           <w:szCs w:val="17"/>
         </w:rPr>
-        <w:t xml:space="preserve">                               p</w:t>
+        <w:t xml:space="preserve">                               </w:t>
+      </w:r>
+      <w:proofErr w:type="spellStart"/>
+      <w:proofErr w:type="gramStart"/>
+      <w:r>
+        <w:rPr>
+          <w:rFonts w:ascii="Consolas" w:hAnsi="Consolas" w:cs="Courier New"/>
+          <w:color w:val="000000"/>
+          <w:sz w:val="17"/>
+          <w:szCs w:val="17"/>
+        </w:rPr>
+        <w:t>p</w:t>
       </w:r>
       <w:r>
         <w:rPr>
@@ -5714,6 +6488,8 @@
         </w:rPr>
         <w:t>FirstName</w:t>
       </w:r>
+      <w:proofErr w:type="spellEnd"/>
+      <w:proofErr w:type="gramEnd"/>
       <w:r>
         <w:rPr>
           <w:rFonts w:ascii="Consolas" w:hAnsi="Consolas" w:cs="Courier New"/>
@@ -5739,7 +6515,18 @@
           <w:sz w:val="17"/>
           <w:szCs w:val="17"/>
         </w:rPr>
-        <w:t xml:space="preserve"> person</w:t>
+        <w:t xml:space="preserve"> </w:t>
+      </w:r>
+      <w:proofErr w:type="spellStart"/>
+      <w:proofErr w:type="gramStart"/>
+      <w:r>
+        <w:rPr>
+          <w:rFonts w:ascii="Consolas" w:hAnsi="Consolas" w:cs="Courier New"/>
+          <w:color w:val="000000"/>
+          <w:sz w:val="17"/>
+          <w:szCs w:val="17"/>
+        </w:rPr>
+        <w:t>person</w:t>
       </w:r>
       <w:r>
         <w:rPr>
@@ -5759,6 +6546,8 @@
         </w:rPr>
         <w:t>FirstName</w:t>
       </w:r>
+      <w:proofErr w:type="spellEnd"/>
+      <w:proofErr w:type="gramEnd"/>
       <w:r>
         <w:rPr>
           <w:rFonts w:ascii="Consolas" w:hAnsi="Consolas" w:cs="Courier New"/>
@@ -5837,7 +6626,18 @@
           <w:sz w:val="17"/>
           <w:szCs w:val="17"/>
         </w:rPr>
-        <w:t xml:space="preserve">                               p</w:t>
+        <w:t xml:space="preserve">                               </w:t>
+      </w:r>
+      <w:proofErr w:type="spellStart"/>
+      <w:proofErr w:type="gramStart"/>
+      <w:r>
+        <w:rPr>
+          <w:rFonts w:ascii="Consolas" w:hAnsi="Consolas" w:cs="Courier New"/>
+          <w:color w:val="000000"/>
+          <w:sz w:val="17"/>
+          <w:szCs w:val="17"/>
+        </w:rPr>
+        <w:t>p</w:t>
       </w:r>
       <w:r>
         <w:rPr>
@@ -5857,6 +6657,8 @@
         </w:rPr>
         <w:t>LastName</w:t>
       </w:r>
+      <w:proofErr w:type="spellEnd"/>
+      <w:proofErr w:type="gramEnd"/>
       <w:r>
         <w:rPr>
           <w:rFonts w:ascii="Consolas" w:hAnsi="Consolas" w:cs="Courier New"/>
@@ -5882,7 +6684,18 @@
           <w:sz w:val="17"/>
           <w:szCs w:val="17"/>
         </w:rPr>
-        <w:t xml:space="preserve"> person</w:t>
+        <w:t xml:space="preserve"> </w:t>
+      </w:r>
+      <w:proofErr w:type="spellStart"/>
+      <w:proofErr w:type="gramStart"/>
+      <w:r>
+        <w:rPr>
+          <w:rFonts w:ascii="Consolas" w:hAnsi="Consolas" w:cs="Courier New"/>
+          <w:color w:val="000000"/>
+          <w:sz w:val="17"/>
+          <w:szCs w:val="17"/>
+        </w:rPr>
+        <w:t>person</w:t>
       </w:r>
       <w:r>
         <w:rPr>
@@ -5902,6 +6715,8 @@
         </w:rPr>
         <w:t>LastName</w:t>
       </w:r>
+      <w:proofErr w:type="spellEnd"/>
+      <w:proofErr w:type="gramEnd"/>
       <w:r>
         <w:rPr>
           <w:rFonts w:ascii="Consolas" w:hAnsi="Consolas" w:cs="Courier New"/>
@@ -5962,7 +6777,17 @@
           <w:sz w:val="17"/>
           <w:szCs w:val="17"/>
         </w:rPr>
-        <w:t xml:space="preserve">    </w:t>
+        <w:t xml:space="preserve">  </w:t>
+      </w:r>
+      <w:proofErr w:type="gramStart"/>
+      <w:r>
+        <w:rPr>
+          <w:rFonts w:ascii="Consolas" w:hAnsi="Consolas" w:cs="Courier New"/>
+          <w:color w:val="000000"/>
+          <w:sz w:val="17"/>
+          <w:szCs w:val="17"/>
+        </w:rPr>
+        <w:t xml:space="preserve">  </w:t>
       </w:r>
       <w:r>
         <w:rPr>
@@ -5973,6 +6798,7 @@
         </w:rPr>
         <w:t>}</w:t>
       </w:r>
+      <w:proofErr w:type="gramEnd"/>
     </w:p>
     <w:p>
       <w:pPr>
@@ -6009,6 +6835,7 @@
           <w:szCs w:val="17"/>
         </w:rPr>
       </w:pPr>
+      <w:proofErr w:type="gramStart"/>
       <w:r>
         <w:rPr>
           <w:rFonts w:ascii="Consolas" w:hAnsi="Consolas" w:cs="Courier New"/>
@@ -6026,6 +6853,7 @@
         </w:rPr>
         <w:t>}</w:t>
       </w:r>
+      <w:proofErr w:type="gramEnd"/>
     </w:p>
     <w:p>
       <w:pPr>
@@ -6034,7 +6862,23 @@
         </w:pBdr>
       </w:pPr>
       <w:r>
-        <w:t>Then, your AddAuthor and AddMember call this shared utility, eliminating the duplicated Any(...) conditions.</w:t>
+        <w:t>Then, your </w:t>
+      </w:r>
+      <w:proofErr w:type="spellStart"/>
+      <w:r>
+        <w:t>AddAuthor</w:t>
+      </w:r>
+      <w:proofErr w:type="spellEnd"/>
+      <w:r>
+        <w:t> and </w:t>
+      </w:r>
+      <w:proofErr w:type="spellStart"/>
+      <w:r>
+        <w:t>AddMember</w:t>
+      </w:r>
+      <w:proofErr w:type="spellEnd"/>
+      <w:r>
+        <w:t> call this shared utility, eliminating the duplicated Any(...) conditions.</w:t>
       </w:r>
     </w:p>
     <w:p>
@@ -6054,7 +6898,15 @@
     </w:p>
     <w:p>
       <w:r>
-        <w:t>Look at your two search methods in UserManagementService.cs:</w:t>
+        <w:t xml:space="preserve">Look at your two search methods in </w:t>
+      </w:r>
+      <w:proofErr w:type="spellStart"/>
+      <w:r>
+        <w:t>UserManagementService.cs</w:t>
+      </w:r>
+      <w:proofErr w:type="spellEnd"/>
+      <w:r>
+        <w:t>:</w:t>
       </w:r>
     </w:p>
     <w:p>
@@ -6172,6 +7024,7 @@
         </w:rPr>
         <w:t xml:space="preserve"> </w:t>
       </w:r>
+      <w:proofErr w:type="spellStart"/>
       <w:r>
         <w:rPr>
           <w:rFonts w:ascii="Consolas" w:hAnsi="Consolas" w:cs="Courier New"/>
@@ -6181,6 +7034,7 @@
         </w:rPr>
         <w:t>IReadOnlyList</w:t>
       </w:r>
+      <w:proofErr w:type="spellEnd"/>
       <w:r>
         <w:rPr>
           <w:rFonts w:ascii="Consolas" w:hAnsi="Consolas" w:cs="Courier New"/>
@@ -6217,6 +7071,8 @@
         </w:rPr>
         <w:t xml:space="preserve"> </w:t>
       </w:r>
+      <w:proofErr w:type="spellStart"/>
+      <w:proofErr w:type="gramStart"/>
       <w:r>
         <w:rPr>
           <w:rFonts w:ascii="Consolas" w:hAnsi="Consolas" w:cs="Courier New"/>
@@ -6226,6 +7082,7 @@
         </w:rPr>
         <w:t>SearchAuthors</w:t>
       </w:r>
+      <w:proofErr w:type="spellEnd"/>
       <w:r>
         <w:rPr>
           <w:rFonts w:ascii="Consolas" w:hAnsi="Consolas" w:cs="Courier New"/>
@@ -6235,6 +7092,7 @@
         </w:rPr>
         <w:t>(</w:t>
       </w:r>
+      <w:proofErr w:type="gramEnd"/>
       <w:r>
         <w:rPr>
           <w:rFonts w:ascii="Consolas" w:hAnsi="Consolas" w:cs="Courier New"/>
@@ -6251,8 +7109,19 @@
           <w:sz w:val="17"/>
           <w:szCs w:val="17"/>
         </w:rPr>
-        <w:t xml:space="preserve"> searchItem</w:t>
-      </w:r>
+        <w:t xml:space="preserve"> </w:t>
+      </w:r>
+      <w:proofErr w:type="spellStart"/>
+      <w:r>
+        <w:rPr>
+          <w:rFonts w:ascii="Consolas" w:hAnsi="Consolas" w:cs="Courier New"/>
+          <w:color w:val="000000"/>
+          <w:sz w:val="17"/>
+          <w:szCs w:val="17"/>
+        </w:rPr>
+        <w:t>searchItem</w:t>
+      </w:r>
+      <w:proofErr w:type="spellEnd"/>
       <w:r>
         <w:rPr>
           <w:rFonts w:ascii="Consolas" w:hAnsi="Consolas" w:cs="Courier New"/>
@@ -6361,6 +7230,7 @@
         </w:rPr>
         <w:t xml:space="preserve"> </w:t>
       </w:r>
+      <w:proofErr w:type="gramStart"/>
       <w:r>
         <w:rPr>
           <w:rFonts w:ascii="Consolas" w:hAnsi="Consolas" w:cs="Courier New"/>
@@ -6388,6 +7258,7 @@
         </w:rPr>
         <w:t>...</w:t>
       </w:r>
+      <w:proofErr w:type="gramEnd"/>
       <w:r>
         <w:rPr>
           <w:rFonts w:ascii="Consolas" w:hAnsi="Consolas" w:cs="Courier New"/>
@@ -6574,6 +7445,7 @@
         </w:rPr>
         <w:t xml:space="preserve"> </w:t>
       </w:r>
+      <w:proofErr w:type="spellStart"/>
       <w:r>
         <w:rPr>
           <w:rFonts w:ascii="Consolas" w:hAnsi="Consolas" w:cs="Courier New"/>
@@ -6583,6 +7455,7 @@
         </w:rPr>
         <w:t>IReadOnlyList</w:t>
       </w:r>
+      <w:proofErr w:type="spellEnd"/>
       <w:r>
         <w:rPr>
           <w:rFonts w:ascii="Consolas" w:hAnsi="Consolas" w:cs="Courier New"/>
@@ -6619,6 +7492,8 @@
         </w:rPr>
         <w:t xml:space="preserve"> </w:t>
       </w:r>
+      <w:proofErr w:type="spellStart"/>
+      <w:proofErr w:type="gramStart"/>
       <w:r>
         <w:rPr>
           <w:rFonts w:ascii="Consolas" w:hAnsi="Consolas" w:cs="Courier New"/>
@@ -6628,6 +7503,7 @@
         </w:rPr>
         <w:t>SearchMember</w:t>
       </w:r>
+      <w:proofErr w:type="spellEnd"/>
       <w:r>
         <w:rPr>
           <w:rFonts w:ascii="Consolas" w:hAnsi="Consolas" w:cs="Courier New"/>
@@ -6637,6 +7513,7 @@
         </w:rPr>
         <w:t>(</w:t>
       </w:r>
+      <w:proofErr w:type="gramEnd"/>
       <w:r>
         <w:rPr>
           <w:rFonts w:ascii="Consolas" w:hAnsi="Consolas" w:cs="Courier New"/>
@@ -6653,8 +7530,19 @@
           <w:sz w:val="17"/>
           <w:szCs w:val="17"/>
         </w:rPr>
-        <w:t xml:space="preserve"> searchItem</w:t>
-      </w:r>
+        <w:t xml:space="preserve"> </w:t>
+      </w:r>
+      <w:proofErr w:type="spellStart"/>
+      <w:r>
+        <w:rPr>
+          <w:rFonts w:ascii="Consolas" w:hAnsi="Consolas" w:cs="Courier New"/>
+          <w:color w:val="000000"/>
+          <w:sz w:val="17"/>
+          <w:szCs w:val="17"/>
+        </w:rPr>
+        <w:t>searchItem</w:t>
+      </w:r>
+      <w:proofErr w:type="spellEnd"/>
       <w:r>
         <w:rPr>
           <w:rFonts w:ascii="Consolas" w:hAnsi="Consolas" w:cs="Courier New"/>
@@ -6763,6 +7651,7 @@
         </w:rPr>
         <w:t xml:space="preserve"> </w:t>
       </w:r>
+      <w:proofErr w:type="gramStart"/>
       <w:r>
         <w:rPr>
           <w:rFonts w:ascii="Consolas" w:hAnsi="Consolas" w:cs="Courier New"/>
@@ -6790,6 +7679,7 @@
         </w:rPr>
         <w:t>...</w:t>
       </w:r>
+      <w:proofErr w:type="gramEnd"/>
       <w:r>
         <w:rPr>
           <w:rFonts w:ascii="Consolas" w:hAnsi="Consolas" w:cs="Courier New"/>
@@ -6893,6 +7783,7 @@
         </w:rPr>
         <w:t xml:space="preserve"> </w:t>
       </w:r>
+      <w:proofErr w:type="spellStart"/>
       <w:r>
         <w:rPr>
           <w:rFonts w:ascii="Consolas" w:hAnsi="Consolas" w:cs="Courier New"/>
@@ -6902,6 +7793,7 @@
         </w:rPr>
         <w:t>IReadOnlyList</w:t>
       </w:r>
+      <w:proofErr w:type="spellEnd"/>
       <w:r>
         <w:rPr>
           <w:rFonts w:ascii="Consolas" w:hAnsi="Consolas" w:cs="Courier New"/>
@@ -6974,6 +7866,7 @@
         </w:rPr>
         <w:t>&gt;(</w:t>
       </w:r>
+      <w:proofErr w:type="spellStart"/>
       <w:r>
         <w:rPr>
           <w:rFonts w:ascii="Consolas" w:hAnsi="Consolas" w:cs="Courier New"/>
@@ -6983,6 +7876,7 @@
         </w:rPr>
         <w:t>IEnumerable</w:t>
       </w:r>
+      <w:proofErr w:type="spellEnd"/>
       <w:r>
         <w:rPr>
           <w:rFonts w:ascii="Consolas" w:hAnsi="Consolas" w:cs="Courier New"/>
@@ -7053,8 +7947,19 @@
           <w:sz w:val="17"/>
           <w:szCs w:val="17"/>
         </w:rPr>
-        <w:t xml:space="preserve"> searchItem</w:t>
-      </w:r>
+        <w:t xml:space="preserve"> </w:t>
+      </w:r>
+      <w:proofErr w:type="spellStart"/>
+      <w:r>
+        <w:rPr>
+          <w:rFonts w:ascii="Consolas" w:hAnsi="Consolas" w:cs="Courier New"/>
+          <w:color w:val="000000"/>
+          <w:sz w:val="17"/>
+          <w:szCs w:val="17"/>
+        </w:rPr>
+        <w:t>searchItem</w:t>
+      </w:r>
+      <w:proofErr w:type="spellEnd"/>
       <w:r>
         <w:rPr>
           <w:rFonts w:ascii="Consolas" w:hAnsi="Consolas" w:cs="Courier New"/>
@@ -7287,6 +8192,8 @@
         </w:rPr>
         <w:t>(</w:t>
       </w:r>
+      <w:proofErr w:type="spellStart"/>
+      <w:proofErr w:type="gramStart"/>
       <w:r>
         <w:rPr>
           <w:rFonts w:ascii="Consolas" w:hAnsi="Consolas" w:cs="Courier New"/>
@@ -7314,6 +8221,8 @@
         </w:rPr>
         <w:t>IsNullOrWhiteSpace</w:t>
       </w:r>
+      <w:proofErr w:type="spellEnd"/>
+      <w:proofErr w:type="gramEnd"/>
       <w:r>
         <w:rPr>
           <w:rFonts w:ascii="Consolas" w:hAnsi="Consolas" w:cs="Courier New"/>
@@ -7323,6 +8232,7 @@
         </w:rPr>
         <w:t>(</w:t>
       </w:r>
+      <w:proofErr w:type="spellStart"/>
       <w:r>
         <w:rPr>
           <w:rFonts w:ascii="Consolas" w:hAnsi="Consolas" w:cs="Courier New"/>
@@ -7332,6 +8242,7 @@
         </w:rPr>
         <w:t>searchItem</w:t>
       </w:r>
+      <w:proofErr w:type="spellEnd"/>
       <w:r>
         <w:rPr>
           <w:rFonts w:ascii="Consolas" w:hAnsi="Consolas" w:cs="Courier New"/>
@@ -7457,14 +8368,25 @@
         </w:rPr>
         <w:t>T</w:t>
       </w:r>
-      <w:r>
-        <w:rPr>
-          <w:rFonts w:ascii="Consolas" w:hAnsi="Consolas" w:cs="Courier New"/>
-          <w:color w:val="666600"/>
-          <w:sz w:val="17"/>
-          <w:szCs w:val="17"/>
-        </w:rPr>
-        <w:t>&gt;();</w:t>
+      <w:proofErr w:type="gramStart"/>
+      <w:r>
+        <w:rPr>
+          <w:rFonts w:ascii="Consolas" w:hAnsi="Consolas" w:cs="Courier New"/>
+          <w:color w:val="666600"/>
+          <w:sz w:val="17"/>
+          <w:szCs w:val="17"/>
+        </w:rPr>
+        <w:t>&gt;(</w:t>
+      </w:r>
+      <w:proofErr w:type="gramEnd"/>
+      <w:r>
+        <w:rPr>
+          <w:rFonts w:ascii="Consolas" w:hAnsi="Consolas" w:cs="Courier New"/>
+          <w:color w:val="666600"/>
+          <w:sz w:val="17"/>
+          <w:szCs w:val="17"/>
+        </w:rPr>
+        <w:t>);</w:t>
       </w:r>
     </w:p>
     <w:p>
@@ -7588,7 +8510,18 @@
           <w:sz w:val="17"/>
           <w:szCs w:val="17"/>
         </w:rPr>
-        <w:t xml:space="preserve"> source</w:t>
+        <w:t xml:space="preserve"> </w:t>
+      </w:r>
+      <w:proofErr w:type="spellStart"/>
+      <w:proofErr w:type="gramStart"/>
+      <w:r>
+        <w:rPr>
+          <w:rFonts w:ascii="Consolas" w:hAnsi="Consolas" w:cs="Courier New"/>
+          <w:color w:val="000000"/>
+          <w:sz w:val="17"/>
+          <w:szCs w:val="17"/>
+        </w:rPr>
+        <w:t>source</w:t>
       </w:r>
       <w:r>
         <w:rPr>
@@ -7608,6 +8541,8 @@
         </w:rPr>
         <w:t>Where</w:t>
       </w:r>
+      <w:proofErr w:type="spellEnd"/>
+      <w:proofErr w:type="gramEnd"/>
       <w:r>
         <w:rPr>
           <w:rFonts w:ascii="Consolas" w:hAnsi="Consolas" w:cs="Courier New"/>
@@ -7686,7 +8621,17 @@
           <w:sz w:val="17"/>
           <w:szCs w:val="17"/>
         </w:rPr>
-        <w:t xml:space="preserve">    </w:t>
+        <w:t xml:space="preserve"> </w:t>
+      </w:r>
+      <w:proofErr w:type="gramStart"/>
+      <w:r>
+        <w:rPr>
+          <w:rFonts w:ascii="Consolas" w:hAnsi="Consolas" w:cs="Courier New"/>
+          <w:color w:val="000000"/>
+          <w:sz w:val="17"/>
+          <w:szCs w:val="17"/>
+        </w:rPr>
+        <w:t xml:space="preserve">   </w:t>
       </w:r>
       <w:r>
         <w:rPr>
@@ -7697,6 +8642,7 @@
         </w:rPr>
         <w:t>{</w:t>
       </w:r>
+      <w:proofErr w:type="gramEnd"/>
     </w:p>
     <w:p>
       <w:pPr>
@@ -7992,6 +8938,8 @@
         </w:rPr>
         <w:t xml:space="preserve"> </w:t>
       </w:r>
+      <w:proofErr w:type="spellStart"/>
+      <w:proofErr w:type="gramStart"/>
       <w:r>
         <w:rPr>
           <w:rFonts w:ascii="Consolas" w:hAnsi="Consolas" w:cs="Courier New"/>
@@ -8019,6 +8967,8 @@
         </w:rPr>
         <w:t>Contains</w:t>
       </w:r>
+      <w:proofErr w:type="spellEnd"/>
+      <w:proofErr w:type="gramEnd"/>
       <w:r>
         <w:rPr>
           <w:rFonts w:ascii="Consolas" w:hAnsi="Consolas" w:cs="Courier New"/>
@@ -8028,6 +8978,7 @@
         </w:rPr>
         <w:t>(</w:t>
       </w:r>
+      <w:proofErr w:type="spellStart"/>
       <w:r>
         <w:rPr>
           <w:rFonts w:ascii="Consolas" w:hAnsi="Consolas" w:cs="Courier New"/>
@@ -8037,6 +8988,7 @@
         </w:rPr>
         <w:t>searchItem</w:t>
       </w:r>
+      <w:proofErr w:type="spellEnd"/>
       <w:r>
         <w:rPr>
           <w:rFonts w:ascii="Consolas" w:hAnsi="Consolas" w:cs="Courier New"/>
@@ -8055,6 +9007,7 @@
         </w:rPr>
         <w:t xml:space="preserve"> </w:t>
       </w:r>
+      <w:proofErr w:type="spellStart"/>
       <w:r>
         <w:rPr>
           <w:rFonts w:ascii="Consolas" w:hAnsi="Consolas" w:cs="Courier New"/>
@@ -8082,6 +9035,7 @@
         </w:rPr>
         <w:t>OrdinalIgnoreCase</w:t>
       </w:r>
+      <w:proofErr w:type="spellEnd"/>
       <w:r>
         <w:rPr>
           <w:rFonts w:ascii="Consolas" w:hAnsi="Consolas" w:cs="Courier New"/>
@@ -8142,7 +9096,17 @@
           <w:sz w:val="17"/>
           <w:szCs w:val="17"/>
         </w:rPr>
-        <w:t xml:space="preserve">    </w:t>
+        <w:t xml:space="preserve">  </w:t>
+      </w:r>
+      <w:proofErr w:type="gramStart"/>
+      <w:r>
+        <w:rPr>
+          <w:rFonts w:ascii="Consolas" w:hAnsi="Consolas" w:cs="Courier New"/>
+          <w:color w:val="000000"/>
+          <w:sz w:val="17"/>
+          <w:szCs w:val="17"/>
+        </w:rPr>
+        <w:t xml:space="preserve">  </w:t>
       </w:r>
       <w:r>
         <w:rPr>
@@ -8153,6 +9117,7 @@
         </w:rPr>
         <w:t>}).</w:t>
       </w:r>
+      <w:proofErr w:type="spellStart"/>
       <w:r>
         <w:rPr>
           <w:rFonts w:ascii="Consolas" w:hAnsi="Consolas" w:cs="Courier New"/>
@@ -8162,6 +9127,8 @@
         </w:rPr>
         <w:t>ToList</w:t>
       </w:r>
+      <w:proofErr w:type="spellEnd"/>
+      <w:proofErr w:type="gramEnd"/>
       <w:r>
         <w:rPr>
           <w:rFonts w:ascii="Consolas" w:hAnsi="Consolas" w:cs="Courier New"/>
@@ -8207,6 +9174,7 @@
           <w:szCs w:val="17"/>
         </w:rPr>
       </w:pPr>
+      <w:proofErr w:type="gramStart"/>
       <w:r>
         <w:rPr>
           <w:rFonts w:ascii="Consolas" w:hAnsi="Consolas" w:cs="Courier New"/>
@@ -8224,6 +9192,7 @@
         </w:rPr>
         <w:t>}</w:t>
       </w:r>
+      <w:proofErr w:type="gramEnd"/>
     </w:p>
     <w:p>
       <w:pPr>
@@ -8334,7 +9303,39 @@
         <w:t>What to add:</w:t>
       </w:r>
       <w:r>
-        <w:t> A JsonPersistenceService or FileStorageService that serializes your InMemory repositories (Books, Authors, Users, Loans) to a .json file upon exit, and loads them at startup.</w:t>
+        <w:t> A </w:t>
+      </w:r>
+      <w:proofErr w:type="spellStart"/>
+      <w:r>
+        <w:t>JsonPersistenceService</w:t>
+      </w:r>
+      <w:proofErr w:type="spellEnd"/>
+      <w:r>
+        <w:t> or </w:t>
+      </w:r>
+      <w:proofErr w:type="spellStart"/>
+      <w:r>
+        <w:t>FileStorageService</w:t>
+      </w:r>
+      <w:proofErr w:type="spellEnd"/>
+      <w:r>
+        <w:t> that serializes your </w:t>
+      </w:r>
+      <w:proofErr w:type="spellStart"/>
+      <w:r>
+        <w:t>InMemory</w:t>
+      </w:r>
+      <w:proofErr w:type="spellEnd"/>
+      <w:r>
+        <w:t> repositories (Books, Authors, Users, Loans) to a .</w:t>
+      </w:r>
+      <w:proofErr w:type="spellStart"/>
+      <w:r>
+        <w:t>json</w:t>
+      </w:r>
+      <w:proofErr w:type="spellEnd"/>
+      <w:r>
+        <w:t> file upon exit, and loads them at startup.</w:t>
       </w:r>
     </w:p>
     <w:p>
@@ -8407,7 +9408,33 @@
         <w:t>What to add:</w:t>
       </w:r>
       <w:r>
-        <w:t> A LibrarySettings static class or a appsettings.json (if you integrate it early) to read these values. This makes the system flexible.</w:t>
+        <w:t> A </w:t>
+      </w:r>
+      <w:proofErr w:type="spellStart"/>
+      <w:r>
+        <w:t>LibrarySettings</w:t>
+      </w:r>
+      <w:proofErr w:type="spellEnd"/>
+      <w:r>
+        <w:t xml:space="preserve"> static class or </w:t>
+      </w:r>
+      <w:proofErr w:type="gramStart"/>
+      <w:r>
+        <w:t>a</w:t>
+      </w:r>
+      <w:proofErr w:type="gramEnd"/>
+      <w:r>
+        <w:t> </w:t>
+      </w:r>
+      <w:proofErr w:type="spellStart"/>
+      <w:proofErr w:type="gramStart"/>
+      <w:r>
+        <w:t>appsettings.json</w:t>
+      </w:r>
+      <w:proofErr w:type="spellEnd"/>
+      <w:proofErr w:type="gramEnd"/>
+      <w:r>
+        <w:t> (if you integrate it early) to read these values. This makes the system flexible.</w:t>
       </w:r>
     </w:p>
     <w:p>
@@ -8434,7 +9461,31 @@
       </w:pPr>
       <w:r>
         <w:lastRenderedPageBreak/>
-        <w:t>You use ServiceResult for business errors, but what about unexpected NullReferenceException or ArgumentNullException?</w:t>
+        <w:t>You use </w:t>
+      </w:r>
+      <w:proofErr w:type="spellStart"/>
+      <w:r>
+        <w:t>ServiceResult</w:t>
+      </w:r>
+      <w:proofErr w:type="spellEnd"/>
+      <w:r>
+        <w:t> for business errors, but what about unexpected </w:t>
+      </w:r>
+      <w:proofErr w:type="spellStart"/>
+      <w:r>
+        <w:t>NullReferenceException</w:t>
+      </w:r>
+      <w:proofErr w:type="spellEnd"/>
+      <w:r>
+        <w:t> or </w:t>
+      </w:r>
+      <w:proofErr w:type="spellStart"/>
+      <w:r>
+        <w:t>ArgumentNullException</w:t>
+      </w:r>
+      <w:proofErr w:type="spellEnd"/>
+      <w:r>
+        <w:t>?</w:t>
       </w:r>
     </w:p>
     <w:p>
@@ -8452,7 +9503,15 @@
         <w:t>What to add:</w:t>
       </w:r>
       <w:r>
-        <w:t> A global try-catch in the Program.Main loop that catches unhandled exceptions, logs them, and shows a generic "Something went wrong" message to the user, preventing the app from crashing.</w:t>
+        <w:t> A global try-catch in the </w:t>
+      </w:r>
+      <w:proofErr w:type="spellStart"/>
+      <w:r>
+        <w:t>Program.Main</w:t>
+      </w:r>
+      <w:proofErr w:type="spellEnd"/>
+      <w:r>
+        <w:t> loop that catches unhandled exceptions, logs them, and shows a generic "Something went wrong" message to the user, preventing the app from crashing.</w:t>
       </w:r>
     </w:p>
     <w:p>
@@ -8501,7 +9560,23 @@
           <w:b/>
           <w:bCs/>
         </w:rPr>
-        <w:t>Repositories/InMemory/*.cs:</w:t>
+        <w:t>Repositories/</w:t>
+      </w:r>
+      <w:proofErr w:type="spellStart"/>
+      <w:r>
+        <w:rPr>
+          <w:b/>
+          <w:bCs/>
+        </w:rPr>
+        <w:t>InMemory</w:t>
+      </w:r>
+      <w:proofErr w:type="spellEnd"/>
+      <w:r>
+        <w:rPr>
+          <w:b/>
+          <w:bCs/>
+        </w:rPr>
+        <w:t>/*.cs:</w:t>
       </w:r>
       <w:r>
         <w:t xml:space="preserve"> In-memory repository implementations using standard List&lt;T&gt; are </w:t>
@@ -8590,6 +9665,8 @@
         </w:rPr>
         <w:t xml:space="preserve"> </w:t>
       </w:r>
+      <w:proofErr w:type="spellStart"/>
+      <w:proofErr w:type="gramStart"/>
       <w:r>
         <w:rPr>
           <w:rFonts w:ascii="Consolas" w:hAnsi="Consolas" w:cs="Courier New"/>
@@ -8635,6 +9712,8 @@
         </w:rPr>
         <w:t>Concurrent</w:t>
       </w:r>
+      <w:proofErr w:type="spellEnd"/>
+      <w:proofErr w:type="gramEnd"/>
       <w:r>
         <w:rPr>
           <w:rFonts w:ascii="Consolas" w:hAnsi="Consolas" w:cs="Courier New"/>
@@ -8706,6 +9785,8 @@
         </w:rPr>
         <w:t xml:space="preserve"> </w:t>
       </w:r>
+      <w:proofErr w:type="spellStart"/>
+      <w:proofErr w:type="gramStart"/>
       <w:r>
         <w:rPr>
           <w:rFonts w:ascii="Consolas" w:hAnsi="Consolas" w:cs="Courier New"/>
@@ -8751,6 +9832,8 @@
         </w:rPr>
         <w:t>Entities</w:t>
       </w:r>
+      <w:proofErr w:type="spellEnd"/>
+      <w:proofErr w:type="gramEnd"/>
       <w:r>
         <w:rPr>
           <w:rFonts w:ascii="Consolas" w:hAnsi="Consolas" w:cs="Courier New"/>
@@ -8822,6 +9905,8 @@
         </w:rPr>
         <w:t xml:space="preserve"> </w:t>
       </w:r>
+      <w:proofErr w:type="spellStart"/>
+      <w:proofErr w:type="gramStart"/>
       <w:r>
         <w:rPr>
           <w:rFonts w:ascii="Consolas" w:hAnsi="Consolas" w:cs="Courier New"/>
@@ -8867,6 +9952,8 @@
         </w:rPr>
         <w:t>Interfaces</w:t>
       </w:r>
+      <w:proofErr w:type="spellEnd"/>
+      <w:proofErr w:type="gramEnd"/>
       <w:r>
         <w:rPr>
           <w:rFonts w:ascii="Consolas" w:hAnsi="Consolas" w:cs="Courier New"/>
@@ -8991,6 +10078,8 @@
         </w:rPr>
         <w:t xml:space="preserve"> </w:t>
       </w:r>
+      <w:proofErr w:type="spellStart"/>
+      <w:proofErr w:type="gramStart"/>
       <w:r>
         <w:rPr>
           <w:rFonts w:ascii="Consolas" w:hAnsi="Consolas" w:cs="Courier New"/>
@@ -9054,6 +10143,8 @@
         </w:rPr>
         <w:t>InMemory</w:t>
       </w:r>
+      <w:proofErr w:type="spellEnd"/>
+      <w:proofErr w:type="gramEnd"/>
       <w:r>
         <w:rPr>
           <w:rFonts w:ascii="Consolas" w:hAnsi="Consolas" w:cs="Courier New"/>
@@ -9196,6 +10287,8 @@
         </w:rPr>
         <w:t xml:space="preserve"> </w:t>
       </w:r>
+      <w:proofErr w:type="spellStart"/>
+      <w:proofErr w:type="gramStart"/>
       <w:r>
         <w:rPr>
           <w:rFonts w:ascii="Consolas" w:hAnsi="Consolas" w:cs="Courier New"/>
@@ -9205,6 +10298,7 @@
         </w:rPr>
         <w:t>InMemoryAuthorRepository</w:t>
       </w:r>
+      <w:proofErr w:type="spellEnd"/>
       <w:r>
         <w:rPr>
           <w:rFonts w:ascii="Consolas" w:hAnsi="Consolas" w:cs="Courier New"/>
@@ -9223,15 +10317,17 @@
         </w:rPr>
         <w:t>:</w:t>
       </w:r>
-      <w:r>
-        <w:rPr>
-          <w:rFonts w:ascii="Consolas" w:hAnsi="Consolas" w:cs="Courier New"/>
-          <w:color w:val="000000"/>
-          <w:sz w:val="17"/>
-          <w:szCs w:val="17"/>
-        </w:rPr>
-        <w:t xml:space="preserve"> </w:t>
-      </w:r>
+      <w:proofErr w:type="gramEnd"/>
+      <w:r>
+        <w:rPr>
+          <w:rFonts w:ascii="Consolas" w:hAnsi="Consolas" w:cs="Courier New"/>
+          <w:color w:val="000000"/>
+          <w:sz w:val="17"/>
+          <w:szCs w:val="17"/>
+        </w:rPr>
+        <w:t xml:space="preserve"> </w:t>
+      </w:r>
+      <w:proofErr w:type="spellStart"/>
       <w:r>
         <w:rPr>
           <w:rFonts w:ascii="Consolas" w:hAnsi="Consolas" w:cs="Courier New"/>
@@ -9241,6 +10337,7 @@
         </w:rPr>
         <w:t>IAuthorRepository</w:t>
       </w:r>
+      <w:proofErr w:type="spellEnd"/>
     </w:p>
     <w:p>
       <w:pPr>
@@ -9365,6 +10462,7 @@
         </w:rPr>
         <w:t xml:space="preserve"> </w:t>
       </w:r>
+      <w:proofErr w:type="spellStart"/>
       <w:r>
         <w:rPr>
           <w:rFonts w:ascii="Consolas" w:hAnsi="Consolas" w:cs="Courier New"/>
@@ -9374,15 +10472,17 @@
         </w:rPr>
         <w:t>readonly</w:t>
       </w:r>
-      <w:r>
-        <w:rPr>
-          <w:rFonts w:ascii="Consolas" w:hAnsi="Consolas" w:cs="Courier New"/>
-          <w:color w:val="000000"/>
-          <w:sz w:val="17"/>
-          <w:szCs w:val="17"/>
-        </w:rPr>
-        <w:t xml:space="preserve"> </w:t>
-      </w:r>
+      <w:proofErr w:type="spellEnd"/>
+      <w:r>
+        <w:rPr>
+          <w:rFonts w:ascii="Consolas" w:hAnsi="Consolas" w:cs="Courier New"/>
+          <w:color w:val="000000"/>
+          <w:sz w:val="17"/>
+          <w:szCs w:val="17"/>
+        </w:rPr>
+        <w:t xml:space="preserve"> </w:t>
+      </w:r>
+      <w:proofErr w:type="spellStart"/>
       <w:r>
         <w:rPr>
           <w:rFonts w:ascii="Consolas" w:hAnsi="Consolas" w:cs="Courier New"/>
@@ -9392,6 +10492,7 @@
         </w:rPr>
         <w:t>ConcurrentDictionary</w:t>
       </w:r>
+      <w:proofErr w:type="spellEnd"/>
       <w:r>
         <w:rPr>
           <w:rFonts w:ascii="Consolas" w:hAnsi="Consolas" w:cs="Courier New"/>
@@ -9473,6 +10574,7 @@
         </w:rPr>
         <w:t xml:space="preserve"> </w:t>
       </w:r>
+      <w:proofErr w:type="gramStart"/>
       <w:r>
         <w:rPr>
           <w:rFonts w:ascii="Consolas" w:hAnsi="Consolas" w:cs="Courier New"/>
@@ -9489,7 +10591,17 @@
           <w:sz w:val="17"/>
           <w:szCs w:val="17"/>
         </w:rPr>
-        <w:t>();</w:t>
+        <w:t>(</w:t>
+      </w:r>
+      <w:proofErr w:type="gramEnd"/>
+      <w:r>
+        <w:rPr>
+          <w:rFonts w:ascii="Consolas" w:hAnsi="Consolas" w:cs="Courier New"/>
+          <w:color w:val="666600"/>
+          <w:sz w:val="17"/>
+          <w:szCs w:val="17"/>
+        </w:rPr>
+        <w:t>);</w:t>
       </w:r>
     </w:p>
     <w:p>
@@ -9578,7 +10690,27 @@
           <w:sz w:val="17"/>
           <w:szCs w:val="17"/>
         </w:rPr>
-        <w:t xml:space="preserve"> _nextId </w:t>
+        <w:t xml:space="preserve"> _</w:t>
+      </w:r>
+      <w:proofErr w:type="spellStart"/>
+      <w:r>
+        <w:rPr>
+          <w:rFonts w:ascii="Consolas" w:hAnsi="Consolas" w:cs="Courier New"/>
+          <w:color w:val="000000"/>
+          <w:sz w:val="17"/>
+          <w:szCs w:val="17"/>
+        </w:rPr>
+        <w:t>nextId</w:t>
+      </w:r>
+      <w:proofErr w:type="spellEnd"/>
+      <w:r>
+        <w:rPr>
+          <w:rFonts w:ascii="Consolas" w:hAnsi="Consolas" w:cs="Courier New"/>
+          <w:color w:val="000000"/>
+          <w:sz w:val="17"/>
+          <w:szCs w:val="17"/>
+        </w:rPr>
+        <w:t xml:space="preserve"> </w:t>
       </w:r>
       <w:r>
         <w:rPr>
@@ -9785,6 +10917,8 @@
         </w:rPr>
         <w:t xml:space="preserve"> </w:t>
       </w:r>
+      <w:proofErr w:type="spellStart"/>
+      <w:proofErr w:type="gramStart"/>
       <w:r>
         <w:rPr>
           <w:rFonts w:ascii="Consolas" w:hAnsi="Consolas" w:cs="Courier New"/>
@@ -9794,6 +10928,7 @@
         </w:rPr>
         <w:t>AddAsync</w:t>
       </w:r>
+      <w:proofErr w:type="spellEnd"/>
       <w:r>
         <w:rPr>
           <w:rFonts w:ascii="Consolas" w:hAnsi="Consolas" w:cs="Courier New"/>
@@ -9803,6 +10938,7 @@
         </w:rPr>
         <w:t>(</w:t>
       </w:r>
+      <w:proofErr w:type="gramEnd"/>
       <w:r>
         <w:rPr>
           <w:rFonts w:ascii="Consolas" w:hAnsi="Consolas" w:cs="Courier New"/>
@@ -9881,7 +11017,17 @@
           <w:sz w:val="17"/>
           <w:szCs w:val="17"/>
         </w:rPr>
-        <w:t xml:space="preserve">    </w:t>
+        <w:t xml:space="preserve"> </w:t>
+      </w:r>
+      <w:proofErr w:type="gramStart"/>
+      <w:r>
+        <w:rPr>
+          <w:rFonts w:ascii="Consolas" w:hAnsi="Consolas" w:cs="Courier New"/>
+          <w:color w:val="000000"/>
+          <w:sz w:val="17"/>
+          <w:szCs w:val="17"/>
+        </w:rPr>
+        <w:t xml:space="preserve">   </w:t>
       </w:r>
       <w:r>
         <w:rPr>
@@ -9892,6 +11038,7 @@
         </w:rPr>
         <w:t>{</w:t>
       </w:r>
+      <w:proofErr w:type="gramEnd"/>
     </w:p>
     <w:p>
       <w:pPr>
@@ -9943,7 +11090,18 @@
           <w:sz w:val="17"/>
           <w:szCs w:val="17"/>
         </w:rPr>
-        <w:t xml:space="preserve">        author</w:t>
+        <w:t xml:space="preserve">        </w:t>
+      </w:r>
+      <w:proofErr w:type="spellStart"/>
+      <w:proofErr w:type="gramStart"/>
+      <w:r>
+        <w:rPr>
+          <w:rFonts w:ascii="Consolas" w:hAnsi="Consolas" w:cs="Courier New"/>
+          <w:color w:val="000000"/>
+          <w:sz w:val="17"/>
+          <w:szCs w:val="17"/>
+        </w:rPr>
+        <w:t>author</w:t>
       </w:r>
       <w:r>
         <w:rPr>
@@ -9963,6 +11121,8 @@
         </w:rPr>
         <w:t>Id</w:t>
       </w:r>
+      <w:proofErr w:type="spellEnd"/>
+      <w:proofErr w:type="gramEnd"/>
       <w:r>
         <w:rPr>
           <w:rFonts w:ascii="Consolas" w:hAnsi="Consolas" w:cs="Courier New"/>
@@ -9990,6 +11150,7 @@
         </w:rPr>
         <w:t xml:space="preserve"> </w:t>
       </w:r>
+      <w:proofErr w:type="spellStart"/>
       <w:r>
         <w:rPr>
           <w:rFonts w:ascii="Consolas" w:hAnsi="Consolas" w:cs="Courier New"/>
@@ -10017,6 +11178,7 @@
         </w:rPr>
         <w:t>Increment</w:t>
       </w:r>
+      <w:proofErr w:type="spellEnd"/>
       <w:r>
         <w:rPr>
           <w:rFonts w:ascii="Consolas" w:hAnsi="Consolas" w:cs="Courier New"/>
@@ -10042,8 +11204,19 @@
           <w:sz w:val="17"/>
           <w:szCs w:val="17"/>
         </w:rPr>
-        <w:t xml:space="preserve"> _nextId</w:t>
-      </w:r>
+        <w:t xml:space="preserve"> _</w:t>
+      </w:r>
+      <w:proofErr w:type="spellStart"/>
+      <w:r>
+        <w:rPr>
+          <w:rFonts w:ascii="Consolas" w:hAnsi="Consolas" w:cs="Courier New"/>
+          <w:color w:val="000000"/>
+          <w:sz w:val="17"/>
+          <w:szCs w:val="17"/>
+        </w:rPr>
+        <w:t>nextId</w:t>
+      </w:r>
+      <w:proofErr w:type="spellEnd"/>
       <w:r>
         <w:rPr>
           <w:rFonts w:ascii="Consolas" w:hAnsi="Consolas" w:cs="Courier New"/>
@@ -10115,6 +11288,8 @@
         </w:rPr>
         <w:t>[</w:t>
       </w:r>
+      <w:proofErr w:type="spellStart"/>
+      <w:proofErr w:type="gramStart"/>
       <w:r>
         <w:rPr>
           <w:rFonts w:ascii="Consolas" w:hAnsi="Consolas" w:cs="Courier New"/>
@@ -10142,6 +11317,8 @@
         </w:rPr>
         <w:t>Id</w:t>
       </w:r>
+      <w:proofErr w:type="spellEnd"/>
+      <w:proofErr w:type="gramEnd"/>
       <w:r>
         <w:rPr>
           <w:rFonts w:ascii="Consolas" w:hAnsi="Consolas" w:cs="Courier New"/>
@@ -10258,6 +11435,7 @@
         </w:rPr>
         <w:t xml:space="preserve"> </w:t>
       </w:r>
+      <w:proofErr w:type="spellStart"/>
       <w:r>
         <w:rPr>
           <w:rFonts w:ascii="Consolas" w:hAnsi="Consolas" w:cs="Courier New"/>
@@ -10285,6 +11463,7 @@
         </w:rPr>
         <w:t>FromResult</w:t>
       </w:r>
+      <w:proofErr w:type="spellEnd"/>
       <w:r>
         <w:rPr>
           <w:rFonts w:ascii="Consolas" w:hAnsi="Consolas" w:cs="Courier New"/>
@@ -10363,7 +11542,17 @@
           <w:sz w:val="17"/>
           <w:szCs w:val="17"/>
         </w:rPr>
-        <w:t xml:space="preserve">    </w:t>
+        <w:t xml:space="preserve">  </w:t>
+      </w:r>
+      <w:proofErr w:type="gramStart"/>
+      <w:r>
+        <w:rPr>
+          <w:rFonts w:ascii="Consolas" w:hAnsi="Consolas" w:cs="Courier New"/>
+          <w:color w:val="000000"/>
+          <w:sz w:val="17"/>
+          <w:szCs w:val="17"/>
+        </w:rPr>
+        <w:t xml:space="preserve">  </w:t>
       </w:r>
       <w:r>
         <w:rPr>
@@ -10374,6 +11563,7 @@
         </w:rPr>
         <w:t>}</w:t>
       </w:r>
+      <w:proofErr w:type="gramEnd"/>
     </w:p>
     <w:p>
       <w:pPr>
@@ -10543,6 +11733,8 @@
         </w:rPr>
         <w:t xml:space="preserve"> </w:t>
       </w:r>
+      <w:proofErr w:type="spellStart"/>
+      <w:proofErr w:type="gramStart"/>
       <w:r>
         <w:rPr>
           <w:rFonts w:ascii="Consolas" w:hAnsi="Consolas" w:cs="Courier New"/>
@@ -10552,6 +11744,7 @@
         </w:rPr>
         <w:t>GetByIdAsync</w:t>
       </w:r>
+      <w:proofErr w:type="spellEnd"/>
       <w:r>
         <w:rPr>
           <w:rFonts w:ascii="Consolas" w:hAnsi="Consolas" w:cs="Courier New"/>
@@ -10561,6 +11754,7 @@
         </w:rPr>
         <w:t>(</w:t>
       </w:r>
+      <w:proofErr w:type="gramEnd"/>
       <w:r>
         <w:rPr>
           <w:rFonts w:ascii="Consolas" w:hAnsi="Consolas" w:cs="Courier New"/>
@@ -10639,7 +11833,17 @@
           <w:sz w:val="17"/>
           <w:szCs w:val="17"/>
         </w:rPr>
-        <w:t xml:space="preserve">    </w:t>
+        <w:t xml:space="preserve"> </w:t>
+      </w:r>
+      <w:proofErr w:type="gramStart"/>
+      <w:r>
+        <w:rPr>
+          <w:rFonts w:ascii="Consolas" w:hAnsi="Consolas" w:cs="Courier New"/>
+          <w:color w:val="000000"/>
+          <w:sz w:val="17"/>
+          <w:szCs w:val="17"/>
+        </w:rPr>
+        <w:t xml:space="preserve">   </w:t>
       </w:r>
       <w:r>
         <w:rPr>
@@ -10650,6 +11854,7 @@
         </w:rPr>
         <w:t>{</w:t>
       </w:r>
+      <w:proofErr w:type="gramEnd"/>
     </w:p>
     <w:p>
       <w:pPr>
@@ -10701,7 +11906,18 @@
           <w:sz w:val="17"/>
           <w:szCs w:val="17"/>
         </w:rPr>
-        <w:t xml:space="preserve">        _authors</w:t>
+        <w:t xml:space="preserve">        _</w:t>
+      </w:r>
+      <w:proofErr w:type="spellStart"/>
+      <w:proofErr w:type="gramStart"/>
+      <w:r>
+        <w:rPr>
+          <w:rFonts w:ascii="Consolas" w:hAnsi="Consolas" w:cs="Courier New"/>
+          <w:color w:val="000000"/>
+          <w:sz w:val="17"/>
+          <w:szCs w:val="17"/>
+        </w:rPr>
+        <w:t>authors</w:t>
       </w:r>
       <w:r>
         <w:rPr>
@@ -10721,6 +11937,8 @@
         </w:rPr>
         <w:t>TryGetValue</w:t>
       </w:r>
+      <w:proofErr w:type="spellEnd"/>
+      <w:proofErr w:type="gramEnd"/>
       <w:r>
         <w:rPr>
           <w:rFonts w:ascii="Consolas" w:hAnsi="Consolas" w:cs="Courier New"/>
@@ -10873,6 +12091,7 @@
         </w:rPr>
         <w:t xml:space="preserve"> </w:t>
       </w:r>
+      <w:proofErr w:type="spellStart"/>
       <w:r>
         <w:rPr>
           <w:rFonts w:ascii="Consolas" w:hAnsi="Consolas" w:cs="Courier New"/>
@@ -10900,6 +12119,7 @@
         </w:rPr>
         <w:t>FromResult</w:t>
       </w:r>
+      <w:proofErr w:type="spellEnd"/>
       <w:r>
         <w:rPr>
           <w:rFonts w:ascii="Consolas" w:hAnsi="Consolas" w:cs="Courier New"/>
@@ -10978,7 +12198,17 @@
           <w:sz w:val="17"/>
           <w:szCs w:val="17"/>
         </w:rPr>
-        <w:t xml:space="preserve">    </w:t>
+        <w:t xml:space="preserve">  </w:t>
+      </w:r>
+      <w:proofErr w:type="gramStart"/>
+      <w:r>
+        <w:rPr>
+          <w:rFonts w:ascii="Consolas" w:hAnsi="Consolas" w:cs="Courier New"/>
+          <w:color w:val="000000"/>
+          <w:sz w:val="17"/>
+          <w:szCs w:val="17"/>
+        </w:rPr>
+        <w:t xml:space="preserve">  </w:t>
       </w:r>
       <w:r>
         <w:rPr>
@@ -10989,6 +12219,7 @@
         </w:rPr>
         <w:t>}</w:t>
       </w:r>
+      <w:proofErr w:type="gramEnd"/>
     </w:p>
     <w:p>
       <w:pPr>
@@ -11025,6 +12256,7 @@
           <w:szCs w:val="17"/>
         </w:rPr>
       </w:pPr>
+      <w:proofErr w:type="gramStart"/>
       <w:r>
         <w:rPr>
           <w:rFonts w:ascii="Consolas" w:hAnsi="Consolas" w:cs="Courier New"/>
@@ -11042,6 +12274,7 @@
         </w:rPr>
         <w:t>}</w:t>
       </w:r>
+      <w:proofErr w:type="gramEnd"/>
     </w:p>
     <w:p>
       <w:pPr>
@@ -11051,15 +12284,34 @@
       </w:pPr>
     </w:p>
     <w:p>
+      <w:proofErr w:type="spellStart"/>
       <w:r>
         <w:rPr>
           <w:b/>
           <w:bCs/>
         </w:rPr>
-        <w:t>Program.cs &amp; Menus/*.cs:</w:t>
-      </w:r>
-      <w:r>
-        <w:t xml:space="preserve"> Menus shouldn't manually instantiate service implementations or repositories. A Dependency Injection (DI) container should manage object lifetimes and inject interface dependencies directly. Configure the Microsoft DI Container (Microsoft.Extensions.DependencyInjection) to wire up services, repositories, and menus</w:t>
+        <w:t>Program.cs</w:t>
+      </w:r>
+      <w:proofErr w:type="spellEnd"/>
+      <w:r>
+        <w:rPr>
+          <w:b/>
+          <w:bCs/>
+        </w:rPr>
+        <w:t xml:space="preserve"> &amp; Menus/*.cs:</w:t>
+      </w:r>
+      <w:r>
+        <w:t xml:space="preserve"> Menus shouldn't manually instantiate service implementations or repositories. A Dependency Injection (DI) container should manage object lifetimes and inject interface dependencies directly. Configure the Microsoft DI Container (</w:t>
+      </w:r>
+      <w:proofErr w:type="spellStart"/>
+      <w:proofErr w:type="gramStart"/>
+      <w:r>
+        <w:t>Microsoft.Extensions.DependencyInjection</w:t>
+      </w:r>
+      <w:proofErr w:type="spellEnd"/>
+      <w:proofErr w:type="gramEnd"/>
+      <w:r>
+        <w:t>) to wire up services, repositories, and menus</w:t>
       </w:r>
       <w:r>
         <w:t xml:space="preserve">: </w:t>
@@ -11126,6 +12378,8 @@
         </w:rPr>
         <w:t xml:space="preserve"> </w:t>
       </w:r>
+      <w:proofErr w:type="spellStart"/>
+      <w:proofErr w:type="gramStart"/>
       <w:r>
         <w:rPr>
           <w:rFonts w:ascii="Consolas" w:hAnsi="Consolas" w:cs="Courier New"/>
@@ -11171,6 +12425,8 @@
         </w:rPr>
         <w:t>DependencyInjection</w:t>
       </w:r>
+      <w:proofErr w:type="spellEnd"/>
+      <w:proofErr w:type="gramEnd"/>
       <w:r>
         <w:rPr>
           <w:rFonts w:ascii="Consolas" w:hAnsi="Consolas" w:cs="Courier New"/>
@@ -11242,6 +12498,8 @@
         </w:rPr>
         <w:t xml:space="preserve"> </w:t>
       </w:r>
+      <w:proofErr w:type="spellStart"/>
+      <w:proofErr w:type="gramStart"/>
       <w:r>
         <w:rPr>
           <w:rFonts w:ascii="Consolas" w:hAnsi="Consolas" w:cs="Courier New"/>
@@ -11287,6 +12545,8 @@
         </w:rPr>
         <w:t>Contracts</w:t>
       </w:r>
+      <w:proofErr w:type="spellEnd"/>
+      <w:proofErr w:type="gramEnd"/>
       <w:r>
         <w:rPr>
           <w:rFonts w:ascii="Consolas" w:hAnsi="Consolas" w:cs="Courier New"/>
@@ -11358,6 +12618,8 @@
         </w:rPr>
         <w:t xml:space="preserve"> </w:t>
       </w:r>
+      <w:proofErr w:type="spellStart"/>
+      <w:proofErr w:type="gramStart"/>
       <w:r>
         <w:rPr>
           <w:rFonts w:ascii="Consolas" w:hAnsi="Consolas" w:cs="Courier New"/>
@@ -11403,6 +12665,8 @@
         </w:rPr>
         <w:t>Services</w:t>
       </w:r>
+      <w:proofErr w:type="spellEnd"/>
+      <w:proofErr w:type="gramEnd"/>
       <w:r>
         <w:rPr>
           <w:rFonts w:ascii="Consolas" w:hAnsi="Consolas" w:cs="Courier New"/>
@@ -11474,6 +12738,8 @@
         </w:rPr>
         <w:t xml:space="preserve"> </w:t>
       </w:r>
+      <w:proofErr w:type="spellStart"/>
+      <w:proofErr w:type="gramStart"/>
       <w:r>
         <w:rPr>
           <w:rFonts w:ascii="Consolas" w:hAnsi="Consolas" w:cs="Courier New"/>
@@ -11519,6 +12785,8 @@
         </w:rPr>
         <w:t>Interfaces</w:t>
       </w:r>
+      <w:proofErr w:type="spellEnd"/>
+      <w:proofErr w:type="gramEnd"/>
       <w:r>
         <w:rPr>
           <w:rFonts w:ascii="Consolas" w:hAnsi="Consolas" w:cs="Courier New"/>
@@ -11590,6 +12858,8 @@
         </w:rPr>
         <w:t xml:space="preserve"> </w:t>
       </w:r>
+      <w:proofErr w:type="spellStart"/>
+      <w:proofErr w:type="gramStart"/>
       <w:r>
         <w:rPr>
           <w:rFonts w:ascii="Consolas" w:hAnsi="Consolas" w:cs="Courier New"/>
@@ -11653,6 +12923,8 @@
         </w:rPr>
         <w:t>InMemory</w:t>
       </w:r>
+      <w:proofErr w:type="spellEnd"/>
+      <w:proofErr w:type="gramEnd"/>
       <w:r>
         <w:rPr>
           <w:rFonts w:ascii="Consolas" w:hAnsi="Consolas" w:cs="Courier New"/>
@@ -11724,6 +12996,8 @@
         </w:rPr>
         <w:t xml:space="preserve"> </w:t>
       </w:r>
+      <w:proofErr w:type="spellStart"/>
+      <w:proofErr w:type="gramStart"/>
       <w:r>
         <w:rPr>
           <w:rFonts w:ascii="Consolas" w:hAnsi="Consolas" w:cs="Courier New"/>
@@ -11787,6 +13061,8 @@
         </w:rPr>
         <w:t>Menus</w:t>
       </w:r>
+      <w:proofErr w:type="spellEnd"/>
+      <w:proofErr w:type="gramEnd"/>
       <w:r>
         <w:rPr>
           <w:rFonts w:ascii="Consolas" w:hAnsi="Consolas" w:cs="Courier New"/>
@@ -11947,6 +13223,8 @@
         </w:rPr>
         <w:t xml:space="preserve"> </w:t>
       </w:r>
+      <w:proofErr w:type="spellStart"/>
+      <w:proofErr w:type="gramStart"/>
       <w:r>
         <w:rPr>
           <w:rFonts w:ascii="Consolas" w:hAnsi="Consolas" w:cs="Courier New"/>
@@ -11956,14 +13234,25 @@
         </w:rPr>
         <w:t>ServiceCollection</w:t>
       </w:r>
-      <w:r>
-        <w:rPr>
-          <w:rFonts w:ascii="Consolas" w:hAnsi="Consolas" w:cs="Courier New"/>
-          <w:color w:val="666600"/>
-          <w:sz w:val="17"/>
-          <w:szCs w:val="17"/>
-        </w:rPr>
-        <w:t>();</w:t>
+      <w:proofErr w:type="spellEnd"/>
+      <w:r>
+        <w:rPr>
+          <w:rFonts w:ascii="Consolas" w:hAnsi="Consolas" w:cs="Courier New"/>
+          <w:color w:val="666600"/>
+          <w:sz w:val="17"/>
+          <w:szCs w:val="17"/>
+        </w:rPr>
+        <w:t>(</w:t>
+      </w:r>
+      <w:proofErr w:type="gramEnd"/>
+      <w:r>
+        <w:rPr>
+          <w:rFonts w:ascii="Consolas" w:hAnsi="Consolas" w:cs="Courier New"/>
+          <w:color w:val="666600"/>
+          <w:sz w:val="17"/>
+          <w:szCs w:val="17"/>
+        </w:rPr>
+        <w:t>);</w:t>
       </w:r>
     </w:p>
     <w:p>
@@ -12116,6 +13405,8 @@
         <w:lastRenderedPageBreak/>
         <w:t xml:space="preserve">11. </w:t>
       </w:r>
+      <w:proofErr w:type="spellStart"/>
+      <w:proofErr w:type="gramStart"/>
       <w:r>
         <w:rPr>
           <w:rFonts w:ascii="Consolas" w:hAnsi="Consolas" w:cs="Courier New"/>
@@ -12143,6 +13434,8 @@
         </w:rPr>
         <w:t>AddSingleton</w:t>
       </w:r>
+      <w:proofErr w:type="spellEnd"/>
+      <w:proofErr w:type="gramEnd"/>
       <w:r>
         <w:rPr>
           <w:rFonts w:ascii="Consolas" w:hAnsi="Consolas" w:cs="Courier New"/>
@@ -12152,6 +13445,7 @@
         </w:rPr>
         <w:t>&lt;</w:t>
       </w:r>
+      <w:proofErr w:type="spellStart"/>
       <w:r>
         <w:rPr>
           <w:rFonts w:ascii="Consolas" w:hAnsi="Consolas" w:cs="Courier New"/>
@@ -12161,6 +13455,7 @@
         </w:rPr>
         <w:t>IAuthorRepository</w:t>
       </w:r>
+      <w:proofErr w:type="spellEnd"/>
       <w:r>
         <w:rPr>
           <w:rFonts w:ascii="Consolas" w:hAnsi="Consolas" w:cs="Courier New"/>
@@ -12179,6 +13474,7 @@
         </w:rPr>
         <w:t xml:space="preserve"> </w:t>
       </w:r>
+      <w:proofErr w:type="spellStart"/>
       <w:r>
         <w:rPr>
           <w:rFonts w:ascii="Consolas" w:hAnsi="Consolas" w:cs="Courier New"/>
@@ -12188,14 +13484,26 @@
         </w:rPr>
         <w:t>InMemoryAuthorRepository</w:t>
       </w:r>
-      <w:r>
-        <w:rPr>
-          <w:rFonts w:ascii="Consolas" w:hAnsi="Consolas" w:cs="Courier New"/>
-          <w:color w:val="666600"/>
-          <w:sz w:val="17"/>
-          <w:szCs w:val="17"/>
-        </w:rPr>
-        <w:t>&gt;();</w:t>
+      <w:proofErr w:type="spellEnd"/>
+      <w:proofErr w:type="gramStart"/>
+      <w:r>
+        <w:rPr>
+          <w:rFonts w:ascii="Consolas" w:hAnsi="Consolas" w:cs="Courier New"/>
+          <w:color w:val="666600"/>
+          <w:sz w:val="17"/>
+          <w:szCs w:val="17"/>
+        </w:rPr>
+        <w:t>&gt;(</w:t>
+      </w:r>
+      <w:proofErr w:type="gramEnd"/>
+      <w:r>
+        <w:rPr>
+          <w:rFonts w:ascii="Consolas" w:hAnsi="Consolas" w:cs="Courier New"/>
+          <w:color w:val="666600"/>
+          <w:sz w:val="17"/>
+          <w:szCs w:val="17"/>
+        </w:rPr>
+        <w:t>);</w:t>
       </w:r>
     </w:p>
     <w:p>
@@ -12241,6 +13549,8 @@
         </w:rPr>
         <w:t xml:space="preserve">12. </w:t>
       </w:r>
+      <w:proofErr w:type="spellStart"/>
+      <w:proofErr w:type="gramStart"/>
       <w:r>
         <w:rPr>
           <w:rFonts w:ascii="Consolas" w:hAnsi="Consolas" w:cs="Courier New"/>
@@ -12268,6 +13578,8 @@
         </w:rPr>
         <w:t>AddSingleton</w:t>
       </w:r>
+      <w:proofErr w:type="spellEnd"/>
+      <w:proofErr w:type="gramEnd"/>
       <w:r>
         <w:rPr>
           <w:rFonts w:ascii="Consolas" w:hAnsi="Consolas" w:cs="Courier New"/>
@@ -12277,6 +13589,7 @@
         </w:rPr>
         <w:t>&lt;</w:t>
       </w:r>
+      <w:proofErr w:type="spellStart"/>
       <w:r>
         <w:rPr>
           <w:rFonts w:ascii="Consolas" w:hAnsi="Consolas" w:cs="Courier New"/>
@@ -12286,6 +13599,7 @@
         </w:rPr>
         <w:t>IBookRepository</w:t>
       </w:r>
+      <w:proofErr w:type="spellEnd"/>
       <w:r>
         <w:rPr>
           <w:rFonts w:ascii="Consolas" w:hAnsi="Consolas" w:cs="Courier New"/>
@@ -12304,6 +13618,7 @@
         </w:rPr>
         <w:t xml:space="preserve"> </w:t>
       </w:r>
+      <w:proofErr w:type="spellStart"/>
       <w:r>
         <w:rPr>
           <w:rFonts w:ascii="Consolas" w:hAnsi="Consolas" w:cs="Courier New"/>
@@ -12313,14 +13628,26 @@
         </w:rPr>
         <w:t>InMemoryBookRepository</w:t>
       </w:r>
-      <w:r>
-        <w:rPr>
-          <w:rFonts w:ascii="Consolas" w:hAnsi="Consolas" w:cs="Courier New"/>
-          <w:color w:val="666600"/>
-          <w:sz w:val="17"/>
-          <w:szCs w:val="17"/>
-        </w:rPr>
-        <w:t>&gt;();</w:t>
+      <w:proofErr w:type="spellEnd"/>
+      <w:proofErr w:type="gramStart"/>
+      <w:r>
+        <w:rPr>
+          <w:rFonts w:ascii="Consolas" w:hAnsi="Consolas" w:cs="Courier New"/>
+          <w:color w:val="666600"/>
+          <w:sz w:val="17"/>
+          <w:szCs w:val="17"/>
+        </w:rPr>
+        <w:t>&gt;(</w:t>
+      </w:r>
+      <w:proofErr w:type="gramEnd"/>
+      <w:r>
+        <w:rPr>
+          <w:rFonts w:ascii="Consolas" w:hAnsi="Consolas" w:cs="Courier New"/>
+          <w:color w:val="666600"/>
+          <w:sz w:val="17"/>
+          <w:szCs w:val="17"/>
+        </w:rPr>
+        <w:t>);</w:t>
       </w:r>
     </w:p>
     <w:p>
@@ -12366,6 +13693,8 @@
         </w:rPr>
         <w:t xml:space="preserve">13. </w:t>
       </w:r>
+      <w:proofErr w:type="spellStart"/>
+      <w:proofErr w:type="gramStart"/>
       <w:r>
         <w:rPr>
           <w:rFonts w:ascii="Consolas" w:hAnsi="Consolas" w:cs="Courier New"/>
@@ -12393,6 +13722,8 @@
         </w:rPr>
         <w:t>AddSingleton</w:t>
       </w:r>
+      <w:proofErr w:type="spellEnd"/>
+      <w:proofErr w:type="gramEnd"/>
       <w:r>
         <w:rPr>
           <w:rFonts w:ascii="Consolas" w:hAnsi="Consolas" w:cs="Courier New"/>
@@ -12402,6 +13733,7 @@
         </w:rPr>
         <w:t>&lt;</w:t>
       </w:r>
+      <w:proofErr w:type="spellStart"/>
       <w:r>
         <w:rPr>
           <w:rFonts w:ascii="Consolas" w:hAnsi="Consolas" w:cs="Courier New"/>
@@ -12411,6 +13743,7 @@
         </w:rPr>
         <w:t>ILoanRepository</w:t>
       </w:r>
+      <w:proofErr w:type="spellEnd"/>
       <w:r>
         <w:rPr>
           <w:rFonts w:ascii="Consolas" w:hAnsi="Consolas" w:cs="Courier New"/>
@@ -12429,6 +13762,7 @@
         </w:rPr>
         <w:t xml:space="preserve"> </w:t>
       </w:r>
+      <w:proofErr w:type="spellStart"/>
       <w:r>
         <w:rPr>
           <w:rFonts w:ascii="Consolas" w:hAnsi="Consolas" w:cs="Courier New"/>
@@ -12438,14 +13772,26 @@
         </w:rPr>
         <w:t>InMemoryLoanRepository</w:t>
       </w:r>
-      <w:r>
-        <w:rPr>
-          <w:rFonts w:ascii="Consolas" w:hAnsi="Consolas" w:cs="Courier New"/>
-          <w:color w:val="666600"/>
-          <w:sz w:val="17"/>
-          <w:szCs w:val="17"/>
-        </w:rPr>
-        <w:t>&gt;();</w:t>
+      <w:proofErr w:type="spellEnd"/>
+      <w:proofErr w:type="gramStart"/>
+      <w:r>
+        <w:rPr>
+          <w:rFonts w:ascii="Consolas" w:hAnsi="Consolas" w:cs="Courier New"/>
+          <w:color w:val="666600"/>
+          <w:sz w:val="17"/>
+          <w:szCs w:val="17"/>
+        </w:rPr>
+        <w:t>&gt;(</w:t>
+      </w:r>
+      <w:proofErr w:type="gramEnd"/>
+      <w:r>
+        <w:rPr>
+          <w:rFonts w:ascii="Consolas" w:hAnsi="Consolas" w:cs="Courier New"/>
+          <w:color w:val="666600"/>
+          <w:sz w:val="17"/>
+          <w:szCs w:val="17"/>
+        </w:rPr>
+        <w:t>);</w:t>
       </w:r>
     </w:p>
     <w:p>
@@ -12491,6 +13837,8 @@
         </w:rPr>
         <w:t xml:space="preserve">14. </w:t>
       </w:r>
+      <w:proofErr w:type="spellStart"/>
+      <w:proofErr w:type="gramStart"/>
       <w:r>
         <w:rPr>
           <w:rFonts w:ascii="Consolas" w:hAnsi="Consolas" w:cs="Courier New"/>
@@ -12518,6 +13866,8 @@
         </w:rPr>
         <w:t>AddSingleton</w:t>
       </w:r>
+      <w:proofErr w:type="spellEnd"/>
+      <w:proofErr w:type="gramEnd"/>
       <w:r>
         <w:rPr>
           <w:rFonts w:ascii="Consolas" w:hAnsi="Consolas" w:cs="Courier New"/>
@@ -12554,6 +13904,7 @@
         </w:rPr>
         <w:t xml:space="preserve"> </w:t>
       </w:r>
+      <w:proofErr w:type="spellStart"/>
       <w:r>
         <w:rPr>
           <w:rFonts w:ascii="Consolas" w:hAnsi="Consolas" w:cs="Courier New"/>
@@ -12563,14 +13914,26 @@
         </w:rPr>
         <w:t>InMemoryUserRepository</w:t>
       </w:r>
-      <w:r>
-        <w:rPr>
-          <w:rFonts w:ascii="Consolas" w:hAnsi="Consolas" w:cs="Courier New"/>
-          <w:color w:val="666600"/>
-          <w:sz w:val="17"/>
-          <w:szCs w:val="17"/>
-        </w:rPr>
-        <w:t>&gt;();</w:t>
+      <w:proofErr w:type="spellEnd"/>
+      <w:proofErr w:type="gramStart"/>
+      <w:r>
+        <w:rPr>
+          <w:rFonts w:ascii="Consolas" w:hAnsi="Consolas" w:cs="Courier New"/>
+          <w:color w:val="666600"/>
+          <w:sz w:val="17"/>
+          <w:szCs w:val="17"/>
+        </w:rPr>
+        <w:t>&gt;(</w:t>
+      </w:r>
+      <w:proofErr w:type="gramEnd"/>
+      <w:r>
+        <w:rPr>
+          <w:rFonts w:ascii="Consolas" w:hAnsi="Consolas" w:cs="Courier New"/>
+          <w:color w:val="666600"/>
+          <w:sz w:val="17"/>
+          <w:szCs w:val="17"/>
+        </w:rPr>
+        <w:t>);</w:t>
       </w:r>
     </w:p>
     <w:p>
@@ -12722,6 +14085,8 @@
         </w:rPr>
         <w:t xml:space="preserve">17. </w:t>
       </w:r>
+      <w:proofErr w:type="spellStart"/>
+      <w:proofErr w:type="gramStart"/>
       <w:r>
         <w:rPr>
           <w:rFonts w:ascii="Consolas" w:hAnsi="Consolas" w:cs="Courier New"/>
@@ -12749,6 +14114,8 @@
         </w:rPr>
         <w:t>AddTransient</w:t>
       </w:r>
+      <w:proofErr w:type="spellEnd"/>
+      <w:proofErr w:type="gramEnd"/>
       <w:r>
         <w:rPr>
           <w:rFonts w:ascii="Consolas" w:hAnsi="Consolas" w:cs="Courier New"/>
@@ -12758,6 +14125,7 @@
         </w:rPr>
         <w:t>&lt;</w:t>
       </w:r>
+      <w:proofErr w:type="spellStart"/>
       <w:r>
         <w:rPr>
           <w:rFonts w:ascii="Consolas" w:hAnsi="Consolas" w:cs="Courier New"/>
@@ -12767,6 +14135,7 @@
         </w:rPr>
         <w:t>IAuthorService</w:t>
       </w:r>
+      <w:proofErr w:type="spellEnd"/>
       <w:r>
         <w:rPr>
           <w:rFonts w:ascii="Consolas" w:hAnsi="Consolas" w:cs="Courier New"/>
@@ -12785,6 +14154,7 @@
         </w:rPr>
         <w:t xml:space="preserve"> </w:t>
       </w:r>
+      <w:proofErr w:type="spellStart"/>
       <w:r>
         <w:rPr>
           <w:rFonts w:ascii="Consolas" w:hAnsi="Consolas" w:cs="Courier New"/>
@@ -12794,14 +14164,26 @@
         </w:rPr>
         <w:t>AuthorManagementService</w:t>
       </w:r>
-      <w:r>
-        <w:rPr>
-          <w:rFonts w:ascii="Consolas" w:hAnsi="Consolas" w:cs="Courier New"/>
-          <w:color w:val="666600"/>
-          <w:sz w:val="17"/>
-          <w:szCs w:val="17"/>
-        </w:rPr>
-        <w:t>&gt;();</w:t>
+      <w:proofErr w:type="spellEnd"/>
+      <w:proofErr w:type="gramStart"/>
+      <w:r>
+        <w:rPr>
+          <w:rFonts w:ascii="Consolas" w:hAnsi="Consolas" w:cs="Courier New"/>
+          <w:color w:val="666600"/>
+          <w:sz w:val="17"/>
+          <w:szCs w:val="17"/>
+        </w:rPr>
+        <w:t>&gt;(</w:t>
+      </w:r>
+      <w:proofErr w:type="gramEnd"/>
+      <w:r>
+        <w:rPr>
+          <w:rFonts w:ascii="Consolas" w:hAnsi="Consolas" w:cs="Courier New"/>
+          <w:color w:val="666600"/>
+          <w:sz w:val="17"/>
+          <w:szCs w:val="17"/>
+        </w:rPr>
+        <w:t>);</w:t>
       </w:r>
     </w:p>
     <w:p>
@@ -12847,6 +14229,8 @@
         </w:rPr>
         <w:t xml:space="preserve">18. </w:t>
       </w:r>
+      <w:proofErr w:type="spellStart"/>
+      <w:proofErr w:type="gramStart"/>
       <w:r>
         <w:rPr>
           <w:rFonts w:ascii="Consolas" w:hAnsi="Consolas" w:cs="Courier New"/>
@@ -12874,6 +14258,8 @@
         </w:rPr>
         <w:t>AddTransient</w:t>
       </w:r>
+      <w:proofErr w:type="spellEnd"/>
+      <w:proofErr w:type="gramEnd"/>
       <w:r>
         <w:rPr>
           <w:rFonts w:ascii="Consolas" w:hAnsi="Consolas" w:cs="Courier New"/>
@@ -12883,6 +14269,7 @@
         </w:rPr>
         <w:t>&lt;</w:t>
       </w:r>
+      <w:proofErr w:type="spellStart"/>
       <w:r>
         <w:rPr>
           <w:rFonts w:ascii="Consolas" w:hAnsi="Consolas" w:cs="Courier New"/>
@@ -12892,6 +14279,7 @@
         </w:rPr>
         <w:t>IBookService</w:t>
       </w:r>
+      <w:proofErr w:type="spellEnd"/>
       <w:r>
         <w:rPr>
           <w:rFonts w:ascii="Consolas" w:hAnsi="Consolas" w:cs="Courier New"/>
@@ -12910,6 +14298,7 @@
         </w:rPr>
         <w:t xml:space="preserve"> </w:t>
       </w:r>
+      <w:proofErr w:type="spellStart"/>
       <w:r>
         <w:rPr>
           <w:rFonts w:ascii="Consolas" w:hAnsi="Consolas" w:cs="Courier New"/>
@@ -12919,14 +14308,26 @@
         </w:rPr>
         <w:t>BookManagementService</w:t>
       </w:r>
-      <w:r>
-        <w:rPr>
-          <w:rFonts w:ascii="Consolas" w:hAnsi="Consolas" w:cs="Courier New"/>
-          <w:color w:val="666600"/>
-          <w:sz w:val="17"/>
-          <w:szCs w:val="17"/>
-        </w:rPr>
-        <w:t>&gt;();</w:t>
+      <w:proofErr w:type="spellEnd"/>
+      <w:proofErr w:type="gramStart"/>
+      <w:r>
+        <w:rPr>
+          <w:rFonts w:ascii="Consolas" w:hAnsi="Consolas" w:cs="Courier New"/>
+          <w:color w:val="666600"/>
+          <w:sz w:val="17"/>
+          <w:szCs w:val="17"/>
+        </w:rPr>
+        <w:t>&gt;(</w:t>
+      </w:r>
+      <w:proofErr w:type="gramEnd"/>
+      <w:r>
+        <w:rPr>
+          <w:rFonts w:ascii="Consolas" w:hAnsi="Consolas" w:cs="Courier New"/>
+          <w:color w:val="666600"/>
+          <w:sz w:val="17"/>
+          <w:szCs w:val="17"/>
+        </w:rPr>
+        <w:t>);</w:t>
       </w:r>
     </w:p>
     <w:p>
@@ -12972,6 +14373,8 @@
         </w:rPr>
         <w:t xml:space="preserve">19. </w:t>
       </w:r>
+      <w:proofErr w:type="spellStart"/>
+      <w:proofErr w:type="gramStart"/>
       <w:r>
         <w:rPr>
           <w:rFonts w:ascii="Consolas" w:hAnsi="Consolas" w:cs="Courier New"/>
@@ -12999,6 +14402,8 @@
         </w:rPr>
         <w:t>AddTransient</w:t>
       </w:r>
+      <w:proofErr w:type="spellEnd"/>
+      <w:proofErr w:type="gramEnd"/>
       <w:r>
         <w:rPr>
           <w:rFonts w:ascii="Consolas" w:hAnsi="Consolas" w:cs="Courier New"/>
@@ -13008,6 +14413,7 @@
         </w:rPr>
         <w:t>&lt;</w:t>
       </w:r>
+      <w:proofErr w:type="spellStart"/>
       <w:r>
         <w:rPr>
           <w:rFonts w:ascii="Consolas" w:hAnsi="Consolas" w:cs="Courier New"/>
@@ -13017,6 +14423,7 @@
         </w:rPr>
         <w:t>ILoanService</w:t>
       </w:r>
+      <w:proofErr w:type="spellEnd"/>
       <w:r>
         <w:rPr>
           <w:rFonts w:ascii="Consolas" w:hAnsi="Consolas" w:cs="Courier New"/>
@@ -13035,6 +14442,7 @@
         </w:rPr>
         <w:t xml:space="preserve"> </w:t>
       </w:r>
+      <w:proofErr w:type="spellStart"/>
       <w:r>
         <w:rPr>
           <w:rFonts w:ascii="Consolas" w:hAnsi="Consolas" w:cs="Courier New"/>
@@ -13044,14 +14452,26 @@
         </w:rPr>
         <w:t>LoanManagementService</w:t>
       </w:r>
-      <w:r>
-        <w:rPr>
-          <w:rFonts w:ascii="Consolas" w:hAnsi="Consolas" w:cs="Courier New"/>
-          <w:color w:val="666600"/>
-          <w:sz w:val="17"/>
-          <w:szCs w:val="17"/>
-        </w:rPr>
-        <w:t>&gt;();</w:t>
+      <w:proofErr w:type="spellEnd"/>
+      <w:proofErr w:type="gramStart"/>
+      <w:r>
+        <w:rPr>
+          <w:rFonts w:ascii="Consolas" w:hAnsi="Consolas" w:cs="Courier New"/>
+          <w:color w:val="666600"/>
+          <w:sz w:val="17"/>
+          <w:szCs w:val="17"/>
+        </w:rPr>
+        <w:t>&gt;(</w:t>
+      </w:r>
+      <w:proofErr w:type="gramEnd"/>
+      <w:r>
+        <w:rPr>
+          <w:rFonts w:ascii="Consolas" w:hAnsi="Consolas" w:cs="Courier New"/>
+          <w:color w:val="666600"/>
+          <w:sz w:val="17"/>
+          <w:szCs w:val="17"/>
+        </w:rPr>
+        <w:t>);</w:t>
       </w:r>
     </w:p>
     <w:p>
@@ -13097,6 +14517,8 @@
         </w:rPr>
         <w:t xml:space="preserve">20. </w:t>
       </w:r>
+      <w:proofErr w:type="spellStart"/>
+      <w:proofErr w:type="gramStart"/>
       <w:r>
         <w:rPr>
           <w:rFonts w:ascii="Consolas" w:hAnsi="Consolas" w:cs="Courier New"/>
@@ -13124,6 +14546,8 @@
         </w:rPr>
         <w:t>AddTransient</w:t>
       </w:r>
+      <w:proofErr w:type="spellEnd"/>
+      <w:proofErr w:type="gramEnd"/>
       <w:r>
         <w:rPr>
           <w:rFonts w:ascii="Consolas" w:hAnsi="Consolas" w:cs="Courier New"/>
@@ -13133,6 +14557,7 @@
         </w:rPr>
         <w:t>&lt;</w:t>
       </w:r>
+      <w:proofErr w:type="spellStart"/>
       <w:r>
         <w:rPr>
           <w:rFonts w:ascii="Consolas" w:hAnsi="Consolas" w:cs="Courier New"/>
@@ -13142,6 +14567,7 @@
         </w:rPr>
         <w:t>IUserService</w:t>
       </w:r>
+      <w:proofErr w:type="spellEnd"/>
       <w:r>
         <w:rPr>
           <w:rFonts w:ascii="Consolas" w:hAnsi="Consolas" w:cs="Courier New"/>
@@ -13160,6 +14586,7 @@
         </w:rPr>
         <w:t xml:space="preserve"> </w:t>
       </w:r>
+      <w:proofErr w:type="spellStart"/>
       <w:r>
         <w:rPr>
           <w:rFonts w:ascii="Consolas" w:hAnsi="Consolas" w:cs="Courier New"/>
@@ -13169,14 +14596,26 @@
         </w:rPr>
         <w:t>UserManagementService</w:t>
       </w:r>
-      <w:r>
-        <w:rPr>
-          <w:rFonts w:ascii="Consolas" w:hAnsi="Consolas" w:cs="Courier New"/>
-          <w:color w:val="666600"/>
-          <w:sz w:val="17"/>
-          <w:szCs w:val="17"/>
-        </w:rPr>
-        <w:t>&gt;();</w:t>
+      <w:proofErr w:type="spellEnd"/>
+      <w:proofErr w:type="gramStart"/>
+      <w:r>
+        <w:rPr>
+          <w:rFonts w:ascii="Consolas" w:hAnsi="Consolas" w:cs="Courier New"/>
+          <w:color w:val="666600"/>
+          <w:sz w:val="17"/>
+          <w:szCs w:val="17"/>
+        </w:rPr>
+        <w:t>&gt;(</w:t>
+      </w:r>
+      <w:proofErr w:type="gramEnd"/>
+      <w:r>
+        <w:rPr>
+          <w:rFonts w:ascii="Consolas" w:hAnsi="Consolas" w:cs="Courier New"/>
+          <w:color w:val="666600"/>
+          <w:sz w:val="17"/>
+          <w:szCs w:val="17"/>
+        </w:rPr>
+        <w:t>);</w:t>
       </w:r>
     </w:p>
     <w:p>
@@ -13328,6 +14767,8 @@
         </w:rPr>
         <w:t xml:space="preserve">23. </w:t>
       </w:r>
+      <w:proofErr w:type="spellStart"/>
+      <w:proofErr w:type="gramStart"/>
       <w:r>
         <w:rPr>
           <w:rFonts w:ascii="Consolas" w:hAnsi="Consolas" w:cs="Courier New"/>
@@ -13355,6 +14796,8 @@
         </w:rPr>
         <w:t>AddTransient</w:t>
       </w:r>
+      <w:proofErr w:type="spellEnd"/>
+      <w:proofErr w:type="gramEnd"/>
       <w:r>
         <w:rPr>
           <w:rFonts w:ascii="Consolas" w:hAnsi="Consolas" w:cs="Courier New"/>
@@ -13364,6 +14807,7 @@
         </w:rPr>
         <w:t>&lt;</w:t>
       </w:r>
+      <w:proofErr w:type="spellStart"/>
       <w:r>
         <w:rPr>
           <w:rFonts w:ascii="Consolas" w:hAnsi="Consolas" w:cs="Courier New"/>
@@ -13373,14 +14817,26 @@
         </w:rPr>
         <w:t>MainMenu</w:t>
       </w:r>
-      <w:r>
-        <w:rPr>
-          <w:rFonts w:ascii="Consolas" w:hAnsi="Consolas" w:cs="Courier New"/>
-          <w:color w:val="666600"/>
-          <w:sz w:val="17"/>
-          <w:szCs w:val="17"/>
-        </w:rPr>
-        <w:t>&gt;();</w:t>
+      <w:proofErr w:type="spellEnd"/>
+      <w:proofErr w:type="gramStart"/>
+      <w:r>
+        <w:rPr>
+          <w:rFonts w:ascii="Consolas" w:hAnsi="Consolas" w:cs="Courier New"/>
+          <w:color w:val="666600"/>
+          <w:sz w:val="17"/>
+          <w:szCs w:val="17"/>
+        </w:rPr>
+        <w:t>&gt;(</w:t>
+      </w:r>
+      <w:proofErr w:type="gramEnd"/>
+      <w:r>
+        <w:rPr>
+          <w:rFonts w:ascii="Consolas" w:hAnsi="Consolas" w:cs="Courier New"/>
+          <w:color w:val="666600"/>
+          <w:sz w:val="17"/>
+          <w:szCs w:val="17"/>
+        </w:rPr>
+        <w:t>);</w:t>
       </w:r>
     </w:p>
     <w:p>
@@ -13513,7 +14969,18 @@
           <w:sz w:val="17"/>
           <w:szCs w:val="17"/>
         </w:rPr>
-        <w:t xml:space="preserve"> services</w:t>
+        <w:t xml:space="preserve"> </w:t>
+      </w:r>
+      <w:proofErr w:type="spellStart"/>
+      <w:proofErr w:type="gramStart"/>
+      <w:r>
+        <w:rPr>
+          <w:rFonts w:ascii="Consolas" w:hAnsi="Consolas" w:cs="Courier New"/>
+          <w:color w:val="000000"/>
+          <w:sz w:val="17"/>
+          <w:szCs w:val="17"/>
+        </w:rPr>
+        <w:t>services</w:t>
       </w:r>
       <w:r>
         <w:rPr>
@@ -13533,6 +15000,8 @@
         </w:rPr>
         <w:t>BuildServiceProvider</w:t>
       </w:r>
+      <w:proofErr w:type="spellEnd"/>
+      <w:proofErr w:type="gramEnd"/>
       <w:r>
         <w:rPr>
           <w:rFonts w:ascii="Consolas" w:hAnsi="Consolas" w:cs="Courier New"/>
@@ -13708,7 +15177,27 @@
           <w:sz w:val="17"/>
           <w:szCs w:val="17"/>
         </w:rPr>
-        <w:t xml:space="preserve"> mainMenu </w:t>
+        <w:t xml:space="preserve"> </w:t>
+      </w:r>
+      <w:proofErr w:type="spellStart"/>
+      <w:r>
+        <w:rPr>
+          <w:rFonts w:ascii="Consolas" w:hAnsi="Consolas" w:cs="Courier New"/>
+          <w:color w:val="000000"/>
+          <w:sz w:val="17"/>
+          <w:szCs w:val="17"/>
+        </w:rPr>
+        <w:t>mainMenu</w:t>
+      </w:r>
+      <w:proofErr w:type="spellEnd"/>
+      <w:r>
+        <w:rPr>
+          <w:rFonts w:ascii="Consolas" w:hAnsi="Consolas" w:cs="Courier New"/>
+          <w:color w:val="000000"/>
+          <w:sz w:val="17"/>
+          <w:szCs w:val="17"/>
+        </w:rPr>
+        <w:t xml:space="preserve"> </w:t>
       </w:r>
       <w:r>
         <w:rPr>
@@ -13726,7 +15215,18 @@
           <w:sz w:val="17"/>
           <w:szCs w:val="17"/>
         </w:rPr>
-        <w:t xml:space="preserve"> provider</w:t>
+        <w:t xml:space="preserve"> </w:t>
+      </w:r>
+      <w:proofErr w:type="spellStart"/>
+      <w:proofErr w:type="gramStart"/>
+      <w:r>
+        <w:rPr>
+          <w:rFonts w:ascii="Consolas" w:hAnsi="Consolas" w:cs="Courier New"/>
+          <w:color w:val="000000"/>
+          <w:sz w:val="17"/>
+          <w:szCs w:val="17"/>
+        </w:rPr>
+        <w:t>provider</w:t>
       </w:r>
       <w:r>
         <w:rPr>
@@ -13746,6 +15246,8 @@
         </w:rPr>
         <w:t>GetRequiredService</w:t>
       </w:r>
+      <w:proofErr w:type="spellEnd"/>
+      <w:proofErr w:type="gramEnd"/>
       <w:r>
         <w:rPr>
           <w:rFonts w:ascii="Consolas" w:hAnsi="Consolas" w:cs="Courier New"/>
@@ -13755,6 +15257,7 @@
         </w:rPr>
         <w:t>&lt;</w:t>
       </w:r>
+      <w:proofErr w:type="spellStart"/>
       <w:r>
         <w:rPr>
           <w:rFonts w:ascii="Consolas" w:hAnsi="Consolas" w:cs="Courier New"/>
@@ -13764,14 +15267,26 @@
         </w:rPr>
         <w:t>MainMenu</w:t>
       </w:r>
-      <w:r>
-        <w:rPr>
-          <w:rFonts w:ascii="Consolas" w:hAnsi="Consolas" w:cs="Courier New"/>
-          <w:color w:val="666600"/>
-          <w:sz w:val="17"/>
-          <w:szCs w:val="17"/>
-        </w:rPr>
-        <w:t>&gt;();</w:t>
+      <w:proofErr w:type="spellEnd"/>
+      <w:proofErr w:type="gramStart"/>
+      <w:r>
+        <w:rPr>
+          <w:rFonts w:ascii="Consolas" w:hAnsi="Consolas" w:cs="Courier New"/>
+          <w:color w:val="666600"/>
+          <w:sz w:val="17"/>
+          <w:szCs w:val="17"/>
+        </w:rPr>
+        <w:t>&gt;(</w:t>
+      </w:r>
+      <w:proofErr w:type="gramEnd"/>
+      <w:r>
+        <w:rPr>
+          <w:rFonts w:ascii="Consolas" w:hAnsi="Consolas" w:cs="Courier New"/>
+          <w:color w:val="666600"/>
+          <w:sz w:val="17"/>
+          <w:szCs w:val="17"/>
+        </w:rPr>
+        <w:t>);</w:t>
       </w:r>
     </w:p>
     <w:p>
@@ -13833,7 +15348,17 @@
           <w:sz w:val="17"/>
           <w:szCs w:val="17"/>
         </w:rPr>
-        <w:t xml:space="preserve"> mainMenu</w:t>
+        <w:t xml:space="preserve"> </w:t>
+      </w:r>
+      <w:proofErr w:type="spellStart"/>
+      <w:r>
+        <w:rPr>
+          <w:rFonts w:ascii="Consolas" w:hAnsi="Consolas" w:cs="Courier New"/>
+          <w:color w:val="000000"/>
+          <w:sz w:val="17"/>
+          <w:szCs w:val="17"/>
+        </w:rPr>
+        <w:t>mainMenu</w:t>
       </w:r>
       <w:r>
         <w:rPr>
@@ -13853,6 +15378,7 @@
         </w:rPr>
         <w:t>ShowAsync</w:t>
       </w:r>
+      <w:proofErr w:type="spellEnd"/>
       <w:r>
         <w:rPr>
           <w:rFonts w:ascii="Consolas" w:hAnsi="Consolas" w:cs="Courier New"/>
@@ -15855,6 +17381,7 @@
         </w:rPr>
         <w:t xml:space="preserve">  </w:t>
       </w:r>
+      <w:proofErr w:type="spellStart"/>
       <w:r>
         <w:rPr>
           <w:rFonts w:cs="Arial" w:hint="cs"/>
@@ -15863,6 +17390,7 @@
         </w:rPr>
         <w:t>سقل</w:t>
       </w:r>
+      <w:proofErr w:type="spellEnd"/>
       <w:r>
         <w:rPr>
           <w:rFonts w:cs="Arial"/>
@@ -16263,6 +17791,7 @@
         </w:rPr>
         <w:t xml:space="preserve"> </w:t>
       </w:r>
+      <w:proofErr w:type="spellStart"/>
       <w:r>
         <w:rPr>
           <w:rFonts w:cs="Arial" w:hint="cs"/>
@@ -16271,21 +17800,32 @@
         </w:rPr>
         <w:t>گیت</w:t>
       </w:r>
-      <w:r>
-        <w:rPr>
-          <w:rFonts w:cs="Arial"/>
-          <w:rtl/>
-          <w:lang w:bidi="fa-IR"/>
-        </w:rPr>
-        <w:t xml:space="preserve"> </w:t>
-      </w:r>
-      <w:r>
-        <w:rPr>
-          <w:rFonts w:cs="Arial" w:hint="cs"/>
-          <w:rtl/>
-          <w:lang w:bidi="fa-IR"/>
-        </w:rPr>
-        <w:t>هاب،</w:t>
+      <w:proofErr w:type="spellEnd"/>
+      <w:r>
+        <w:rPr>
+          <w:rFonts w:cs="Arial"/>
+          <w:rtl/>
+          <w:lang w:bidi="fa-IR"/>
+        </w:rPr>
+        <w:t xml:space="preserve"> </w:t>
+      </w:r>
+      <w:proofErr w:type="spellStart"/>
+      <w:r>
+        <w:rPr>
+          <w:rFonts w:cs="Arial" w:hint="cs"/>
+          <w:rtl/>
+          <w:lang w:bidi="fa-IR"/>
+        </w:rPr>
+        <w:t>هاب</w:t>
+      </w:r>
+      <w:proofErr w:type="spellEnd"/>
+      <w:r>
+        <w:rPr>
+          <w:rFonts w:cs="Arial" w:hint="cs"/>
+          <w:rtl/>
+          <w:lang w:bidi="fa-IR"/>
+        </w:rPr>
+        <w:t>،</w:t>
       </w:r>
       <w:r>
         <w:rPr>
@@ -16562,6 +18102,7 @@
         </w:rPr>
         <w:t xml:space="preserve"> </w:t>
       </w:r>
+      <w:proofErr w:type="spellStart"/>
       <w:r>
         <w:rPr>
           <w:rFonts w:cs="Arial" w:hint="cs"/>
@@ -16570,6 +18111,7 @@
         </w:rPr>
         <w:t>ریپازیتوری</w:t>
       </w:r>
+      <w:proofErr w:type="spellEnd"/>
       <w:r>
         <w:rPr>
           <w:rFonts w:cs="Arial"/>
@@ -16770,6 +18312,7 @@
         </w:rPr>
         <w:t xml:space="preserve"> </w:t>
       </w:r>
+      <w:proofErr w:type="spellStart"/>
       <w:r>
         <w:rPr>
           <w:rFonts w:cs="Arial" w:hint="cs"/>
@@ -16778,6 +18321,7 @@
         </w:rPr>
         <w:t>دوی</w:t>
       </w:r>
+      <w:proofErr w:type="spellEnd"/>
       <w:r>
         <w:rPr>
           <w:rFonts w:cs="Arial"/>
@@ -16893,6 +18437,7 @@
         </w:rPr>
         <w:t xml:space="preserve"> </w:t>
       </w:r>
+      <w:proofErr w:type="spellStart"/>
       <w:r>
         <w:rPr>
           <w:rFonts w:cs="Arial" w:hint="cs"/>
@@ -16901,6 +18446,7 @@
         </w:rPr>
         <w:t>ریپازیتوری</w:t>
       </w:r>
+      <w:proofErr w:type="spellEnd"/>
       <w:r>
         <w:rPr>
           <w:rFonts w:cs="Arial"/>
@@ -18013,6 +19559,7 @@
         </w:rPr>
         <w:t xml:space="preserve"> </w:t>
       </w:r>
+      <w:proofErr w:type="spellStart"/>
       <w:r>
         <w:rPr>
           <w:rFonts w:cs="Arial" w:hint="cs"/>
@@ -18021,6 +19568,7 @@
         </w:rPr>
         <w:t>ورژنی</w:t>
       </w:r>
+      <w:proofErr w:type="spellEnd"/>
       <w:r>
         <w:rPr>
           <w:rFonts w:cs="Arial"/>
@@ -18077,6 +19625,7 @@
         </w:rPr>
         <w:t xml:space="preserve">. </w:t>
       </w:r>
+      <w:proofErr w:type="spellStart"/>
       <w:r>
         <w:rPr>
           <w:rFonts w:cs="Arial" w:hint="cs"/>
@@ -18085,6 +19634,7 @@
         </w:rPr>
         <w:t>لطفا</w:t>
       </w:r>
+      <w:proofErr w:type="spellEnd"/>
       <w:r>
         <w:rPr>
           <w:rFonts w:cs="Arial"/>
@@ -18225,7 +19775,15 @@
       </w:r>
     </w:p>
     <w:p>
-      <w:r>
+      <w:pPr>
+        <w:pBdr>
+          <w:bottom w:val="double" w:sz="6" w:space="1" w:color="auto"/>
+        </w:pBdr>
+      </w:pPr>
+      <w:r>
+        <w:rPr>
+          <w:noProof/>
+        </w:rPr>
         <w:drawing>
           <wp:inline distT="0" distB="0" distL="0" distR="0" wp14:anchorId="75AD43C5" wp14:editId="2AC1D931">
             <wp:extent cx="5943600" cy="5457825"/>
@@ -18263,9 +19821,327 @@
         </w:drawing>
       </w:r>
     </w:p>
+    <w:p>
+      <w:pPr>
+        <w:bidi/>
+        <w:rPr>
+          <w:b/>
+          <w:bCs/>
+        </w:rPr>
+      </w:pPr>
+      <w:r>
+        <w:rPr>
+          <w:b/>
+          <w:bCs/>
+          <w:rtl/>
+        </w:rPr>
+        <w:t>یک قاعده‌ی خیلی خوب برای تشخیص</w:t>
+      </w:r>
+      <w:r>
+        <w:rPr>
+          <w:b/>
+          <w:bCs/>
+        </w:rPr>
+        <w:t xml:space="preserve"> Domain Service</w:t>
+      </w:r>
+    </w:p>
+    <w:p>
+      <w:pPr>
+        <w:bidi/>
+      </w:pPr>
+      <w:r>
+        <w:rPr>
+          <w:rtl/>
+        </w:rPr>
+        <w:t>از خودت بپرس</w:t>
+      </w:r>
+      <w:r>
+        <w:t>:</w:t>
+      </w:r>
+    </w:p>
+    <w:p>
+      <w:pPr>
+        <w:bidi/>
+      </w:pPr>
+      <w:r>
+        <w:t>«</w:t>
+      </w:r>
+      <w:r>
+        <w:rPr>
+          <w:rtl/>
+        </w:rPr>
+        <w:t>اگر</w:t>
+      </w:r>
+      <w:r>
+        <w:t xml:space="preserve"> SQL Server</w:t>
+      </w:r>
+      <w:r>
+        <w:rPr>
+          <w:rtl/>
+        </w:rPr>
+        <w:t xml:space="preserve">، </w:t>
+      </w:r>
+      <w:r>
+        <w:t xml:space="preserve">Console </w:t>
+      </w:r>
+      <w:r>
+        <w:rPr>
+          <w:rtl/>
+        </w:rPr>
+        <w:t>و</w:t>
+      </w:r>
+      <w:r>
+        <w:t xml:space="preserve"> ASP.NET </w:t>
+      </w:r>
+      <w:r>
+        <w:rPr>
+          <w:rtl/>
+        </w:rPr>
+        <w:t>را از پروژه حذف کنم، آیا این منطق هنوز یک قانون واقعی</w:t>
+      </w:r>
+      <w:r>
+        <w:t xml:space="preserve"> Library </w:t>
+      </w:r>
+      <w:r>
+        <w:rPr>
+          <w:rtl/>
+        </w:rPr>
+        <w:t>است؟</w:t>
+      </w:r>
+      <w:r>
+        <w:t>»</w:t>
+      </w:r>
+    </w:p>
+    <w:p>
+      <w:pPr>
+        <w:bidi/>
+      </w:pPr>
+      <w:r>
+        <w:rPr>
+          <w:rtl/>
+        </w:rPr>
+        <w:t xml:space="preserve">اگر جواب </w:t>
+      </w:r>
+      <w:r>
+        <w:rPr>
+          <w:b/>
+          <w:bCs/>
+          <w:rtl/>
+        </w:rPr>
+        <w:t>بله</w:t>
+      </w:r>
+      <w:r>
+        <w:rPr>
+          <w:rtl/>
+        </w:rPr>
+        <w:t xml:space="preserve"> باشد، احتمالاً در</w:t>
+      </w:r>
+      <w:r>
+        <w:t xml:space="preserve"> Domain </w:t>
+      </w:r>
+      <w:r>
+        <w:rPr>
+          <w:rtl/>
+        </w:rPr>
+        <w:t>هستیم</w:t>
+      </w:r>
+      <w:r>
+        <w:t>.</w:t>
+      </w:r>
+    </w:p>
+    <w:p>
+      <w:pPr>
+        <w:bidi/>
+      </w:pPr>
+      <w:r>
+        <w:rPr>
+          <w:rtl/>
+        </w:rPr>
+        <w:t>بعد سؤال دوم</w:t>
+      </w:r>
+      <w:r>
+        <w:t>:</w:t>
+      </w:r>
+    </w:p>
+    <w:p>
+      <w:pPr>
+        <w:bidi/>
+      </w:pPr>
+      <w:r>
+        <w:t>«</w:t>
+      </w:r>
+      <w:r>
+        <w:rPr>
+          <w:rtl/>
+        </w:rPr>
+        <w:t>آیا این قانون به شکل طبیعی متعلق به یک</w:t>
+      </w:r>
+      <w:r>
+        <w:t xml:space="preserve"> Entity </w:t>
+      </w:r>
+      <w:r>
+        <w:rPr>
+          <w:rtl/>
+        </w:rPr>
+        <w:t>مشخص است؟</w:t>
+      </w:r>
+      <w:r>
+        <w:t>»</w:t>
+      </w:r>
+    </w:p>
+    <w:p>
+      <w:pPr>
+        <w:bidi/>
+      </w:pPr>
+      <w:r>
+        <w:rPr>
+          <w:rtl/>
+        </w:rPr>
+        <w:t xml:space="preserve">اگر </w:t>
+      </w:r>
+      <w:r>
+        <w:rPr>
+          <w:b/>
+          <w:bCs/>
+          <w:rtl/>
+        </w:rPr>
+        <w:t>بله</w:t>
+      </w:r>
+      <w:r>
+        <w:rPr>
+          <w:rtl/>
+        </w:rPr>
+        <w:t xml:space="preserve"> </w:t>
+      </w:r>
+      <w:r>
+        <w:t xml:space="preserve">→ </w:t>
+      </w:r>
+      <w:r>
+        <w:rPr>
+          <w:rtl/>
+        </w:rPr>
+        <w:t>احتمالاً داخل همان</w:t>
+      </w:r>
+      <w:r>
+        <w:t xml:space="preserve"> Entity.</w:t>
+      </w:r>
+    </w:p>
+    <w:p>
+      <w:pPr>
+        <w:bidi/>
+      </w:pPr>
+      <w:r>
+        <w:rPr>
+          <w:rtl/>
+        </w:rPr>
+        <w:lastRenderedPageBreak/>
+        <w:t xml:space="preserve">اگر </w:t>
+      </w:r>
+      <w:r>
+        <w:rPr>
+          <w:b/>
+          <w:bCs/>
+          <w:rtl/>
+        </w:rPr>
+        <w:t>نه</w:t>
+      </w:r>
+      <w:r>
+        <w:rPr>
+          <w:rtl/>
+        </w:rPr>
+        <w:t xml:space="preserve"> و قانون واقعاً بین چند</w:t>
+      </w:r>
+      <w:r>
+        <w:t xml:space="preserve"> Domain Object </w:t>
+      </w:r>
+      <w:r>
+        <w:rPr>
+          <w:rtl/>
+        </w:rPr>
+        <w:t>قرار دارد</w:t>
+      </w:r>
+      <w:r>
+        <w:t xml:space="preserve"> → </w:t>
+      </w:r>
+      <w:r>
+        <w:rPr>
+          <w:b/>
+          <w:bCs/>
+        </w:rPr>
+        <w:t>Domain Service</w:t>
+      </w:r>
+      <w:r>
+        <w:t xml:space="preserve"> </w:t>
+      </w:r>
+      <w:r>
+        <w:rPr>
+          <w:rtl/>
+        </w:rPr>
+        <w:t>می‌تواند انتخاب مناسبی باشد</w:t>
+      </w:r>
+      <w:r>
+        <w:t>.</w:t>
+      </w:r>
+    </w:p>
+    <w:p/>
+    <w:p>
+      <w:r>
+        <w:rPr>
+          <w:noProof/>
+        </w:rPr>
+        <w:drawing>
+          <wp:inline distT="0" distB="0" distL="0" distR="0" wp14:anchorId="3C3B713D" wp14:editId="2A3260C0">
+            <wp:extent cx="5941060" cy="7595870"/>
+            <wp:effectExtent l="0" t="0" r="2540" b="5080"/>
+            <wp:docPr id="1407116136" name="Picture 1"/>
+            <wp:cNvGraphicFramePr>
+              <a:graphicFrameLocks xmlns:a="http://schemas.openxmlformats.org/drawingml/2006/main" noChangeAspect="1"/>
+            </wp:cNvGraphicFramePr>
+            <a:graphic xmlns:a="http://schemas.openxmlformats.org/drawingml/2006/main">
+              <a:graphicData uri="http://schemas.openxmlformats.org/drawingml/2006/picture">
+                <pic:pic xmlns:pic="http://schemas.openxmlformats.org/drawingml/2006/picture">
+                  <pic:nvPicPr>
+                    <pic:cNvPr id="0" name="Picture 2"/>
+                    <pic:cNvPicPr>
+                      <a:picLocks noChangeAspect="1" noChangeArrowheads="1"/>
+                    </pic:cNvPicPr>
+                  </pic:nvPicPr>
+                  <pic:blipFill>
+                    <a:blip r:embed="rId9">
+                      <a:extLst>
+                        <a:ext uri="{28A0092B-C50C-407E-A947-70E740481C1C}">
+                          <a14:useLocalDpi xmlns:a14="http://schemas.microsoft.com/office/drawing/2010/main" val="0"/>
+                        </a:ext>
+                      </a:extLst>
+                    </a:blip>
+                    <a:srcRect/>
+                    <a:stretch>
+                      <a:fillRect/>
+                    </a:stretch>
+                  </pic:blipFill>
+                  <pic:spPr bwMode="auto">
+                    <a:xfrm>
+                      <a:off x="0" y="0"/>
+                      <a:ext cx="5941060" cy="7595870"/>
+                    </a:xfrm>
+                    <a:prstGeom prst="rect">
+                      <a:avLst/>
+                    </a:prstGeom>
+                    <a:noFill/>
+                    <a:ln>
+                      <a:noFill/>
+                    </a:ln>
+                  </pic:spPr>
+                </pic:pic>
+              </a:graphicData>
+            </a:graphic>
+          </wp:inline>
+        </w:drawing>
+      </w:r>
+    </w:p>
     <w:sectPr>
-      <w:headerReference w:type="default" r:id="rId9"/>
-      <w:footerReference w:type="default" r:id="rId10"/>
+      <w:headerReference w:type="default" r:id="rId10"/>
+      <w:footerReference w:type="default" r:id="rId11"/>
       <w:pgSz w:w="12240" w:h="15840"/>
       <w:pgMar w:top="90" w:right="1440" w:bottom="360" w:left="1440" w:header="720" w:footer="720" w:gutter="0"/>
       <w:cols w:space="720"/>
@@ -21045,7 +22921,6 @@
   <w:style w:type="character" w:default="1" w:styleId="DefaultParagraphFont">
     <w:name w:val="Default Paragraph Font"/>
     <w:uiPriority w:val="1"/>
-    <w:semiHidden/>
     <w:unhideWhenUsed/>
   </w:style>
   <w:style w:type="table" w:default="1" w:styleId="TableNormal">

</xml_diff>

<commit_message>
FIX: Update update method in all services
</commit_message>
<xml_diff>
--- a/Optimization.docx
+++ b/Optimization.docx
@@ -20138,6 +20138,2880 @@
           </wp:inline>
         </w:drawing>
       </w:r>
+    </w:p>
+    <w:p/>
+    <w:p>
+      <w:pPr>
+        <w:jc w:val="center"/>
+        <w:rPr>
+          <w:b/>
+          <w:bCs/>
+          <w:color w:val="EE0000"/>
+          <w:sz w:val="44"/>
+          <w:szCs w:val="44"/>
+        </w:rPr>
+      </w:pPr>
+      <w:r>
+        <w:rPr>
+          <w:b/>
+          <w:bCs/>
+          <w:color w:val="EE0000"/>
+          <w:sz w:val="44"/>
+          <w:szCs w:val="44"/>
+        </w:rPr>
+        <w:lastRenderedPageBreak/>
+        <w:t>Version 1.5.0</w:t>
+      </w:r>
+    </w:p>
+    <w:p>
+      <w:pPr>
+        <w:bidi/>
+        <w:rPr>
+          <w:rtl/>
+          <w:lang w:bidi="fa-IR"/>
+        </w:rPr>
+      </w:pPr>
+    </w:p>
+    <w:p>
+      <w:pPr>
+        <w:bidi/>
+        <w:rPr>
+          <w:rFonts w:hint="cs"/>
+          <w:rtl/>
+          <w:lang w:bidi="fa-IR"/>
+        </w:rPr>
+      </w:pPr>
+      <w:r>
+        <w:rPr>
+          <w:rFonts w:hint="cs"/>
+          <w:rtl/>
+          <w:lang w:bidi="fa-IR"/>
+        </w:rPr>
+        <w:t xml:space="preserve">انتقال </w:t>
+      </w:r>
+      <w:proofErr w:type="spellStart"/>
+      <w:r>
+        <w:rPr>
+          <w:rFonts w:hint="cs"/>
+          <w:rtl/>
+          <w:lang w:bidi="fa-IR"/>
+        </w:rPr>
+        <w:t>منوها</w:t>
+      </w:r>
+      <w:proofErr w:type="spellEnd"/>
+      <w:r>
+        <w:rPr>
+          <w:rFonts w:hint="cs"/>
+          <w:rtl/>
+          <w:lang w:bidi="fa-IR"/>
+        </w:rPr>
+        <w:t xml:space="preserve"> به یک لایه ای و استفاده از تابعی برای چاپ </w:t>
+      </w:r>
+      <w:proofErr w:type="spellStart"/>
+      <w:r>
+        <w:rPr>
+          <w:rFonts w:hint="cs"/>
+          <w:rtl/>
+          <w:lang w:bidi="fa-IR"/>
+        </w:rPr>
+        <w:t>منوها</w:t>
+      </w:r>
+      <w:proofErr w:type="spellEnd"/>
+      <w:r>
+        <w:rPr>
+          <w:rFonts w:hint="cs"/>
+          <w:rtl/>
+          <w:lang w:bidi="fa-IR"/>
+        </w:rPr>
+        <w:t xml:space="preserve"> </w:t>
+      </w:r>
+      <w:r>
+        <w:rPr>
+          <w:rtl/>
+          <w:lang w:bidi="fa-IR"/>
+        </w:rPr>
+        <w:t>–</w:t>
+      </w:r>
+      <w:r>
+        <w:rPr>
+          <w:rFonts w:hint="cs"/>
+          <w:rtl/>
+          <w:lang w:bidi="fa-IR"/>
+        </w:rPr>
+        <w:t xml:space="preserve"> نمونه ای از تابع موردنیاز برای چاپ:</w:t>
+      </w:r>
+    </w:p>
+    <w:p>
+      <w:pPr>
+        <w:pStyle w:val="NormalWeb"/>
+        <w:pBdr>
+          <w:top w:val="single" w:sz="6" w:space="2" w:color="888888"/>
+          <w:left w:val="single" w:sz="6" w:space="2" w:color="888888"/>
+          <w:bottom w:val="single" w:sz="6" w:space="2" w:color="888888"/>
+          <w:right w:val="single" w:sz="6" w:space="2" w:color="888888"/>
+        </w:pBdr>
+        <w:tabs>
+          <w:tab w:val="left" w:pos="916"/>
+          <w:tab w:val="left" w:pos="1832"/>
+          <w:tab w:val="left" w:pos="2748"/>
+          <w:tab w:val="left" w:pos="3664"/>
+          <w:tab w:val="left" w:pos="4580"/>
+          <w:tab w:val="left" w:pos="5496"/>
+          <w:tab w:val="left" w:pos="6412"/>
+          <w:tab w:val="left" w:pos="7328"/>
+          <w:tab w:val="left" w:pos="8244"/>
+          <w:tab w:val="left" w:pos="9160"/>
+          <w:tab w:val="left" w:pos="10076"/>
+          <w:tab w:val="left" w:pos="10992"/>
+          <w:tab w:val="left" w:pos="11908"/>
+          <w:tab w:val="left" w:pos="12824"/>
+          <w:tab w:val="left" w:pos="13740"/>
+          <w:tab w:val="left" w:pos="14656"/>
+        </w:tabs>
+        <w:spacing w:before="0" w:beforeAutospacing="0" w:after="0" w:afterAutospacing="0"/>
+        <w:divId w:val="1680153283"/>
+        <w:rPr>
+          <w:rFonts w:ascii="Consolas" w:hAnsi="Consolas" w:cs="Courier New"/>
+          <w:sz w:val="17"/>
+          <w:szCs w:val="17"/>
+        </w:rPr>
+      </w:pPr>
+      <w:r>
+        <w:rPr>
+          <w:rFonts w:ascii="Consolas" w:hAnsi="Consolas" w:cs="Courier New"/>
+          <w:sz w:val="17"/>
+          <w:szCs w:val="17"/>
+        </w:rPr>
+        <w:t xml:space="preserve"> 1. </w:t>
+      </w:r>
+      <w:r>
+        <w:rPr>
+          <w:rFonts w:ascii="Consolas" w:hAnsi="Consolas" w:cs="Courier New"/>
+          <w:color w:val="000088"/>
+          <w:sz w:val="17"/>
+          <w:szCs w:val="17"/>
+        </w:rPr>
+        <w:t>public</w:t>
+      </w:r>
+      <w:r>
+        <w:rPr>
+          <w:rFonts w:ascii="Consolas" w:hAnsi="Consolas" w:cs="Courier New"/>
+          <w:color w:val="000000"/>
+          <w:sz w:val="17"/>
+          <w:szCs w:val="17"/>
+        </w:rPr>
+        <w:t xml:space="preserve"> </w:t>
+      </w:r>
+      <w:r>
+        <w:rPr>
+          <w:rFonts w:ascii="Consolas" w:hAnsi="Consolas" w:cs="Courier New"/>
+          <w:color w:val="000088"/>
+          <w:sz w:val="17"/>
+          <w:szCs w:val="17"/>
+        </w:rPr>
+        <w:t>static</w:t>
+      </w:r>
+      <w:r>
+        <w:rPr>
+          <w:rFonts w:ascii="Consolas" w:hAnsi="Consolas" w:cs="Courier New"/>
+          <w:color w:val="000000"/>
+          <w:sz w:val="17"/>
+          <w:szCs w:val="17"/>
+        </w:rPr>
+        <w:t xml:space="preserve"> </w:t>
+      </w:r>
+      <w:r>
+        <w:rPr>
+          <w:rFonts w:ascii="Consolas" w:hAnsi="Consolas" w:cs="Courier New"/>
+          <w:color w:val="000088"/>
+          <w:sz w:val="17"/>
+          <w:szCs w:val="17"/>
+        </w:rPr>
+        <w:t>class</w:t>
+      </w:r>
+      <w:r>
+        <w:rPr>
+          <w:rFonts w:ascii="Consolas" w:hAnsi="Consolas" w:cs="Courier New"/>
+          <w:color w:val="000000"/>
+          <w:sz w:val="17"/>
+          <w:szCs w:val="17"/>
+        </w:rPr>
+        <w:t xml:space="preserve"> </w:t>
+      </w:r>
+      <w:proofErr w:type="spellStart"/>
+      <w:r>
+        <w:rPr>
+          <w:rFonts w:ascii="Consolas" w:hAnsi="Consolas" w:cs="Courier New"/>
+          <w:color w:val="660066"/>
+          <w:sz w:val="17"/>
+          <w:szCs w:val="17"/>
+        </w:rPr>
+        <w:t>MenuSelector</w:t>
+      </w:r>
+      <w:proofErr w:type="spellEnd"/>
+    </w:p>
+    <w:p>
+      <w:pPr>
+        <w:pStyle w:val="NormalWeb"/>
+        <w:pBdr>
+          <w:top w:val="single" w:sz="6" w:space="2" w:color="888888"/>
+          <w:left w:val="single" w:sz="6" w:space="2" w:color="888888"/>
+          <w:bottom w:val="single" w:sz="6" w:space="2" w:color="888888"/>
+          <w:right w:val="single" w:sz="6" w:space="2" w:color="888888"/>
+        </w:pBdr>
+        <w:tabs>
+          <w:tab w:val="left" w:pos="916"/>
+          <w:tab w:val="left" w:pos="1832"/>
+          <w:tab w:val="left" w:pos="2748"/>
+          <w:tab w:val="left" w:pos="3664"/>
+          <w:tab w:val="left" w:pos="4580"/>
+          <w:tab w:val="left" w:pos="5496"/>
+          <w:tab w:val="left" w:pos="6412"/>
+          <w:tab w:val="left" w:pos="7328"/>
+          <w:tab w:val="left" w:pos="8244"/>
+          <w:tab w:val="left" w:pos="9160"/>
+          <w:tab w:val="left" w:pos="10076"/>
+          <w:tab w:val="left" w:pos="10992"/>
+          <w:tab w:val="left" w:pos="11908"/>
+          <w:tab w:val="left" w:pos="12824"/>
+          <w:tab w:val="left" w:pos="13740"/>
+          <w:tab w:val="left" w:pos="14656"/>
+        </w:tabs>
+        <w:spacing w:before="0" w:beforeAutospacing="0" w:after="0" w:afterAutospacing="0"/>
+        <w:divId w:val="1680153283"/>
+        <w:rPr>
+          <w:rFonts w:ascii="Consolas" w:hAnsi="Consolas" w:cs="Courier New"/>
+          <w:sz w:val="17"/>
+          <w:szCs w:val="17"/>
+        </w:rPr>
+      </w:pPr>
+      <w:r>
+        <w:rPr>
+          <w:rFonts w:ascii="Consolas" w:hAnsi="Consolas" w:cs="Courier New"/>
+          <w:sz w:val="17"/>
+          <w:szCs w:val="17"/>
+        </w:rPr>
+        <w:t xml:space="preserve"> 2. </w:t>
+      </w:r>
+      <w:r>
+        <w:rPr>
+          <w:rFonts w:ascii="Consolas" w:hAnsi="Consolas" w:cs="Courier New"/>
+          <w:color w:val="666600"/>
+          <w:sz w:val="17"/>
+          <w:szCs w:val="17"/>
+        </w:rPr>
+        <w:t>{</w:t>
+      </w:r>
+    </w:p>
+    <w:p>
+      <w:pPr>
+        <w:pStyle w:val="NormalWeb"/>
+        <w:pBdr>
+          <w:top w:val="single" w:sz="6" w:space="2" w:color="888888"/>
+          <w:left w:val="single" w:sz="6" w:space="2" w:color="888888"/>
+          <w:bottom w:val="single" w:sz="6" w:space="2" w:color="888888"/>
+          <w:right w:val="single" w:sz="6" w:space="2" w:color="888888"/>
+        </w:pBdr>
+        <w:tabs>
+          <w:tab w:val="left" w:pos="916"/>
+          <w:tab w:val="left" w:pos="1832"/>
+          <w:tab w:val="left" w:pos="2748"/>
+          <w:tab w:val="left" w:pos="3664"/>
+          <w:tab w:val="left" w:pos="4580"/>
+          <w:tab w:val="left" w:pos="5496"/>
+          <w:tab w:val="left" w:pos="6412"/>
+          <w:tab w:val="left" w:pos="7328"/>
+          <w:tab w:val="left" w:pos="8244"/>
+          <w:tab w:val="left" w:pos="9160"/>
+          <w:tab w:val="left" w:pos="10076"/>
+          <w:tab w:val="left" w:pos="10992"/>
+          <w:tab w:val="left" w:pos="11908"/>
+          <w:tab w:val="left" w:pos="12824"/>
+          <w:tab w:val="left" w:pos="13740"/>
+          <w:tab w:val="left" w:pos="14656"/>
+        </w:tabs>
+        <w:spacing w:before="0" w:beforeAutospacing="0" w:after="0" w:afterAutospacing="0"/>
+        <w:divId w:val="1680153283"/>
+        <w:rPr>
+          <w:rFonts w:ascii="Consolas" w:hAnsi="Consolas" w:cs="Courier New"/>
+          <w:sz w:val="17"/>
+          <w:szCs w:val="17"/>
+        </w:rPr>
+      </w:pPr>
+      <w:r>
+        <w:rPr>
+          <w:rFonts w:ascii="Consolas" w:hAnsi="Consolas" w:cs="Courier New"/>
+          <w:sz w:val="17"/>
+          <w:szCs w:val="17"/>
+        </w:rPr>
+        <w:t xml:space="preserve"> 3. </w:t>
+      </w:r>
+      <w:r>
+        <w:rPr>
+          <w:rFonts w:ascii="Consolas" w:hAnsi="Consolas" w:cs="Courier New"/>
+          <w:color w:val="000000"/>
+          <w:sz w:val="17"/>
+          <w:szCs w:val="17"/>
+        </w:rPr>
+        <w:t xml:space="preserve">    </w:t>
+      </w:r>
+      <w:r>
+        <w:rPr>
+          <w:rFonts w:ascii="Consolas" w:hAnsi="Consolas" w:cs="Courier New"/>
+          <w:color w:val="000088"/>
+          <w:sz w:val="17"/>
+          <w:szCs w:val="17"/>
+        </w:rPr>
+        <w:t>public</w:t>
+      </w:r>
+      <w:r>
+        <w:rPr>
+          <w:rFonts w:ascii="Consolas" w:hAnsi="Consolas" w:cs="Courier New"/>
+          <w:color w:val="000000"/>
+          <w:sz w:val="17"/>
+          <w:szCs w:val="17"/>
+        </w:rPr>
+        <w:t xml:space="preserve"> </w:t>
+      </w:r>
+      <w:r>
+        <w:rPr>
+          <w:rFonts w:ascii="Consolas" w:hAnsi="Consolas" w:cs="Courier New"/>
+          <w:color w:val="000088"/>
+          <w:sz w:val="17"/>
+          <w:szCs w:val="17"/>
+        </w:rPr>
+        <w:t>static</w:t>
+      </w:r>
+      <w:r>
+        <w:rPr>
+          <w:rFonts w:ascii="Consolas" w:hAnsi="Consolas" w:cs="Courier New"/>
+          <w:color w:val="000000"/>
+          <w:sz w:val="17"/>
+          <w:szCs w:val="17"/>
+        </w:rPr>
+        <w:t xml:space="preserve"> T</w:t>
+      </w:r>
+      <w:r>
+        <w:rPr>
+          <w:rFonts w:ascii="Consolas" w:hAnsi="Consolas" w:cs="Courier New"/>
+          <w:color w:val="666600"/>
+          <w:sz w:val="17"/>
+          <w:szCs w:val="17"/>
+        </w:rPr>
+        <w:t>?</w:t>
+      </w:r>
+      <w:r>
+        <w:rPr>
+          <w:rFonts w:ascii="Consolas" w:hAnsi="Consolas" w:cs="Courier New"/>
+          <w:color w:val="000000"/>
+          <w:sz w:val="17"/>
+          <w:szCs w:val="17"/>
+        </w:rPr>
+        <w:t xml:space="preserve"> </w:t>
+      </w:r>
+      <w:proofErr w:type="spellStart"/>
+      <w:r>
+        <w:rPr>
+          <w:rFonts w:ascii="Consolas" w:hAnsi="Consolas" w:cs="Courier New"/>
+          <w:color w:val="660066"/>
+          <w:sz w:val="17"/>
+          <w:szCs w:val="17"/>
+        </w:rPr>
+        <w:t>SelectOne</w:t>
+      </w:r>
+      <w:proofErr w:type="spellEnd"/>
+      <w:r>
+        <w:rPr>
+          <w:rFonts w:ascii="Consolas" w:hAnsi="Consolas" w:cs="Courier New"/>
+          <w:color w:val="666600"/>
+          <w:sz w:val="17"/>
+          <w:szCs w:val="17"/>
+        </w:rPr>
+        <w:t>&lt;</w:t>
+      </w:r>
+      <w:r>
+        <w:rPr>
+          <w:rFonts w:ascii="Consolas" w:hAnsi="Consolas" w:cs="Courier New"/>
+          <w:color w:val="000000"/>
+          <w:sz w:val="17"/>
+          <w:szCs w:val="17"/>
+        </w:rPr>
+        <w:t>T</w:t>
+      </w:r>
+      <w:proofErr w:type="gramStart"/>
+      <w:r>
+        <w:rPr>
+          <w:rFonts w:ascii="Consolas" w:hAnsi="Consolas" w:cs="Courier New"/>
+          <w:color w:val="666600"/>
+          <w:sz w:val="17"/>
+          <w:szCs w:val="17"/>
+        </w:rPr>
+        <w:t>&gt;(</w:t>
+      </w:r>
+      <w:proofErr w:type="gramEnd"/>
+    </w:p>
+    <w:p>
+      <w:pPr>
+        <w:pStyle w:val="NormalWeb"/>
+        <w:pBdr>
+          <w:top w:val="single" w:sz="6" w:space="2" w:color="888888"/>
+          <w:left w:val="single" w:sz="6" w:space="2" w:color="888888"/>
+          <w:bottom w:val="single" w:sz="6" w:space="2" w:color="888888"/>
+          <w:right w:val="single" w:sz="6" w:space="2" w:color="888888"/>
+        </w:pBdr>
+        <w:tabs>
+          <w:tab w:val="left" w:pos="916"/>
+          <w:tab w:val="left" w:pos="1832"/>
+          <w:tab w:val="left" w:pos="2748"/>
+          <w:tab w:val="left" w:pos="3664"/>
+          <w:tab w:val="left" w:pos="4580"/>
+          <w:tab w:val="left" w:pos="5496"/>
+          <w:tab w:val="left" w:pos="6412"/>
+          <w:tab w:val="left" w:pos="7328"/>
+          <w:tab w:val="left" w:pos="8244"/>
+          <w:tab w:val="left" w:pos="9160"/>
+          <w:tab w:val="left" w:pos="10076"/>
+          <w:tab w:val="left" w:pos="10992"/>
+          <w:tab w:val="left" w:pos="11908"/>
+          <w:tab w:val="left" w:pos="12824"/>
+          <w:tab w:val="left" w:pos="13740"/>
+          <w:tab w:val="left" w:pos="14656"/>
+        </w:tabs>
+        <w:spacing w:before="0" w:beforeAutospacing="0" w:after="0" w:afterAutospacing="0"/>
+        <w:divId w:val="1680153283"/>
+        <w:rPr>
+          <w:rFonts w:ascii="Consolas" w:hAnsi="Consolas" w:cs="Courier New"/>
+          <w:sz w:val="17"/>
+          <w:szCs w:val="17"/>
+        </w:rPr>
+      </w:pPr>
+      <w:r>
+        <w:rPr>
+          <w:rFonts w:ascii="Consolas" w:hAnsi="Consolas" w:cs="Courier New"/>
+          <w:sz w:val="17"/>
+          <w:szCs w:val="17"/>
+        </w:rPr>
+        <w:t xml:space="preserve"> 4. </w:t>
+      </w:r>
+      <w:r>
+        <w:rPr>
+          <w:rFonts w:ascii="Consolas" w:hAnsi="Consolas" w:cs="Courier New"/>
+          <w:color w:val="000000"/>
+          <w:sz w:val="17"/>
+          <w:szCs w:val="17"/>
+        </w:rPr>
+        <w:t xml:space="preserve">        </w:t>
+      </w:r>
+      <w:proofErr w:type="spellStart"/>
+      <w:r>
+        <w:rPr>
+          <w:rFonts w:ascii="Consolas" w:hAnsi="Consolas" w:cs="Courier New"/>
+          <w:color w:val="660066"/>
+          <w:sz w:val="17"/>
+          <w:szCs w:val="17"/>
+        </w:rPr>
+        <w:t>IReadOnlyList</w:t>
+      </w:r>
+      <w:proofErr w:type="spellEnd"/>
+      <w:r>
+        <w:rPr>
+          <w:rFonts w:ascii="Consolas" w:hAnsi="Consolas" w:cs="Courier New"/>
+          <w:color w:val="666600"/>
+          <w:sz w:val="17"/>
+          <w:szCs w:val="17"/>
+        </w:rPr>
+        <w:t>&lt;</w:t>
+      </w:r>
+      <w:r>
+        <w:rPr>
+          <w:rFonts w:ascii="Consolas" w:hAnsi="Consolas" w:cs="Courier New"/>
+          <w:color w:val="000000"/>
+          <w:sz w:val="17"/>
+          <w:szCs w:val="17"/>
+        </w:rPr>
+        <w:t>T</w:t>
+      </w:r>
+      <w:r>
+        <w:rPr>
+          <w:rFonts w:ascii="Consolas" w:hAnsi="Consolas" w:cs="Courier New"/>
+          <w:color w:val="666600"/>
+          <w:sz w:val="17"/>
+          <w:szCs w:val="17"/>
+        </w:rPr>
+        <w:t>&gt;</w:t>
+      </w:r>
+      <w:r>
+        <w:rPr>
+          <w:rFonts w:ascii="Consolas" w:hAnsi="Consolas" w:cs="Courier New"/>
+          <w:color w:val="000000"/>
+          <w:sz w:val="17"/>
+          <w:szCs w:val="17"/>
+        </w:rPr>
+        <w:t xml:space="preserve"> items</w:t>
+      </w:r>
+      <w:r>
+        <w:rPr>
+          <w:rFonts w:ascii="Consolas" w:hAnsi="Consolas" w:cs="Courier New"/>
+          <w:color w:val="666600"/>
+          <w:sz w:val="17"/>
+          <w:szCs w:val="17"/>
+        </w:rPr>
+        <w:t>,</w:t>
+      </w:r>
+    </w:p>
+    <w:p>
+      <w:pPr>
+        <w:pStyle w:val="NormalWeb"/>
+        <w:pBdr>
+          <w:top w:val="single" w:sz="6" w:space="2" w:color="888888"/>
+          <w:left w:val="single" w:sz="6" w:space="2" w:color="888888"/>
+          <w:bottom w:val="single" w:sz="6" w:space="2" w:color="888888"/>
+          <w:right w:val="single" w:sz="6" w:space="2" w:color="888888"/>
+        </w:pBdr>
+        <w:tabs>
+          <w:tab w:val="left" w:pos="916"/>
+          <w:tab w:val="left" w:pos="1832"/>
+          <w:tab w:val="left" w:pos="2748"/>
+          <w:tab w:val="left" w:pos="3664"/>
+          <w:tab w:val="left" w:pos="4580"/>
+          <w:tab w:val="left" w:pos="5496"/>
+          <w:tab w:val="left" w:pos="6412"/>
+          <w:tab w:val="left" w:pos="7328"/>
+          <w:tab w:val="left" w:pos="8244"/>
+          <w:tab w:val="left" w:pos="9160"/>
+          <w:tab w:val="left" w:pos="10076"/>
+          <w:tab w:val="left" w:pos="10992"/>
+          <w:tab w:val="left" w:pos="11908"/>
+          <w:tab w:val="left" w:pos="12824"/>
+          <w:tab w:val="left" w:pos="13740"/>
+          <w:tab w:val="left" w:pos="14656"/>
+        </w:tabs>
+        <w:spacing w:before="0" w:beforeAutospacing="0" w:after="0" w:afterAutospacing="0"/>
+        <w:divId w:val="1680153283"/>
+        <w:rPr>
+          <w:rFonts w:ascii="Consolas" w:hAnsi="Consolas" w:cs="Courier New"/>
+          <w:sz w:val="17"/>
+          <w:szCs w:val="17"/>
+        </w:rPr>
+      </w:pPr>
+      <w:r>
+        <w:rPr>
+          <w:rFonts w:ascii="Consolas" w:hAnsi="Consolas" w:cs="Courier New"/>
+          <w:sz w:val="17"/>
+          <w:szCs w:val="17"/>
+        </w:rPr>
+        <w:t xml:space="preserve"> 5. </w:t>
+      </w:r>
+      <w:r>
+        <w:rPr>
+          <w:rFonts w:ascii="Consolas" w:hAnsi="Consolas" w:cs="Courier New"/>
+          <w:color w:val="000000"/>
+          <w:sz w:val="17"/>
+          <w:szCs w:val="17"/>
+        </w:rPr>
+        <w:t xml:space="preserve">        </w:t>
+      </w:r>
+      <w:r>
+        <w:rPr>
+          <w:rFonts w:ascii="Consolas" w:hAnsi="Consolas" w:cs="Courier New"/>
+          <w:color w:val="660066"/>
+          <w:sz w:val="17"/>
+          <w:szCs w:val="17"/>
+        </w:rPr>
+        <w:t>Func</w:t>
+      </w:r>
+      <w:r>
+        <w:rPr>
+          <w:rFonts w:ascii="Consolas" w:hAnsi="Consolas" w:cs="Courier New"/>
+          <w:color w:val="666600"/>
+          <w:sz w:val="17"/>
+          <w:szCs w:val="17"/>
+        </w:rPr>
+        <w:t>&lt;</w:t>
+      </w:r>
+      <w:r>
+        <w:rPr>
+          <w:rFonts w:ascii="Consolas" w:hAnsi="Consolas" w:cs="Courier New"/>
+          <w:color w:val="000000"/>
+          <w:sz w:val="17"/>
+          <w:szCs w:val="17"/>
+        </w:rPr>
+        <w:t>T</w:t>
+      </w:r>
+      <w:r>
+        <w:rPr>
+          <w:rFonts w:ascii="Consolas" w:hAnsi="Consolas" w:cs="Courier New"/>
+          <w:color w:val="666600"/>
+          <w:sz w:val="17"/>
+          <w:szCs w:val="17"/>
+        </w:rPr>
+        <w:t>,</w:t>
+      </w:r>
+      <w:r>
+        <w:rPr>
+          <w:rFonts w:ascii="Consolas" w:hAnsi="Consolas" w:cs="Courier New"/>
+          <w:color w:val="000000"/>
+          <w:sz w:val="17"/>
+          <w:szCs w:val="17"/>
+        </w:rPr>
+        <w:t xml:space="preserve"> </w:t>
+      </w:r>
+      <w:r>
+        <w:rPr>
+          <w:rFonts w:ascii="Consolas" w:hAnsi="Consolas" w:cs="Courier New"/>
+          <w:color w:val="000088"/>
+          <w:sz w:val="17"/>
+          <w:szCs w:val="17"/>
+        </w:rPr>
+        <w:t>string</w:t>
+      </w:r>
+      <w:r>
+        <w:rPr>
+          <w:rFonts w:ascii="Consolas" w:hAnsi="Consolas" w:cs="Courier New"/>
+          <w:color w:val="666600"/>
+          <w:sz w:val="17"/>
+          <w:szCs w:val="17"/>
+        </w:rPr>
+        <w:t>&gt;</w:t>
+      </w:r>
+      <w:r>
+        <w:rPr>
+          <w:rFonts w:ascii="Consolas" w:hAnsi="Consolas" w:cs="Courier New"/>
+          <w:color w:val="000000"/>
+          <w:sz w:val="17"/>
+          <w:szCs w:val="17"/>
+        </w:rPr>
+        <w:t xml:space="preserve"> display</w:t>
+      </w:r>
+      <w:r>
+        <w:rPr>
+          <w:rFonts w:ascii="Consolas" w:hAnsi="Consolas" w:cs="Courier New"/>
+          <w:color w:val="666600"/>
+          <w:sz w:val="17"/>
+          <w:szCs w:val="17"/>
+        </w:rPr>
+        <w:t>,</w:t>
+      </w:r>
+    </w:p>
+    <w:p>
+      <w:pPr>
+        <w:pStyle w:val="NormalWeb"/>
+        <w:pBdr>
+          <w:top w:val="single" w:sz="6" w:space="2" w:color="888888"/>
+          <w:left w:val="single" w:sz="6" w:space="2" w:color="888888"/>
+          <w:bottom w:val="single" w:sz="6" w:space="2" w:color="888888"/>
+          <w:right w:val="single" w:sz="6" w:space="2" w:color="888888"/>
+        </w:pBdr>
+        <w:tabs>
+          <w:tab w:val="left" w:pos="916"/>
+          <w:tab w:val="left" w:pos="1832"/>
+          <w:tab w:val="left" w:pos="2748"/>
+          <w:tab w:val="left" w:pos="3664"/>
+          <w:tab w:val="left" w:pos="4580"/>
+          <w:tab w:val="left" w:pos="5496"/>
+          <w:tab w:val="left" w:pos="6412"/>
+          <w:tab w:val="left" w:pos="7328"/>
+          <w:tab w:val="left" w:pos="8244"/>
+          <w:tab w:val="left" w:pos="9160"/>
+          <w:tab w:val="left" w:pos="10076"/>
+          <w:tab w:val="left" w:pos="10992"/>
+          <w:tab w:val="left" w:pos="11908"/>
+          <w:tab w:val="left" w:pos="12824"/>
+          <w:tab w:val="left" w:pos="13740"/>
+          <w:tab w:val="left" w:pos="14656"/>
+        </w:tabs>
+        <w:spacing w:before="0" w:beforeAutospacing="0" w:after="0" w:afterAutospacing="0"/>
+        <w:divId w:val="1680153283"/>
+        <w:rPr>
+          <w:rFonts w:ascii="Consolas" w:hAnsi="Consolas" w:cs="Courier New"/>
+          <w:sz w:val="17"/>
+          <w:szCs w:val="17"/>
+        </w:rPr>
+      </w:pPr>
+      <w:r>
+        <w:rPr>
+          <w:rFonts w:ascii="Consolas" w:hAnsi="Consolas" w:cs="Courier New"/>
+          <w:sz w:val="17"/>
+          <w:szCs w:val="17"/>
+        </w:rPr>
+        <w:t xml:space="preserve"> 6. </w:t>
+      </w:r>
+      <w:r>
+        <w:rPr>
+          <w:rFonts w:ascii="Consolas" w:hAnsi="Consolas" w:cs="Courier New"/>
+          <w:color w:val="000000"/>
+          <w:sz w:val="17"/>
+          <w:szCs w:val="17"/>
+        </w:rPr>
+        <w:t xml:space="preserve">        </w:t>
+      </w:r>
+      <w:r>
+        <w:rPr>
+          <w:rFonts w:ascii="Consolas" w:hAnsi="Consolas" w:cs="Courier New"/>
+          <w:color w:val="000088"/>
+          <w:sz w:val="17"/>
+          <w:szCs w:val="17"/>
+        </w:rPr>
+        <w:t>string</w:t>
+      </w:r>
+      <w:r>
+        <w:rPr>
+          <w:rFonts w:ascii="Consolas" w:hAnsi="Consolas" w:cs="Courier New"/>
+          <w:color w:val="000000"/>
+          <w:sz w:val="17"/>
+          <w:szCs w:val="17"/>
+        </w:rPr>
+        <w:t xml:space="preserve"> title</w:t>
+      </w:r>
+      <w:r>
+        <w:rPr>
+          <w:rFonts w:ascii="Consolas" w:hAnsi="Consolas" w:cs="Courier New"/>
+          <w:color w:val="666600"/>
+          <w:sz w:val="17"/>
+          <w:szCs w:val="17"/>
+        </w:rPr>
+        <w:t>,</w:t>
+      </w:r>
+    </w:p>
+    <w:p>
+      <w:pPr>
+        <w:pStyle w:val="NormalWeb"/>
+        <w:pBdr>
+          <w:top w:val="single" w:sz="6" w:space="2" w:color="888888"/>
+          <w:left w:val="single" w:sz="6" w:space="2" w:color="888888"/>
+          <w:bottom w:val="single" w:sz="6" w:space="2" w:color="888888"/>
+          <w:right w:val="single" w:sz="6" w:space="2" w:color="888888"/>
+        </w:pBdr>
+        <w:tabs>
+          <w:tab w:val="left" w:pos="916"/>
+          <w:tab w:val="left" w:pos="1832"/>
+          <w:tab w:val="left" w:pos="2748"/>
+          <w:tab w:val="left" w:pos="3664"/>
+          <w:tab w:val="left" w:pos="4580"/>
+          <w:tab w:val="left" w:pos="5496"/>
+          <w:tab w:val="left" w:pos="6412"/>
+          <w:tab w:val="left" w:pos="7328"/>
+          <w:tab w:val="left" w:pos="8244"/>
+          <w:tab w:val="left" w:pos="9160"/>
+          <w:tab w:val="left" w:pos="10076"/>
+          <w:tab w:val="left" w:pos="10992"/>
+          <w:tab w:val="left" w:pos="11908"/>
+          <w:tab w:val="left" w:pos="12824"/>
+          <w:tab w:val="left" w:pos="13740"/>
+          <w:tab w:val="left" w:pos="14656"/>
+        </w:tabs>
+        <w:spacing w:before="0" w:beforeAutospacing="0" w:after="0" w:afterAutospacing="0"/>
+        <w:divId w:val="1680153283"/>
+        <w:rPr>
+          <w:rFonts w:ascii="Consolas" w:hAnsi="Consolas" w:cs="Courier New"/>
+          <w:sz w:val="17"/>
+          <w:szCs w:val="17"/>
+        </w:rPr>
+      </w:pPr>
+      <w:r>
+        <w:rPr>
+          <w:rFonts w:ascii="Consolas" w:hAnsi="Consolas" w:cs="Courier New"/>
+          <w:sz w:val="17"/>
+          <w:szCs w:val="17"/>
+        </w:rPr>
+        <w:t xml:space="preserve"> 7. </w:t>
+      </w:r>
+      <w:r>
+        <w:rPr>
+          <w:rFonts w:ascii="Consolas" w:hAnsi="Consolas" w:cs="Courier New"/>
+          <w:color w:val="000000"/>
+          <w:sz w:val="17"/>
+          <w:szCs w:val="17"/>
+        </w:rPr>
+        <w:t xml:space="preserve">        </w:t>
+      </w:r>
+      <w:r>
+        <w:rPr>
+          <w:rFonts w:ascii="Consolas" w:hAnsi="Consolas" w:cs="Courier New"/>
+          <w:color w:val="000088"/>
+          <w:sz w:val="17"/>
+          <w:szCs w:val="17"/>
+        </w:rPr>
+        <w:t>bool</w:t>
+      </w:r>
+      <w:r>
+        <w:rPr>
+          <w:rFonts w:ascii="Consolas" w:hAnsi="Consolas" w:cs="Courier New"/>
+          <w:color w:val="000000"/>
+          <w:sz w:val="17"/>
+          <w:szCs w:val="17"/>
+        </w:rPr>
+        <w:t xml:space="preserve"> </w:t>
+      </w:r>
+      <w:proofErr w:type="spellStart"/>
+      <w:r>
+        <w:rPr>
+          <w:rFonts w:ascii="Consolas" w:hAnsi="Consolas" w:cs="Courier New"/>
+          <w:color w:val="000000"/>
+          <w:sz w:val="17"/>
+          <w:szCs w:val="17"/>
+        </w:rPr>
+        <w:t>allowNew</w:t>
+      </w:r>
+      <w:proofErr w:type="spellEnd"/>
+      <w:r>
+        <w:rPr>
+          <w:rFonts w:ascii="Consolas" w:hAnsi="Consolas" w:cs="Courier New"/>
+          <w:color w:val="000000"/>
+          <w:sz w:val="17"/>
+          <w:szCs w:val="17"/>
+        </w:rPr>
+        <w:t xml:space="preserve"> </w:t>
+      </w:r>
+      <w:r>
+        <w:rPr>
+          <w:rFonts w:ascii="Consolas" w:hAnsi="Consolas" w:cs="Courier New"/>
+          <w:color w:val="666600"/>
+          <w:sz w:val="17"/>
+          <w:szCs w:val="17"/>
+        </w:rPr>
+        <w:t>=</w:t>
+      </w:r>
+      <w:r>
+        <w:rPr>
+          <w:rFonts w:ascii="Consolas" w:hAnsi="Consolas" w:cs="Courier New"/>
+          <w:color w:val="000000"/>
+          <w:sz w:val="17"/>
+          <w:szCs w:val="17"/>
+        </w:rPr>
+        <w:t xml:space="preserve"> </w:t>
+      </w:r>
+      <w:r>
+        <w:rPr>
+          <w:rFonts w:ascii="Consolas" w:hAnsi="Consolas" w:cs="Courier New"/>
+          <w:color w:val="000088"/>
+          <w:sz w:val="17"/>
+          <w:szCs w:val="17"/>
+        </w:rPr>
+        <w:t>false</w:t>
+      </w:r>
+      <w:r>
+        <w:rPr>
+          <w:rFonts w:ascii="Consolas" w:hAnsi="Consolas" w:cs="Courier New"/>
+          <w:color w:val="666600"/>
+          <w:sz w:val="17"/>
+          <w:szCs w:val="17"/>
+        </w:rPr>
+        <w:t>)</w:t>
+      </w:r>
+    </w:p>
+    <w:p>
+      <w:pPr>
+        <w:pStyle w:val="NormalWeb"/>
+        <w:pBdr>
+          <w:top w:val="single" w:sz="6" w:space="2" w:color="888888"/>
+          <w:left w:val="single" w:sz="6" w:space="2" w:color="888888"/>
+          <w:bottom w:val="single" w:sz="6" w:space="2" w:color="888888"/>
+          <w:right w:val="single" w:sz="6" w:space="2" w:color="888888"/>
+        </w:pBdr>
+        <w:tabs>
+          <w:tab w:val="left" w:pos="916"/>
+          <w:tab w:val="left" w:pos="1832"/>
+          <w:tab w:val="left" w:pos="2748"/>
+          <w:tab w:val="left" w:pos="3664"/>
+          <w:tab w:val="left" w:pos="4580"/>
+          <w:tab w:val="left" w:pos="5496"/>
+          <w:tab w:val="left" w:pos="6412"/>
+          <w:tab w:val="left" w:pos="7328"/>
+          <w:tab w:val="left" w:pos="8244"/>
+          <w:tab w:val="left" w:pos="9160"/>
+          <w:tab w:val="left" w:pos="10076"/>
+          <w:tab w:val="left" w:pos="10992"/>
+          <w:tab w:val="left" w:pos="11908"/>
+          <w:tab w:val="left" w:pos="12824"/>
+          <w:tab w:val="left" w:pos="13740"/>
+          <w:tab w:val="left" w:pos="14656"/>
+        </w:tabs>
+        <w:spacing w:before="0" w:beforeAutospacing="0" w:after="0" w:afterAutospacing="0"/>
+        <w:divId w:val="1680153283"/>
+        <w:rPr>
+          <w:rFonts w:ascii="Consolas" w:hAnsi="Consolas" w:cs="Courier New"/>
+          <w:sz w:val="17"/>
+          <w:szCs w:val="17"/>
+        </w:rPr>
+      </w:pPr>
+      <w:r>
+        <w:rPr>
+          <w:rFonts w:ascii="Consolas" w:hAnsi="Consolas" w:cs="Courier New"/>
+          <w:sz w:val="17"/>
+          <w:szCs w:val="17"/>
+        </w:rPr>
+        <w:t xml:space="preserve"> 8. </w:t>
+      </w:r>
+      <w:r>
+        <w:rPr>
+          <w:rFonts w:ascii="Consolas" w:hAnsi="Consolas" w:cs="Courier New"/>
+          <w:color w:val="000000"/>
+          <w:sz w:val="17"/>
+          <w:szCs w:val="17"/>
+        </w:rPr>
+        <w:t xml:space="preserve"> </w:t>
+      </w:r>
+      <w:proofErr w:type="gramStart"/>
+      <w:r>
+        <w:rPr>
+          <w:rFonts w:ascii="Consolas" w:hAnsi="Consolas" w:cs="Courier New"/>
+          <w:color w:val="000000"/>
+          <w:sz w:val="17"/>
+          <w:szCs w:val="17"/>
+        </w:rPr>
+        <w:t xml:space="preserve">   </w:t>
+      </w:r>
+      <w:r>
+        <w:rPr>
+          <w:rFonts w:ascii="Consolas" w:hAnsi="Consolas" w:cs="Courier New"/>
+          <w:color w:val="666600"/>
+          <w:sz w:val="17"/>
+          <w:szCs w:val="17"/>
+        </w:rPr>
+        <w:t>{</w:t>
+      </w:r>
+      <w:proofErr w:type="gramEnd"/>
+    </w:p>
+    <w:p>
+      <w:pPr>
+        <w:pStyle w:val="NormalWeb"/>
+        <w:pBdr>
+          <w:top w:val="single" w:sz="6" w:space="2" w:color="888888"/>
+          <w:left w:val="single" w:sz="6" w:space="2" w:color="888888"/>
+          <w:bottom w:val="single" w:sz="6" w:space="2" w:color="888888"/>
+          <w:right w:val="single" w:sz="6" w:space="2" w:color="888888"/>
+        </w:pBdr>
+        <w:tabs>
+          <w:tab w:val="left" w:pos="916"/>
+          <w:tab w:val="left" w:pos="1832"/>
+          <w:tab w:val="left" w:pos="2748"/>
+          <w:tab w:val="left" w:pos="3664"/>
+          <w:tab w:val="left" w:pos="4580"/>
+          <w:tab w:val="left" w:pos="5496"/>
+          <w:tab w:val="left" w:pos="6412"/>
+          <w:tab w:val="left" w:pos="7328"/>
+          <w:tab w:val="left" w:pos="8244"/>
+          <w:tab w:val="left" w:pos="9160"/>
+          <w:tab w:val="left" w:pos="10076"/>
+          <w:tab w:val="left" w:pos="10992"/>
+          <w:tab w:val="left" w:pos="11908"/>
+          <w:tab w:val="left" w:pos="12824"/>
+          <w:tab w:val="left" w:pos="13740"/>
+          <w:tab w:val="left" w:pos="14656"/>
+        </w:tabs>
+        <w:spacing w:before="0" w:beforeAutospacing="0" w:after="0" w:afterAutospacing="0"/>
+        <w:divId w:val="1680153283"/>
+        <w:rPr>
+          <w:rFonts w:ascii="Consolas" w:hAnsi="Consolas" w:cs="Courier New"/>
+          <w:sz w:val="17"/>
+          <w:szCs w:val="17"/>
+        </w:rPr>
+      </w:pPr>
+      <w:r>
+        <w:rPr>
+          <w:rFonts w:ascii="Consolas" w:hAnsi="Consolas" w:cs="Courier New"/>
+          <w:sz w:val="17"/>
+          <w:szCs w:val="17"/>
+        </w:rPr>
+        <w:t xml:space="preserve"> 9. </w:t>
+      </w:r>
+      <w:r>
+        <w:rPr>
+          <w:rFonts w:ascii="Consolas" w:hAnsi="Consolas" w:cs="Courier New"/>
+          <w:color w:val="000000"/>
+          <w:sz w:val="17"/>
+          <w:szCs w:val="17"/>
+        </w:rPr>
+        <w:t xml:space="preserve">        </w:t>
+      </w:r>
+      <w:proofErr w:type="spellStart"/>
+      <w:r>
+        <w:rPr>
+          <w:rFonts w:ascii="Consolas" w:hAnsi="Consolas" w:cs="Courier New"/>
+          <w:color w:val="660066"/>
+          <w:sz w:val="17"/>
+          <w:szCs w:val="17"/>
+        </w:rPr>
+        <w:t>Console</w:t>
+      </w:r>
+      <w:r>
+        <w:rPr>
+          <w:rFonts w:ascii="Consolas" w:hAnsi="Consolas" w:cs="Courier New"/>
+          <w:color w:val="666600"/>
+          <w:sz w:val="17"/>
+          <w:szCs w:val="17"/>
+        </w:rPr>
+        <w:t>.</w:t>
+      </w:r>
+      <w:r>
+        <w:rPr>
+          <w:rFonts w:ascii="Consolas" w:hAnsi="Consolas" w:cs="Courier New"/>
+          <w:color w:val="660066"/>
+          <w:sz w:val="17"/>
+          <w:szCs w:val="17"/>
+        </w:rPr>
+        <w:t>WriteLine</w:t>
+      </w:r>
+      <w:proofErr w:type="spellEnd"/>
+      <w:r>
+        <w:rPr>
+          <w:rFonts w:ascii="Consolas" w:hAnsi="Consolas" w:cs="Courier New"/>
+          <w:color w:val="666600"/>
+          <w:sz w:val="17"/>
+          <w:szCs w:val="17"/>
+        </w:rPr>
+        <w:t>(</w:t>
+      </w:r>
+      <w:r>
+        <w:rPr>
+          <w:rFonts w:ascii="Consolas" w:hAnsi="Consolas" w:cs="Courier New"/>
+          <w:color w:val="000000"/>
+          <w:sz w:val="17"/>
+          <w:szCs w:val="17"/>
+        </w:rPr>
+        <w:t>$</w:t>
+      </w:r>
+      <w:r>
+        <w:rPr>
+          <w:rFonts w:ascii="Consolas" w:hAnsi="Consolas" w:cs="Courier New"/>
+          <w:color w:val="008800"/>
+          <w:sz w:val="17"/>
+          <w:szCs w:val="17"/>
+        </w:rPr>
+        <w:t>"--- {title} ---"</w:t>
+      </w:r>
+      <w:r>
+        <w:rPr>
+          <w:rFonts w:ascii="Consolas" w:hAnsi="Consolas" w:cs="Courier New"/>
+          <w:color w:val="666600"/>
+          <w:sz w:val="17"/>
+          <w:szCs w:val="17"/>
+        </w:rPr>
+        <w:t>);</w:t>
+      </w:r>
+    </w:p>
+    <w:p>
+      <w:pPr>
+        <w:pStyle w:val="NormalWeb"/>
+        <w:pBdr>
+          <w:top w:val="single" w:sz="6" w:space="2" w:color="888888"/>
+          <w:left w:val="single" w:sz="6" w:space="2" w:color="888888"/>
+          <w:bottom w:val="single" w:sz="6" w:space="2" w:color="888888"/>
+          <w:right w:val="single" w:sz="6" w:space="2" w:color="888888"/>
+        </w:pBdr>
+        <w:tabs>
+          <w:tab w:val="left" w:pos="916"/>
+          <w:tab w:val="left" w:pos="1832"/>
+          <w:tab w:val="left" w:pos="2748"/>
+          <w:tab w:val="left" w:pos="3664"/>
+          <w:tab w:val="left" w:pos="4580"/>
+          <w:tab w:val="left" w:pos="5496"/>
+          <w:tab w:val="left" w:pos="6412"/>
+          <w:tab w:val="left" w:pos="7328"/>
+          <w:tab w:val="left" w:pos="8244"/>
+          <w:tab w:val="left" w:pos="9160"/>
+          <w:tab w:val="left" w:pos="10076"/>
+          <w:tab w:val="left" w:pos="10992"/>
+          <w:tab w:val="left" w:pos="11908"/>
+          <w:tab w:val="left" w:pos="12824"/>
+          <w:tab w:val="left" w:pos="13740"/>
+          <w:tab w:val="left" w:pos="14656"/>
+        </w:tabs>
+        <w:spacing w:before="0" w:beforeAutospacing="0" w:after="0" w:afterAutospacing="0"/>
+        <w:divId w:val="1680153283"/>
+        <w:rPr>
+          <w:rFonts w:ascii="Consolas" w:hAnsi="Consolas" w:cs="Courier New"/>
+          <w:sz w:val="17"/>
+          <w:szCs w:val="17"/>
+        </w:rPr>
+      </w:pPr>
+      <w:r>
+        <w:rPr>
+          <w:rFonts w:ascii="Consolas" w:hAnsi="Consolas" w:cs="Courier New"/>
+          <w:sz w:val="17"/>
+          <w:szCs w:val="17"/>
+        </w:rPr>
+        <w:t xml:space="preserve">10. </w:t>
+      </w:r>
+      <w:r>
+        <w:rPr>
+          <w:rFonts w:ascii="Consolas" w:hAnsi="Consolas" w:cs="Courier New"/>
+          <w:color w:val="000000"/>
+          <w:sz w:val="17"/>
+          <w:szCs w:val="17"/>
+        </w:rPr>
+        <w:t xml:space="preserve">        </w:t>
+      </w:r>
+      <w:r>
+        <w:rPr>
+          <w:rFonts w:ascii="Consolas" w:hAnsi="Consolas" w:cs="Courier New"/>
+          <w:color w:val="000088"/>
+          <w:sz w:val="17"/>
+          <w:szCs w:val="17"/>
+        </w:rPr>
+        <w:t>for</w:t>
+      </w:r>
+      <w:r>
+        <w:rPr>
+          <w:rFonts w:ascii="Consolas" w:hAnsi="Consolas" w:cs="Courier New"/>
+          <w:color w:val="000000"/>
+          <w:sz w:val="17"/>
+          <w:szCs w:val="17"/>
+        </w:rPr>
+        <w:t xml:space="preserve"> </w:t>
+      </w:r>
+      <w:r>
+        <w:rPr>
+          <w:rFonts w:ascii="Consolas" w:hAnsi="Consolas" w:cs="Courier New"/>
+          <w:color w:val="666600"/>
+          <w:sz w:val="17"/>
+          <w:szCs w:val="17"/>
+        </w:rPr>
+        <w:t>(</w:t>
+      </w:r>
+      <w:r>
+        <w:rPr>
+          <w:rFonts w:ascii="Consolas" w:hAnsi="Consolas" w:cs="Courier New"/>
+          <w:color w:val="000088"/>
+          <w:sz w:val="17"/>
+          <w:szCs w:val="17"/>
+        </w:rPr>
+        <w:t>int</w:t>
+      </w:r>
+      <w:r>
+        <w:rPr>
+          <w:rFonts w:ascii="Consolas" w:hAnsi="Consolas" w:cs="Courier New"/>
+          <w:color w:val="000000"/>
+          <w:sz w:val="17"/>
+          <w:szCs w:val="17"/>
+        </w:rPr>
+        <w:t xml:space="preserve"> i </w:t>
+      </w:r>
+      <w:r>
+        <w:rPr>
+          <w:rFonts w:ascii="Consolas" w:hAnsi="Consolas" w:cs="Courier New"/>
+          <w:color w:val="666600"/>
+          <w:sz w:val="17"/>
+          <w:szCs w:val="17"/>
+        </w:rPr>
+        <w:t>=</w:t>
+      </w:r>
+      <w:r>
+        <w:rPr>
+          <w:rFonts w:ascii="Consolas" w:hAnsi="Consolas" w:cs="Courier New"/>
+          <w:color w:val="000000"/>
+          <w:sz w:val="17"/>
+          <w:szCs w:val="17"/>
+        </w:rPr>
+        <w:t xml:space="preserve"> </w:t>
+      </w:r>
+      <w:r>
+        <w:rPr>
+          <w:rFonts w:ascii="Consolas" w:hAnsi="Consolas" w:cs="Courier New"/>
+          <w:color w:val="006666"/>
+          <w:sz w:val="17"/>
+          <w:szCs w:val="17"/>
+        </w:rPr>
+        <w:t>0</w:t>
+      </w:r>
+      <w:r>
+        <w:rPr>
+          <w:rFonts w:ascii="Consolas" w:hAnsi="Consolas" w:cs="Courier New"/>
+          <w:color w:val="666600"/>
+          <w:sz w:val="17"/>
+          <w:szCs w:val="17"/>
+        </w:rPr>
+        <w:t>;</w:t>
+      </w:r>
+      <w:r>
+        <w:rPr>
+          <w:rFonts w:ascii="Consolas" w:hAnsi="Consolas" w:cs="Courier New"/>
+          <w:color w:val="000000"/>
+          <w:sz w:val="17"/>
+          <w:szCs w:val="17"/>
+        </w:rPr>
+        <w:t xml:space="preserve"> i </w:t>
+      </w:r>
+      <w:r>
+        <w:rPr>
+          <w:rFonts w:ascii="Consolas" w:hAnsi="Consolas" w:cs="Courier New"/>
+          <w:color w:val="666600"/>
+          <w:sz w:val="17"/>
+          <w:szCs w:val="17"/>
+        </w:rPr>
+        <w:t>&lt;</w:t>
+      </w:r>
+      <w:r>
+        <w:rPr>
+          <w:rFonts w:ascii="Consolas" w:hAnsi="Consolas" w:cs="Courier New"/>
+          <w:color w:val="000000"/>
+          <w:sz w:val="17"/>
+          <w:szCs w:val="17"/>
+        </w:rPr>
+        <w:t xml:space="preserve"> </w:t>
+      </w:r>
+      <w:proofErr w:type="spellStart"/>
+      <w:proofErr w:type="gramStart"/>
+      <w:r>
+        <w:rPr>
+          <w:rFonts w:ascii="Consolas" w:hAnsi="Consolas" w:cs="Courier New"/>
+          <w:color w:val="000000"/>
+          <w:sz w:val="17"/>
+          <w:szCs w:val="17"/>
+        </w:rPr>
+        <w:t>items</w:t>
+      </w:r>
+      <w:r>
+        <w:rPr>
+          <w:rFonts w:ascii="Consolas" w:hAnsi="Consolas" w:cs="Courier New"/>
+          <w:color w:val="666600"/>
+          <w:sz w:val="17"/>
+          <w:szCs w:val="17"/>
+        </w:rPr>
+        <w:t>.</w:t>
+      </w:r>
+      <w:r>
+        <w:rPr>
+          <w:rFonts w:ascii="Consolas" w:hAnsi="Consolas" w:cs="Courier New"/>
+          <w:color w:val="660066"/>
+          <w:sz w:val="17"/>
+          <w:szCs w:val="17"/>
+        </w:rPr>
+        <w:t>Count</w:t>
+      </w:r>
+      <w:proofErr w:type="spellEnd"/>
+      <w:proofErr w:type="gramEnd"/>
+      <w:r>
+        <w:rPr>
+          <w:rFonts w:ascii="Consolas" w:hAnsi="Consolas" w:cs="Courier New"/>
+          <w:color w:val="666600"/>
+          <w:sz w:val="17"/>
+          <w:szCs w:val="17"/>
+        </w:rPr>
+        <w:t>;</w:t>
+      </w:r>
+      <w:r>
+        <w:rPr>
+          <w:rFonts w:ascii="Consolas" w:hAnsi="Consolas" w:cs="Courier New"/>
+          <w:color w:val="000000"/>
+          <w:sz w:val="17"/>
+          <w:szCs w:val="17"/>
+        </w:rPr>
+        <w:t xml:space="preserve"> i</w:t>
+      </w:r>
+      <w:r>
+        <w:rPr>
+          <w:rFonts w:ascii="Consolas" w:hAnsi="Consolas" w:cs="Courier New"/>
+          <w:color w:val="666600"/>
+          <w:sz w:val="17"/>
+          <w:szCs w:val="17"/>
+        </w:rPr>
+        <w:t>++)</w:t>
+      </w:r>
+    </w:p>
+    <w:p>
+      <w:pPr>
+        <w:pStyle w:val="NormalWeb"/>
+        <w:pBdr>
+          <w:top w:val="single" w:sz="6" w:space="2" w:color="888888"/>
+          <w:left w:val="single" w:sz="6" w:space="2" w:color="888888"/>
+          <w:bottom w:val="single" w:sz="6" w:space="2" w:color="888888"/>
+          <w:right w:val="single" w:sz="6" w:space="2" w:color="888888"/>
+        </w:pBdr>
+        <w:tabs>
+          <w:tab w:val="left" w:pos="916"/>
+          <w:tab w:val="left" w:pos="1832"/>
+          <w:tab w:val="left" w:pos="2748"/>
+          <w:tab w:val="left" w:pos="3664"/>
+          <w:tab w:val="left" w:pos="4580"/>
+          <w:tab w:val="left" w:pos="5496"/>
+          <w:tab w:val="left" w:pos="6412"/>
+          <w:tab w:val="left" w:pos="7328"/>
+          <w:tab w:val="left" w:pos="8244"/>
+          <w:tab w:val="left" w:pos="9160"/>
+          <w:tab w:val="left" w:pos="10076"/>
+          <w:tab w:val="left" w:pos="10992"/>
+          <w:tab w:val="left" w:pos="11908"/>
+          <w:tab w:val="left" w:pos="12824"/>
+          <w:tab w:val="left" w:pos="13740"/>
+          <w:tab w:val="left" w:pos="14656"/>
+        </w:tabs>
+        <w:spacing w:before="0" w:beforeAutospacing="0" w:after="0" w:afterAutospacing="0"/>
+        <w:divId w:val="1680153283"/>
+        <w:rPr>
+          <w:rFonts w:ascii="Consolas" w:hAnsi="Consolas" w:cs="Courier New"/>
+          <w:sz w:val="17"/>
+          <w:szCs w:val="17"/>
+        </w:rPr>
+      </w:pPr>
+      <w:r>
+        <w:rPr>
+          <w:rFonts w:ascii="Consolas" w:hAnsi="Consolas" w:cs="Courier New"/>
+          <w:sz w:val="17"/>
+          <w:szCs w:val="17"/>
+        </w:rPr>
+        <w:t xml:space="preserve">11. </w:t>
+      </w:r>
+      <w:r>
+        <w:rPr>
+          <w:rFonts w:ascii="Consolas" w:hAnsi="Consolas" w:cs="Courier New"/>
+          <w:color w:val="000000"/>
+          <w:sz w:val="17"/>
+          <w:szCs w:val="17"/>
+        </w:rPr>
+        <w:t xml:space="preserve">            </w:t>
+      </w:r>
+      <w:proofErr w:type="spellStart"/>
+      <w:r>
+        <w:rPr>
+          <w:rFonts w:ascii="Consolas" w:hAnsi="Consolas" w:cs="Courier New"/>
+          <w:color w:val="660066"/>
+          <w:sz w:val="17"/>
+          <w:szCs w:val="17"/>
+        </w:rPr>
+        <w:t>Console</w:t>
+      </w:r>
+      <w:r>
+        <w:rPr>
+          <w:rFonts w:ascii="Consolas" w:hAnsi="Consolas" w:cs="Courier New"/>
+          <w:color w:val="666600"/>
+          <w:sz w:val="17"/>
+          <w:szCs w:val="17"/>
+        </w:rPr>
+        <w:t>.</w:t>
+      </w:r>
+      <w:r>
+        <w:rPr>
+          <w:rFonts w:ascii="Consolas" w:hAnsi="Consolas" w:cs="Courier New"/>
+          <w:color w:val="660066"/>
+          <w:sz w:val="17"/>
+          <w:szCs w:val="17"/>
+        </w:rPr>
+        <w:t>WriteLine</w:t>
+      </w:r>
+      <w:proofErr w:type="spellEnd"/>
+      <w:r>
+        <w:rPr>
+          <w:rFonts w:ascii="Consolas" w:hAnsi="Consolas" w:cs="Courier New"/>
+          <w:color w:val="666600"/>
+          <w:sz w:val="17"/>
+          <w:szCs w:val="17"/>
+        </w:rPr>
+        <w:t>(</w:t>
+      </w:r>
+      <w:r>
+        <w:rPr>
+          <w:rFonts w:ascii="Consolas" w:hAnsi="Consolas" w:cs="Courier New"/>
+          <w:color w:val="000000"/>
+          <w:sz w:val="17"/>
+          <w:szCs w:val="17"/>
+        </w:rPr>
+        <w:t>$</w:t>
+      </w:r>
+      <w:r>
+        <w:rPr>
+          <w:rFonts w:ascii="Consolas" w:hAnsi="Consolas" w:cs="Courier New"/>
+          <w:color w:val="008800"/>
+          <w:sz w:val="17"/>
+          <w:szCs w:val="17"/>
+        </w:rPr>
+        <w:t>"{i + 1}. {display(items[i])}"</w:t>
+      </w:r>
+      <w:r>
+        <w:rPr>
+          <w:rFonts w:ascii="Consolas" w:hAnsi="Consolas" w:cs="Courier New"/>
+          <w:color w:val="666600"/>
+          <w:sz w:val="17"/>
+          <w:szCs w:val="17"/>
+        </w:rPr>
+        <w:t>);</w:t>
+      </w:r>
+    </w:p>
+    <w:p>
+      <w:pPr>
+        <w:pStyle w:val="NormalWeb"/>
+        <w:pBdr>
+          <w:top w:val="single" w:sz="6" w:space="2" w:color="888888"/>
+          <w:left w:val="single" w:sz="6" w:space="2" w:color="888888"/>
+          <w:bottom w:val="single" w:sz="6" w:space="2" w:color="888888"/>
+          <w:right w:val="single" w:sz="6" w:space="2" w:color="888888"/>
+        </w:pBdr>
+        <w:tabs>
+          <w:tab w:val="left" w:pos="916"/>
+          <w:tab w:val="left" w:pos="1832"/>
+          <w:tab w:val="left" w:pos="2748"/>
+          <w:tab w:val="left" w:pos="3664"/>
+          <w:tab w:val="left" w:pos="4580"/>
+          <w:tab w:val="left" w:pos="5496"/>
+          <w:tab w:val="left" w:pos="6412"/>
+          <w:tab w:val="left" w:pos="7328"/>
+          <w:tab w:val="left" w:pos="8244"/>
+          <w:tab w:val="left" w:pos="9160"/>
+          <w:tab w:val="left" w:pos="10076"/>
+          <w:tab w:val="left" w:pos="10992"/>
+          <w:tab w:val="left" w:pos="11908"/>
+          <w:tab w:val="left" w:pos="12824"/>
+          <w:tab w:val="left" w:pos="13740"/>
+          <w:tab w:val="left" w:pos="14656"/>
+        </w:tabs>
+        <w:spacing w:before="0" w:beforeAutospacing="0" w:after="0" w:afterAutospacing="0"/>
+        <w:divId w:val="1680153283"/>
+        <w:rPr>
+          <w:rFonts w:ascii="Consolas" w:hAnsi="Consolas" w:cs="Courier New"/>
+          <w:sz w:val="17"/>
+          <w:szCs w:val="17"/>
+        </w:rPr>
+      </w:pPr>
+      <w:r>
+        <w:rPr>
+          <w:rFonts w:ascii="Consolas" w:hAnsi="Consolas" w:cs="Courier New"/>
+          <w:sz w:val="17"/>
+          <w:szCs w:val="17"/>
+        </w:rPr>
+        <w:t xml:space="preserve">12. </w:t>
+      </w:r>
+      <w:r>
+        <w:rPr>
+          <w:rFonts w:ascii="Consolas" w:hAnsi="Consolas" w:cs="Courier New"/>
+          <w:color w:val="000000"/>
+          <w:sz w:val="17"/>
+          <w:szCs w:val="17"/>
+        </w:rPr>
+        <w:t xml:space="preserve">        </w:t>
+      </w:r>
+      <w:r>
+        <w:rPr>
+          <w:rFonts w:ascii="Consolas" w:hAnsi="Consolas" w:cs="Courier New"/>
+          <w:color w:val="000088"/>
+          <w:sz w:val="17"/>
+          <w:szCs w:val="17"/>
+        </w:rPr>
+        <w:t>if</w:t>
+      </w:r>
+      <w:r>
+        <w:rPr>
+          <w:rFonts w:ascii="Consolas" w:hAnsi="Consolas" w:cs="Courier New"/>
+          <w:color w:val="000000"/>
+          <w:sz w:val="17"/>
+          <w:szCs w:val="17"/>
+        </w:rPr>
+        <w:t xml:space="preserve"> </w:t>
+      </w:r>
+      <w:r>
+        <w:rPr>
+          <w:rFonts w:ascii="Consolas" w:hAnsi="Consolas" w:cs="Courier New"/>
+          <w:color w:val="666600"/>
+          <w:sz w:val="17"/>
+          <w:szCs w:val="17"/>
+        </w:rPr>
+        <w:t>(</w:t>
+      </w:r>
+      <w:proofErr w:type="spellStart"/>
+      <w:r>
+        <w:rPr>
+          <w:rFonts w:ascii="Consolas" w:hAnsi="Consolas" w:cs="Courier New"/>
+          <w:color w:val="000000"/>
+          <w:sz w:val="17"/>
+          <w:szCs w:val="17"/>
+        </w:rPr>
+        <w:t>allowNew</w:t>
+      </w:r>
+      <w:proofErr w:type="spellEnd"/>
+      <w:r>
+        <w:rPr>
+          <w:rFonts w:ascii="Consolas" w:hAnsi="Consolas" w:cs="Courier New"/>
+          <w:color w:val="666600"/>
+          <w:sz w:val="17"/>
+          <w:szCs w:val="17"/>
+        </w:rPr>
+        <w:t>)</w:t>
+      </w:r>
+    </w:p>
+    <w:p>
+      <w:pPr>
+        <w:pStyle w:val="NormalWeb"/>
+        <w:pBdr>
+          <w:top w:val="single" w:sz="6" w:space="2" w:color="888888"/>
+          <w:left w:val="single" w:sz="6" w:space="2" w:color="888888"/>
+          <w:bottom w:val="single" w:sz="6" w:space="2" w:color="888888"/>
+          <w:right w:val="single" w:sz="6" w:space="2" w:color="888888"/>
+        </w:pBdr>
+        <w:tabs>
+          <w:tab w:val="left" w:pos="916"/>
+          <w:tab w:val="left" w:pos="1832"/>
+          <w:tab w:val="left" w:pos="2748"/>
+          <w:tab w:val="left" w:pos="3664"/>
+          <w:tab w:val="left" w:pos="4580"/>
+          <w:tab w:val="left" w:pos="5496"/>
+          <w:tab w:val="left" w:pos="6412"/>
+          <w:tab w:val="left" w:pos="7328"/>
+          <w:tab w:val="left" w:pos="8244"/>
+          <w:tab w:val="left" w:pos="9160"/>
+          <w:tab w:val="left" w:pos="10076"/>
+          <w:tab w:val="left" w:pos="10992"/>
+          <w:tab w:val="left" w:pos="11908"/>
+          <w:tab w:val="left" w:pos="12824"/>
+          <w:tab w:val="left" w:pos="13740"/>
+          <w:tab w:val="left" w:pos="14656"/>
+        </w:tabs>
+        <w:spacing w:before="0" w:beforeAutospacing="0" w:after="0" w:afterAutospacing="0"/>
+        <w:divId w:val="1680153283"/>
+        <w:rPr>
+          <w:rFonts w:ascii="Consolas" w:hAnsi="Consolas" w:cs="Courier New"/>
+          <w:sz w:val="17"/>
+          <w:szCs w:val="17"/>
+        </w:rPr>
+      </w:pPr>
+      <w:r>
+        <w:rPr>
+          <w:rFonts w:ascii="Consolas" w:hAnsi="Consolas" w:cs="Courier New"/>
+          <w:sz w:val="17"/>
+          <w:szCs w:val="17"/>
+        </w:rPr>
+        <w:t xml:space="preserve">13. </w:t>
+      </w:r>
+      <w:r>
+        <w:rPr>
+          <w:rFonts w:ascii="Consolas" w:hAnsi="Consolas" w:cs="Courier New"/>
+          <w:color w:val="000000"/>
+          <w:sz w:val="17"/>
+          <w:szCs w:val="17"/>
+        </w:rPr>
+        <w:t xml:space="preserve">            </w:t>
+      </w:r>
+      <w:proofErr w:type="spellStart"/>
+      <w:r>
+        <w:rPr>
+          <w:rFonts w:ascii="Consolas" w:hAnsi="Consolas" w:cs="Courier New"/>
+          <w:color w:val="660066"/>
+          <w:sz w:val="17"/>
+          <w:szCs w:val="17"/>
+        </w:rPr>
+        <w:t>Console</w:t>
+      </w:r>
+      <w:r>
+        <w:rPr>
+          <w:rFonts w:ascii="Consolas" w:hAnsi="Consolas" w:cs="Courier New"/>
+          <w:color w:val="666600"/>
+          <w:sz w:val="17"/>
+          <w:szCs w:val="17"/>
+        </w:rPr>
+        <w:t>.</w:t>
+      </w:r>
+      <w:r>
+        <w:rPr>
+          <w:rFonts w:ascii="Consolas" w:hAnsi="Consolas" w:cs="Courier New"/>
+          <w:color w:val="660066"/>
+          <w:sz w:val="17"/>
+          <w:szCs w:val="17"/>
+        </w:rPr>
+        <w:t>WriteLine</w:t>
+      </w:r>
+      <w:proofErr w:type="spellEnd"/>
+      <w:r>
+        <w:rPr>
+          <w:rFonts w:ascii="Consolas" w:hAnsi="Consolas" w:cs="Courier New"/>
+          <w:color w:val="666600"/>
+          <w:sz w:val="17"/>
+          <w:szCs w:val="17"/>
+        </w:rPr>
+        <w:t>(</w:t>
+      </w:r>
+      <w:r>
+        <w:rPr>
+          <w:rFonts w:ascii="Consolas" w:hAnsi="Consolas" w:cs="Courier New"/>
+          <w:color w:val="008800"/>
+          <w:sz w:val="17"/>
+          <w:szCs w:val="17"/>
+        </w:rPr>
+        <w:t>"0. + Create new"</w:t>
+      </w:r>
+      <w:r>
+        <w:rPr>
+          <w:rFonts w:ascii="Consolas" w:hAnsi="Consolas" w:cs="Courier New"/>
+          <w:color w:val="666600"/>
+          <w:sz w:val="17"/>
+          <w:szCs w:val="17"/>
+        </w:rPr>
+        <w:t>);</w:t>
+      </w:r>
+    </w:p>
+    <w:p>
+      <w:pPr>
+        <w:pStyle w:val="NormalWeb"/>
+        <w:pBdr>
+          <w:top w:val="single" w:sz="6" w:space="2" w:color="888888"/>
+          <w:left w:val="single" w:sz="6" w:space="2" w:color="888888"/>
+          <w:bottom w:val="single" w:sz="6" w:space="2" w:color="888888"/>
+          <w:right w:val="single" w:sz="6" w:space="2" w:color="888888"/>
+        </w:pBdr>
+        <w:tabs>
+          <w:tab w:val="left" w:pos="916"/>
+          <w:tab w:val="left" w:pos="1832"/>
+          <w:tab w:val="left" w:pos="2748"/>
+          <w:tab w:val="left" w:pos="3664"/>
+          <w:tab w:val="left" w:pos="4580"/>
+          <w:tab w:val="left" w:pos="5496"/>
+          <w:tab w:val="left" w:pos="6412"/>
+          <w:tab w:val="left" w:pos="7328"/>
+          <w:tab w:val="left" w:pos="8244"/>
+          <w:tab w:val="left" w:pos="9160"/>
+          <w:tab w:val="left" w:pos="10076"/>
+          <w:tab w:val="left" w:pos="10992"/>
+          <w:tab w:val="left" w:pos="11908"/>
+          <w:tab w:val="left" w:pos="12824"/>
+          <w:tab w:val="left" w:pos="13740"/>
+          <w:tab w:val="left" w:pos="14656"/>
+        </w:tabs>
+        <w:spacing w:before="0" w:beforeAutospacing="0" w:after="0" w:afterAutospacing="0"/>
+        <w:divId w:val="1680153283"/>
+        <w:rPr>
+          <w:rFonts w:ascii="Consolas" w:hAnsi="Consolas" w:cs="Courier New"/>
+          <w:sz w:val="17"/>
+          <w:szCs w:val="17"/>
+        </w:rPr>
+      </w:pPr>
+      <w:r>
+        <w:rPr>
+          <w:rFonts w:ascii="Consolas" w:hAnsi="Consolas" w:cs="Courier New"/>
+          <w:sz w:val="17"/>
+          <w:szCs w:val="17"/>
+        </w:rPr>
+        <w:t xml:space="preserve">14. </w:t>
+      </w:r>
+      <w:r>
+        <w:rPr>
+          <w:rFonts w:ascii="Consolas" w:hAnsi="Consolas" w:cs="Courier New"/>
+          <w:color w:val="000000"/>
+          <w:sz w:val="17"/>
+          <w:szCs w:val="17"/>
+        </w:rPr>
+        <w:t> </w:t>
+      </w:r>
+    </w:p>
+    <w:p>
+      <w:pPr>
+        <w:pStyle w:val="NormalWeb"/>
+        <w:pBdr>
+          <w:top w:val="single" w:sz="6" w:space="2" w:color="888888"/>
+          <w:left w:val="single" w:sz="6" w:space="2" w:color="888888"/>
+          <w:bottom w:val="single" w:sz="6" w:space="2" w:color="888888"/>
+          <w:right w:val="single" w:sz="6" w:space="2" w:color="888888"/>
+        </w:pBdr>
+        <w:tabs>
+          <w:tab w:val="left" w:pos="916"/>
+          <w:tab w:val="left" w:pos="1832"/>
+          <w:tab w:val="left" w:pos="2748"/>
+          <w:tab w:val="left" w:pos="3664"/>
+          <w:tab w:val="left" w:pos="4580"/>
+          <w:tab w:val="left" w:pos="5496"/>
+          <w:tab w:val="left" w:pos="6412"/>
+          <w:tab w:val="left" w:pos="7328"/>
+          <w:tab w:val="left" w:pos="8244"/>
+          <w:tab w:val="left" w:pos="9160"/>
+          <w:tab w:val="left" w:pos="10076"/>
+          <w:tab w:val="left" w:pos="10992"/>
+          <w:tab w:val="left" w:pos="11908"/>
+          <w:tab w:val="left" w:pos="12824"/>
+          <w:tab w:val="left" w:pos="13740"/>
+          <w:tab w:val="left" w:pos="14656"/>
+        </w:tabs>
+        <w:spacing w:before="0" w:beforeAutospacing="0" w:after="0" w:afterAutospacing="0"/>
+        <w:divId w:val="1680153283"/>
+        <w:rPr>
+          <w:rFonts w:ascii="Consolas" w:hAnsi="Consolas" w:cs="Courier New"/>
+          <w:sz w:val="17"/>
+          <w:szCs w:val="17"/>
+        </w:rPr>
+      </w:pPr>
+      <w:r>
+        <w:rPr>
+          <w:rFonts w:ascii="Consolas" w:hAnsi="Consolas" w:cs="Courier New"/>
+          <w:sz w:val="17"/>
+          <w:szCs w:val="17"/>
+        </w:rPr>
+        <w:t xml:space="preserve">15. </w:t>
+      </w:r>
+      <w:r>
+        <w:rPr>
+          <w:rFonts w:ascii="Consolas" w:hAnsi="Consolas" w:cs="Courier New"/>
+          <w:color w:val="000000"/>
+          <w:sz w:val="17"/>
+          <w:szCs w:val="17"/>
+        </w:rPr>
+        <w:t xml:space="preserve">        </w:t>
+      </w:r>
+      <w:r>
+        <w:rPr>
+          <w:rFonts w:ascii="Consolas" w:hAnsi="Consolas" w:cs="Courier New"/>
+          <w:color w:val="000088"/>
+          <w:sz w:val="17"/>
+          <w:szCs w:val="17"/>
+        </w:rPr>
+        <w:t>while</w:t>
+      </w:r>
+      <w:r>
+        <w:rPr>
+          <w:rFonts w:ascii="Consolas" w:hAnsi="Consolas" w:cs="Courier New"/>
+          <w:color w:val="000000"/>
+          <w:sz w:val="17"/>
+          <w:szCs w:val="17"/>
+        </w:rPr>
+        <w:t xml:space="preserve"> </w:t>
+      </w:r>
+      <w:r>
+        <w:rPr>
+          <w:rFonts w:ascii="Consolas" w:hAnsi="Consolas" w:cs="Courier New"/>
+          <w:color w:val="666600"/>
+          <w:sz w:val="17"/>
+          <w:szCs w:val="17"/>
+        </w:rPr>
+        <w:t>(</w:t>
+      </w:r>
+      <w:r>
+        <w:rPr>
+          <w:rFonts w:ascii="Consolas" w:hAnsi="Consolas" w:cs="Courier New"/>
+          <w:color w:val="000088"/>
+          <w:sz w:val="17"/>
+          <w:szCs w:val="17"/>
+        </w:rPr>
+        <w:t>true</w:t>
+      </w:r>
+      <w:r>
+        <w:rPr>
+          <w:rFonts w:ascii="Consolas" w:hAnsi="Consolas" w:cs="Courier New"/>
+          <w:color w:val="666600"/>
+          <w:sz w:val="17"/>
+          <w:szCs w:val="17"/>
+        </w:rPr>
+        <w:t>)</w:t>
+      </w:r>
+    </w:p>
+    <w:p>
+      <w:pPr>
+        <w:pStyle w:val="NormalWeb"/>
+        <w:pBdr>
+          <w:top w:val="single" w:sz="6" w:space="2" w:color="888888"/>
+          <w:left w:val="single" w:sz="6" w:space="2" w:color="888888"/>
+          <w:bottom w:val="single" w:sz="6" w:space="2" w:color="888888"/>
+          <w:right w:val="single" w:sz="6" w:space="2" w:color="888888"/>
+        </w:pBdr>
+        <w:tabs>
+          <w:tab w:val="left" w:pos="916"/>
+          <w:tab w:val="left" w:pos="1832"/>
+          <w:tab w:val="left" w:pos="2748"/>
+          <w:tab w:val="left" w:pos="3664"/>
+          <w:tab w:val="left" w:pos="4580"/>
+          <w:tab w:val="left" w:pos="5496"/>
+          <w:tab w:val="left" w:pos="6412"/>
+          <w:tab w:val="left" w:pos="7328"/>
+          <w:tab w:val="left" w:pos="8244"/>
+          <w:tab w:val="left" w:pos="9160"/>
+          <w:tab w:val="left" w:pos="10076"/>
+          <w:tab w:val="left" w:pos="10992"/>
+          <w:tab w:val="left" w:pos="11908"/>
+          <w:tab w:val="left" w:pos="12824"/>
+          <w:tab w:val="left" w:pos="13740"/>
+          <w:tab w:val="left" w:pos="14656"/>
+        </w:tabs>
+        <w:spacing w:before="0" w:beforeAutospacing="0" w:after="0" w:afterAutospacing="0"/>
+        <w:divId w:val="1680153283"/>
+        <w:rPr>
+          <w:rFonts w:ascii="Consolas" w:hAnsi="Consolas" w:cs="Courier New"/>
+          <w:sz w:val="17"/>
+          <w:szCs w:val="17"/>
+        </w:rPr>
+      </w:pPr>
+      <w:r>
+        <w:rPr>
+          <w:rFonts w:ascii="Consolas" w:hAnsi="Consolas" w:cs="Courier New"/>
+          <w:sz w:val="17"/>
+          <w:szCs w:val="17"/>
+        </w:rPr>
+        <w:t xml:space="preserve">16. </w:t>
+      </w:r>
+      <w:r>
+        <w:rPr>
+          <w:rFonts w:ascii="Consolas" w:hAnsi="Consolas" w:cs="Courier New"/>
+          <w:color w:val="000000"/>
+          <w:sz w:val="17"/>
+          <w:szCs w:val="17"/>
+        </w:rPr>
+        <w:t xml:space="preserve">     </w:t>
+      </w:r>
+      <w:proofErr w:type="gramStart"/>
+      <w:r>
+        <w:rPr>
+          <w:rFonts w:ascii="Consolas" w:hAnsi="Consolas" w:cs="Courier New"/>
+          <w:color w:val="000000"/>
+          <w:sz w:val="17"/>
+          <w:szCs w:val="17"/>
+        </w:rPr>
+        <w:t xml:space="preserve">   </w:t>
+      </w:r>
+      <w:r>
+        <w:rPr>
+          <w:rFonts w:ascii="Consolas" w:hAnsi="Consolas" w:cs="Courier New"/>
+          <w:color w:val="666600"/>
+          <w:sz w:val="17"/>
+          <w:szCs w:val="17"/>
+        </w:rPr>
+        <w:t>{</w:t>
+      </w:r>
+      <w:proofErr w:type="gramEnd"/>
+    </w:p>
+    <w:p>
+      <w:pPr>
+        <w:pStyle w:val="NormalWeb"/>
+        <w:pBdr>
+          <w:top w:val="single" w:sz="6" w:space="2" w:color="888888"/>
+          <w:left w:val="single" w:sz="6" w:space="2" w:color="888888"/>
+          <w:bottom w:val="single" w:sz="6" w:space="2" w:color="888888"/>
+          <w:right w:val="single" w:sz="6" w:space="2" w:color="888888"/>
+        </w:pBdr>
+        <w:tabs>
+          <w:tab w:val="left" w:pos="916"/>
+          <w:tab w:val="left" w:pos="1832"/>
+          <w:tab w:val="left" w:pos="2748"/>
+          <w:tab w:val="left" w:pos="3664"/>
+          <w:tab w:val="left" w:pos="4580"/>
+          <w:tab w:val="left" w:pos="5496"/>
+          <w:tab w:val="left" w:pos="6412"/>
+          <w:tab w:val="left" w:pos="7328"/>
+          <w:tab w:val="left" w:pos="8244"/>
+          <w:tab w:val="left" w:pos="9160"/>
+          <w:tab w:val="left" w:pos="10076"/>
+          <w:tab w:val="left" w:pos="10992"/>
+          <w:tab w:val="left" w:pos="11908"/>
+          <w:tab w:val="left" w:pos="12824"/>
+          <w:tab w:val="left" w:pos="13740"/>
+          <w:tab w:val="left" w:pos="14656"/>
+        </w:tabs>
+        <w:spacing w:before="0" w:beforeAutospacing="0" w:after="0" w:afterAutospacing="0"/>
+        <w:divId w:val="1680153283"/>
+        <w:rPr>
+          <w:rFonts w:ascii="Consolas" w:hAnsi="Consolas" w:cs="Courier New"/>
+          <w:sz w:val="17"/>
+          <w:szCs w:val="17"/>
+        </w:rPr>
+      </w:pPr>
+      <w:r>
+        <w:rPr>
+          <w:rFonts w:ascii="Consolas" w:hAnsi="Consolas" w:cs="Courier New"/>
+          <w:sz w:val="17"/>
+          <w:szCs w:val="17"/>
+        </w:rPr>
+        <w:t xml:space="preserve">17. </w:t>
+      </w:r>
+      <w:r>
+        <w:rPr>
+          <w:rFonts w:ascii="Consolas" w:hAnsi="Consolas" w:cs="Courier New"/>
+          <w:color w:val="000000"/>
+          <w:sz w:val="17"/>
+          <w:szCs w:val="17"/>
+        </w:rPr>
+        <w:t xml:space="preserve">            </w:t>
+      </w:r>
+      <w:r>
+        <w:rPr>
+          <w:rFonts w:ascii="Consolas" w:hAnsi="Consolas" w:cs="Courier New"/>
+          <w:color w:val="000088"/>
+          <w:sz w:val="17"/>
+          <w:szCs w:val="17"/>
+        </w:rPr>
+        <w:t>int</w:t>
+      </w:r>
+      <w:r>
+        <w:rPr>
+          <w:rFonts w:ascii="Consolas" w:hAnsi="Consolas" w:cs="Courier New"/>
+          <w:color w:val="000000"/>
+          <w:sz w:val="17"/>
+          <w:szCs w:val="17"/>
+        </w:rPr>
+        <w:t xml:space="preserve"> choice </w:t>
+      </w:r>
+      <w:r>
+        <w:rPr>
+          <w:rFonts w:ascii="Consolas" w:hAnsi="Consolas" w:cs="Courier New"/>
+          <w:color w:val="666600"/>
+          <w:sz w:val="17"/>
+          <w:szCs w:val="17"/>
+        </w:rPr>
+        <w:t>=</w:t>
+      </w:r>
+      <w:r>
+        <w:rPr>
+          <w:rFonts w:ascii="Consolas" w:hAnsi="Consolas" w:cs="Courier New"/>
+          <w:color w:val="000000"/>
+          <w:sz w:val="17"/>
+          <w:szCs w:val="17"/>
+        </w:rPr>
+        <w:t xml:space="preserve"> </w:t>
+      </w:r>
+      <w:proofErr w:type="spellStart"/>
+      <w:r>
+        <w:rPr>
+          <w:rFonts w:ascii="Consolas" w:hAnsi="Consolas" w:cs="Courier New"/>
+          <w:color w:val="660066"/>
+          <w:sz w:val="17"/>
+          <w:szCs w:val="17"/>
+        </w:rPr>
+        <w:t>ConsoleHelper</w:t>
+      </w:r>
+      <w:r>
+        <w:rPr>
+          <w:rFonts w:ascii="Consolas" w:hAnsi="Consolas" w:cs="Courier New"/>
+          <w:color w:val="666600"/>
+          <w:sz w:val="17"/>
+          <w:szCs w:val="17"/>
+        </w:rPr>
+        <w:t>.</w:t>
+      </w:r>
+      <w:r>
+        <w:rPr>
+          <w:rFonts w:ascii="Consolas" w:hAnsi="Consolas" w:cs="Courier New"/>
+          <w:color w:val="660066"/>
+          <w:sz w:val="17"/>
+          <w:szCs w:val="17"/>
+        </w:rPr>
+        <w:t>ReadInt</w:t>
+      </w:r>
+      <w:proofErr w:type="spellEnd"/>
+      <w:r>
+        <w:rPr>
+          <w:rFonts w:ascii="Consolas" w:hAnsi="Consolas" w:cs="Courier New"/>
+          <w:color w:val="666600"/>
+          <w:sz w:val="17"/>
+          <w:szCs w:val="17"/>
+        </w:rPr>
+        <w:t>(</w:t>
+      </w:r>
+      <w:r>
+        <w:rPr>
+          <w:rFonts w:ascii="Consolas" w:hAnsi="Consolas" w:cs="Courier New"/>
+          <w:color w:val="008800"/>
+          <w:sz w:val="17"/>
+          <w:szCs w:val="17"/>
+        </w:rPr>
+        <w:t>"Select: "</w:t>
+      </w:r>
+      <w:r>
+        <w:rPr>
+          <w:rFonts w:ascii="Consolas" w:hAnsi="Consolas" w:cs="Courier New"/>
+          <w:color w:val="666600"/>
+          <w:sz w:val="17"/>
+          <w:szCs w:val="17"/>
+        </w:rPr>
+        <w:t>);</w:t>
+      </w:r>
+    </w:p>
+    <w:p>
+      <w:pPr>
+        <w:pStyle w:val="NormalWeb"/>
+        <w:pBdr>
+          <w:top w:val="single" w:sz="6" w:space="2" w:color="888888"/>
+          <w:left w:val="single" w:sz="6" w:space="2" w:color="888888"/>
+          <w:bottom w:val="single" w:sz="6" w:space="2" w:color="888888"/>
+          <w:right w:val="single" w:sz="6" w:space="2" w:color="888888"/>
+        </w:pBdr>
+        <w:tabs>
+          <w:tab w:val="left" w:pos="916"/>
+          <w:tab w:val="left" w:pos="1832"/>
+          <w:tab w:val="left" w:pos="2748"/>
+          <w:tab w:val="left" w:pos="3664"/>
+          <w:tab w:val="left" w:pos="4580"/>
+          <w:tab w:val="left" w:pos="5496"/>
+          <w:tab w:val="left" w:pos="6412"/>
+          <w:tab w:val="left" w:pos="7328"/>
+          <w:tab w:val="left" w:pos="8244"/>
+          <w:tab w:val="left" w:pos="9160"/>
+          <w:tab w:val="left" w:pos="10076"/>
+          <w:tab w:val="left" w:pos="10992"/>
+          <w:tab w:val="left" w:pos="11908"/>
+          <w:tab w:val="left" w:pos="12824"/>
+          <w:tab w:val="left" w:pos="13740"/>
+          <w:tab w:val="left" w:pos="14656"/>
+        </w:tabs>
+        <w:spacing w:before="0" w:beforeAutospacing="0" w:after="0" w:afterAutospacing="0"/>
+        <w:divId w:val="1680153283"/>
+        <w:rPr>
+          <w:rFonts w:ascii="Consolas" w:hAnsi="Consolas" w:cs="Courier New"/>
+          <w:sz w:val="17"/>
+          <w:szCs w:val="17"/>
+        </w:rPr>
+      </w:pPr>
+      <w:r>
+        <w:rPr>
+          <w:rFonts w:ascii="Consolas" w:hAnsi="Consolas" w:cs="Courier New"/>
+          <w:sz w:val="17"/>
+          <w:szCs w:val="17"/>
+        </w:rPr>
+        <w:t xml:space="preserve">18. </w:t>
+      </w:r>
+      <w:r>
+        <w:rPr>
+          <w:rFonts w:ascii="Consolas" w:hAnsi="Consolas" w:cs="Courier New"/>
+          <w:color w:val="000000"/>
+          <w:sz w:val="17"/>
+          <w:szCs w:val="17"/>
+        </w:rPr>
+        <w:t xml:space="preserve">            </w:t>
+      </w:r>
+      <w:r>
+        <w:rPr>
+          <w:rFonts w:ascii="Consolas" w:hAnsi="Consolas" w:cs="Courier New"/>
+          <w:color w:val="000088"/>
+          <w:sz w:val="17"/>
+          <w:szCs w:val="17"/>
+        </w:rPr>
+        <w:t>if</w:t>
+      </w:r>
+      <w:r>
+        <w:rPr>
+          <w:rFonts w:ascii="Consolas" w:hAnsi="Consolas" w:cs="Courier New"/>
+          <w:color w:val="000000"/>
+          <w:sz w:val="17"/>
+          <w:szCs w:val="17"/>
+        </w:rPr>
+        <w:t xml:space="preserve"> </w:t>
+      </w:r>
+      <w:r>
+        <w:rPr>
+          <w:rFonts w:ascii="Consolas" w:hAnsi="Consolas" w:cs="Courier New"/>
+          <w:color w:val="666600"/>
+          <w:sz w:val="17"/>
+          <w:szCs w:val="17"/>
+        </w:rPr>
+        <w:t>(</w:t>
+      </w:r>
+      <w:proofErr w:type="spellStart"/>
+      <w:r>
+        <w:rPr>
+          <w:rFonts w:ascii="Consolas" w:hAnsi="Consolas" w:cs="Courier New"/>
+          <w:color w:val="000000"/>
+          <w:sz w:val="17"/>
+          <w:szCs w:val="17"/>
+        </w:rPr>
+        <w:t>allowNew</w:t>
+      </w:r>
+      <w:proofErr w:type="spellEnd"/>
+      <w:r>
+        <w:rPr>
+          <w:rFonts w:ascii="Consolas" w:hAnsi="Consolas" w:cs="Courier New"/>
+          <w:color w:val="000000"/>
+          <w:sz w:val="17"/>
+          <w:szCs w:val="17"/>
+        </w:rPr>
+        <w:t xml:space="preserve"> </w:t>
+      </w:r>
+      <w:r>
+        <w:rPr>
+          <w:rFonts w:ascii="Consolas" w:hAnsi="Consolas" w:cs="Courier New"/>
+          <w:color w:val="666600"/>
+          <w:sz w:val="17"/>
+          <w:szCs w:val="17"/>
+        </w:rPr>
+        <w:t>&amp;&amp;</w:t>
+      </w:r>
+      <w:r>
+        <w:rPr>
+          <w:rFonts w:ascii="Consolas" w:hAnsi="Consolas" w:cs="Courier New"/>
+          <w:color w:val="000000"/>
+          <w:sz w:val="17"/>
+          <w:szCs w:val="17"/>
+        </w:rPr>
+        <w:t xml:space="preserve"> choice </w:t>
+      </w:r>
+      <w:r>
+        <w:rPr>
+          <w:rFonts w:ascii="Consolas" w:hAnsi="Consolas" w:cs="Courier New"/>
+          <w:color w:val="666600"/>
+          <w:sz w:val="17"/>
+          <w:szCs w:val="17"/>
+        </w:rPr>
+        <w:t>==</w:t>
+      </w:r>
+      <w:r>
+        <w:rPr>
+          <w:rFonts w:ascii="Consolas" w:hAnsi="Consolas" w:cs="Courier New"/>
+          <w:color w:val="000000"/>
+          <w:sz w:val="17"/>
+          <w:szCs w:val="17"/>
+        </w:rPr>
+        <w:t xml:space="preserve"> </w:t>
+      </w:r>
+      <w:r>
+        <w:rPr>
+          <w:rFonts w:ascii="Consolas" w:hAnsi="Consolas" w:cs="Courier New"/>
+          <w:color w:val="006666"/>
+          <w:sz w:val="17"/>
+          <w:szCs w:val="17"/>
+        </w:rPr>
+        <w:t>0</w:t>
+      </w:r>
+      <w:r>
+        <w:rPr>
+          <w:rFonts w:ascii="Consolas" w:hAnsi="Consolas" w:cs="Courier New"/>
+          <w:color w:val="666600"/>
+          <w:sz w:val="17"/>
+          <w:szCs w:val="17"/>
+        </w:rPr>
+        <w:t>)</w:t>
+      </w:r>
+      <w:r>
+        <w:rPr>
+          <w:rFonts w:ascii="Consolas" w:hAnsi="Consolas" w:cs="Courier New"/>
+          <w:color w:val="000000"/>
+          <w:sz w:val="17"/>
+          <w:szCs w:val="17"/>
+        </w:rPr>
+        <w:t xml:space="preserve"> </w:t>
+      </w:r>
+      <w:r>
+        <w:rPr>
+          <w:rFonts w:ascii="Consolas" w:hAnsi="Consolas" w:cs="Courier New"/>
+          <w:color w:val="000088"/>
+          <w:sz w:val="17"/>
+          <w:szCs w:val="17"/>
+        </w:rPr>
+        <w:t>return</w:t>
+      </w:r>
+      <w:r>
+        <w:rPr>
+          <w:rFonts w:ascii="Consolas" w:hAnsi="Consolas" w:cs="Courier New"/>
+          <w:color w:val="000000"/>
+          <w:sz w:val="17"/>
+          <w:szCs w:val="17"/>
+        </w:rPr>
+        <w:t xml:space="preserve"> </w:t>
+      </w:r>
+      <w:proofErr w:type="gramStart"/>
+      <w:r>
+        <w:rPr>
+          <w:rFonts w:ascii="Consolas" w:hAnsi="Consolas" w:cs="Courier New"/>
+          <w:color w:val="000088"/>
+          <w:sz w:val="17"/>
+          <w:szCs w:val="17"/>
+        </w:rPr>
+        <w:t>default</w:t>
+      </w:r>
+      <w:r>
+        <w:rPr>
+          <w:rFonts w:ascii="Consolas" w:hAnsi="Consolas" w:cs="Courier New"/>
+          <w:color w:val="666600"/>
+          <w:sz w:val="17"/>
+          <w:szCs w:val="17"/>
+        </w:rPr>
+        <w:t>;</w:t>
+      </w:r>
+      <w:r>
+        <w:rPr>
+          <w:rFonts w:ascii="Consolas" w:hAnsi="Consolas" w:cs="Courier New"/>
+          <w:color w:val="000000"/>
+          <w:sz w:val="17"/>
+          <w:szCs w:val="17"/>
+        </w:rPr>
+        <w:t xml:space="preserve">   </w:t>
+      </w:r>
+      <w:proofErr w:type="gramEnd"/>
+      <w:r>
+        <w:rPr>
+          <w:rFonts w:ascii="Consolas" w:hAnsi="Consolas" w:cs="Courier New"/>
+          <w:color w:val="000000"/>
+          <w:sz w:val="17"/>
+          <w:szCs w:val="17"/>
+        </w:rPr>
+        <w:t xml:space="preserve">       </w:t>
+      </w:r>
+      <w:r>
+        <w:rPr>
+          <w:rFonts w:ascii="Consolas" w:hAnsi="Consolas" w:cs="Courier New"/>
+          <w:color w:val="880000"/>
+          <w:sz w:val="17"/>
+          <w:szCs w:val="17"/>
+        </w:rPr>
+        <w:t>// signal: create new</w:t>
+      </w:r>
+    </w:p>
+    <w:p>
+      <w:pPr>
+        <w:pStyle w:val="NormalWeb"/>
+        <w:pBdr>
+          <w:top w:val="single" w:sz="6" w:space="2" w:color="888888"/>
+          <w:left w:val="single" w:sz="6" w:space="2" w:color="888888"/>
+          <w:bottom w:val="single" w:sz="6" w:space="2" w:color="888888"/>
+          <w:right w:val="single" w:sz="6" w:space="2" w:color="888888"/>
+        </w:pBdr>
+        <w:tabs>
+          <w:tab w:val="left" w:pos="916"/>
+          <w:tab w:val="left" w:pos="1832"/>
+          <w:tab w:val="left" w:pos="2748"/>
+          <w:tab w:val="left" w:pos="3664"/>
+          <w:tab w:val="left" w:pos="4580"/>
+          <w:tab w:val="left" w:pos="5496"/>
+          <w:tab w:val="left" w:pos="6412"/>
+          <w:tab w:val="left" w:pos="7328"/>
+          <w:tab w:val="left" w:pos="8244"/>
+          <w:tab w:val="left" w:pos="9160"/>
+          <w:tab w:val="left" w:pos="10076"/>
+          <w:tab w:val="left" w:pos="10992"/>
+          <w:tab w:val="left" w:pos="11908"/>
+          <w:tab w:val="left" w:pos="12824"/>
+          <w:tab w:val="left" w:pos="13740"/>
+          <w:tab w:val="left" w:pos="14656"/>
+        </w:tabs>
+        <w:spacing w:before="0" w:beforeAutospacing="0" w:after="0" w:afterAutospacing="0"/>
+        <w:divId w:val="1680153283"/>
+        <w:rPr>
+          <w:rFonts w:ascii="Consolas" w:hAnsi="Consolas" w:cs="Courier New"/>
+          <w:sz w:val="17"/>
+          <w:szCs w:val="17"/>
+        </w:rPr>
+      </w:pPr>
+      <w:r>
+        <w:rPr>
+          <w:rFonts w:ascii="Consolas" w:hAnsi="Consolas" w:cs="Courier New"/>
+          <w:sz w:val="17"/>
+          <w:szCs w:val="17"/>
+        </w:rPr>
+        <w:t xml:space="preserve">19. </w:t>
+      </w:r>
+      <w:r>
+        <w:rPr>
+          <w:rFonts w:ascii="Consolas" w:hAnsi="Consolas" w:cs="Courier New"/>
+          <w:color w:val="000000"/>
+          <w:sz w:val="17"/>
+          <w:szCs w:val="17"/>
+        </w:rPr>
+        <w:t xml:space="preserve">            </w:t>
+      </w:r>
+      <w:r>
+        <w:rPr>
+          <w:rFonts w:ascii="Consolas" w:hAnsi="Consolas" w:cs="Courier New"/>
+          <w:color w:val="000088"/>
+          <w:sz w:val="17"/>
+          <w:szCs w:val="17"/>
+        </w:rPr>
+        <w:t>if</w:t>
+      </w:r>
+      <w:r>
+        <w:rPr>
+          <w:rFonts w:ascii="Consolas" w:hAnsi="Consolas" w:cs="Courier New"/>
+          <w:color w:val="000000"/>
+          <w:sz w:val="17"/>
+          <w:szCs w:val="17"/>
+        </w:rPr>
+        <w:t xml:space="preserve"> </w:t>
+      </w:r>
+      <w:r>
+        <w:rPr>
+          <w:rFonts w:ascii="Consolas" w:hAnsi="Consolas" w:cs="Courier New"/>
+          <w:color w:val="666600"/>
+          <w:sz w:val="17"/>
+          <w:szCs w:val="17"/>
+        </w:rPr>
+        <w:t>(</w:t>
+      </w:r>
+      <w:r>
+        <w:rPr>
+          <w:rFonts w:ascii="Consolas" w:hAnsi="Consolas" w:cs="Courier New"/>
+          <w:color w:val="000000"/>
+          <w:sz w:val="17"/>
+          <w:szCs w:val="17"/>
+        </w:rPr>
+        <w:t xml:space="preserve">choice </w:t>
+      </w:r>
+      <w:r>
+        <w:rPr>
+          <w:rFonts w:ascii="Consolas" w:hAnsi="Consolas" w:cs="Courier New"/>
+          <w:color w:val="666600"/>
+          <w:sz w:val="17"/>
+          <w:szCs w:val="17"/>
+        </w:rPr>
+        <w:t>&gt;=</w:t>
+      </w:r>
+      <w:r>
+        <w:rPr>
+          <w:rFonts w:ascii="Consolas" w:hAnsi="Consolas" w:cs="Courier New"/>
+          <w:color w:val="000000"/>
+          <w:sz w:val="17"/>
+          <w:szCs w:val="17"/>
+        </w:rPr>
+        <w:t xml:space="preserve"> </w:t>
+      </w:r>
+      <w:r>
+        <w:rPr>
+          <w:rFonts w:ascii="Consolas" w:hAnsi="Consolas" w:cs="Courier New"/>
+          <w:color w:val="006666"/>
+          <w:sz w:val="17"/>
+          <w:szCs w:val="17"/>
+        </w:rPr>
+        <w:t>1</w:t>
+      </w:r>
+      <w:r>
+        <w:rPr>
+          <w:rFonts w:ascii="Consolas" w:hAnsi="Consolas" w:cs="Courier New"/>
+          <w:color w:val="000000"/>
+          <w:sz w:val="17"/>
+          <w:szCs w:val="17"/>
+        </w:rPr>
+        <w:t xml:space="preserve"> </w:t>
+      </w:r>
+      <w:r>
+        <w:rPr>
+          <w:rFonts w:ascii="Consolas" w:hAnsi="Consolas" w:cs="Courier New"/>
+          <w:color w:val="666600"/>
+          <w:sz w:val="17"/>
+          <w:szCs w:val="17"/>
+        </w:rPr>
+        <w:t>&amp;&amp;</w:t>
+      </w:r>
+      <w:r>
+        <w:rPr>
+          <w:rFonts w:ascii="Consolas" w:hAnsi="Consolas" w:cs="Courier New"/>
+          <w:color w:val="000000"/>
+          <w:sz w:val="17"/>
+          <w:szCs w:val="17"/>
+        </w:rPr>
+        <w:t xml:space="preserve"> choice </w:t>
+      </w:r>
+      <w:r>
+        <w:rPr>
+          <w:rFonts w:ascii="Consolas" w:hAnsi="Consolas" w:cs="Courier New"/>
+          <w:color w:val="666600"/>
+          <w:sz w:val="17"/>
+          <w:szCs w:val="17"/>
+        </w:rPr>
+        <w:t>&lt;=</w:t>
+      </w:r>
+      <w:r>
+        <w:rPr>
+          <w:rFonts w:ascii="Consolas" w:hAnsi="Consolas" w:cs="Courier New"/>
+          <w:color w:val="000000"/>
+          <w:sz w:val="17"/>
+          <w:szCs w:val="17"/>
+        </w:rPr>
+        <w:t xml:space="preserve"> </w:t>
+      </w:r>
+      <w:proofErr w:type="spellStart"/>
+      <w:proofErr w:type="gramStart"/>
+      <w:r>
+        <w:rPr>
+          <w:rFonts w:ascii="Consolas" w:hAnsi="Consolas" w:cs="Courier New"/>
+          <w:color w:val="000000"/>
+          <w:sz w:val="17"/>
+          <w:szCs w:val="17"/>
+        </w:rPr>
+        <w:t>items</w:t>
+      </w:r>
+      <w:r>
+        <w:rPr>
+          <w:rFonts w:ascii="Consolas" w:hAnsi="Consolas" w:cs="Courier New"/>
+          <w:color w:val="666600"/>
+          <w:sz w:val="17"/>
+          <w:szCs w:val="17"/>
+        </w:rPr>
+        <w:t>.</w:t>
+      </w:r>
+      <w:r>
+        <w:rPr>
+          <w:rFonts w:ascii="Consolas" w:hAnsi="Consolas" w:cs="Courier New"/>
+          <w:color w:val="660066"/>
+          <w:sz w:val="17"/>
+          <w:szCs w:val="17"/>
+        </w:rPr>
+        <w:t>Count</w:t>
+      </w:r>
+      <w:proofErr w:type="spellEnd"/>
+      <w:proofErr w:type="gramEnd"/>
+      <w:r>
+        <w:rPr>
+          <w:rFonts w:ascii="Consolas" w:hAnsi="Consolas" w:cs="Courier New"/>
+          <w:color w:val="666600"/>
+          <w:sz w:val="17"/>
+          <w:szCs w:val="17"/>
+        </w:rPr>
+        <w:t>)</w:t>
+      </w:r>
+      <w:r>
+        <w:rPr>
+          <w:rFonts w:ascii="Consolas" w:hAnsi="Consolas" w:cs="Courier New"/>
+          <w:color w:val="000000"/>
+          <w:sz w:val="17"/>
+          <w:szCs w:val="17"/>
+        </w:rPr>
+        <w:t xml:space="preserve"> </w:t>
+      </w:r>
+      <w:r>
+        <w:rPr>
+          <w:rFonts w:ascii="Consolas" w:hAnsi="Consolas" w:cs="Courier New"/>
+          <w:color w:val="000088"/>
+          <w:sz w:val="17"/>
+          <w:szCs w:val="17"/>
+        </w:rPr>
+        <w:t>return</w:t>
+      </w:r>
+      <w:r>
+        <w:rPr>
+          <w:rFonts w:ascii="Consolas" w:hAnsi="Consolas" w:cs="Courier New"/>
+          <w:color w:val="000000"/>
+          <w:sz w:val="17"/>
+          <w:szCs w:val="17"/>
+        </w:rPr>
+        <w:t xml:space="preserve"> </w:t>
+      </w:r>
+      <w:proofErr w:type="gramStart"/>
+      <w:r>
+        <w:rPr>
+          <w:rFonts w:ascii="Consolas" w:hAnsi="Consolas" w:cs="Courier New"/>
+          <w:color w:val="000000"/>
+          <w:sz w:val="17"/>
+          <w:szCs w:val="17"/>
+        </w:rPr>
+        <w:t>items</w:t>
+      </w:r>
+      <w:r>
+        <w:rPr>
+          <w:rFonts w:ascii="Consolas" w:hAnsi="Consolas" w:cs="Courier New"/>
+          <w:color w:val="666600"/>
+          <w:sz w:val="17"/>
+          <w:szCs w:val="17"/>
+        </w:rPr>
+        <w:t>[</w:t>
+      </w:r>
+      <w:proofErr w:type="gramEnd"/>
+      <w:r>
+        <w:rPr>
+          <w:rFonts w:ascii="Consolas" w:hAnsi="Consolas" w:cs="Courier New"/>
+          <w:color w:val="000000"/>
+          <w:sz w:val="17"/>
+          <w:szCs w:val="17"/>
+        </w:rPr>
+        <w:t xml:space="preserve">choice </w:t>
+      </w:r>
+      <w:r>
+        <w:rPr>
+          <w:rFonts w:ascii="Consolas" w:hAnsi="Consolas" w:cs="Courier New"/>
+          <w:color w:val="666600"/>
+          <w:sz w:val="17"/>
+          <w:szCs w:val="17"/>
+        </w:rPr>
+        <w:t>-</w:t>
+      </w:r>
+      <w:r>
+        <w:rPr>
+          <w:rFonts w:ascii="Consolas" w:hAnsi="Consolas" w:cs="Courier New"/>
+          <w:color w:val="000000"/>
+          <w:sz w:val="17"/>
+          <w:szCs w:val="17"/>
+        </w:rPr>
+        <w:t xml:space="preserve"> </w:t>
+      </w:r>
+      <w:r>
+        <w:rPr>
+          <w:rFonts w:ascii="Consolas" w:hAnsi="Consolas" w:cs="Courier New"/>
+          <w:color w:val="006666"/>
+          <w:sz w:val="17"/>
+          <w:szCs w:val="17"/>
+        </w:rPr>
+        <w:t>1</w:t>
+      </w:r>
+      <w:r>
+        <w:rPr>
+          <w:rFonts w:ascii="Consolas" w:hAnsi="Consolas" w:cs="Courier New"/>
+          <w:color w:val="666600"/>
+          <w:sz w:val="17"/>
+          <w:szCs w:val="17"/>
+        </w:rPr>
+        <w:t>];</w:t>
+      </w:r>
+    </w:p>
+    <w:p>
+      <w:pPr>
+        <w:pStyle w:val="NormalWeb"/>
+        <w:pBdr>
+          <w:top w:val="single" w:sz="6" w:space="2" w:color="888888"/>
+          <w:left w:val="single" w:sz="6" w:space="2" w:color="888888"/>
+          <w:bottom w:val="single" w:sz="6" w:space="2" w:color="888888"/>
+          <w:right w:val="single" w:sz="6" w:space="2" w:color="888888"/>
+        </w:pBdr>
+        <w:tabs>
+          <w:tab w:val="left" w:pos="916"/>
+          <w:tab w:val="left" w:pos="1832"/>
+          <w:tab w:val="left" w:pos="2748"/>
+          <w:tab w:val="left" w:pos="3664"/>
+          <w:tab w:val="left" w:pos="4580"/>
+          <w:tab w:val="left" w:pos="5496"/>
+          <w:tab w:val="left" w:pos="6412"/>
+          <w:tab w:val="left" w:pos="7328"/>
+          <w:tab w:val="left" w:pos="8244"/>
+          <w:tab w:val="left" w:pos="9160"/>
+          <w:tab w:val="left" w:pos="10076"/>
+          <w:tab w:val="left" w:pos="10992"/>
+          <w:tab w:val="left" w:pos="11908"/>
+          <w:tab w:val="left" w:pos="12824"/>
+          <w:tab w:val="left" w:pos="13740"/>
+          <w:tab w:val="left" w:pos="14656"/>
+        </w:tabs>
+        <w:spacing w:before="0" w:beforeAutospacing="0" w:after="0" w:afterAutospacing="0"/>
+        <w:divId w:val="1680153283"/>
+        <w:rPr>
+          <w:rFonts w:ascii="Consolas" w:hAnsi="Consolas" w:cs="Courier New"/>
+          <w:sz w:val="17"/>
+          <w:szCs w:val="17"/>
+        </w:rPr>
+      </w:pPr>
+      <w:r>
+        <w:rPr>
+          <w:rFonts w:ascii="Consolas" w:hAnsi="Consolas" w:cs="Courier New"/>
+          <w:sz w:val="17"/>
+          <w:szCs w:val="17"/>
+        </w:rPr>
+        <w:t xml:space="preserve">20. </w:t>
+      </w:r>
+      <w:r>
+        <w:rPr>
+          <w:rFonts w:ascii="Consolas" w:hAnsi="Consolas" w:cs="Courier New"/>
+          <w:color w:val="000000"/>
+          <w:sz w:val="17"/>
+          <w:szCs w:val="17"/>
+        </w:rPr>
+        <w:t xml:space="preserve">            </w:t>
+      </w:r>
+      <w:proofErr w:type="spellStart"/>
+      <w:r>
+        <w:rPr>
+          <w:rFonts w:ascii="Consolas" w:hAnsi="Consolas" w:cs="Courier New"/>
+          <w:color w:val="660066"/>
+          <w:sz w:val="17"/>
+          <w:szCs w:val="17"/>
+        </w:rPr>
+        <w:t>Console</w:t>
+      </w:r>
+      <w:r>
+        <w:rPr>
+          <w:rFonts w:ascii="Consolas" w:hAnsi="Consolas" w:cs="Courier New"/>
+          <w:color w:val="666600"/>
+          <w:sz w:val="17"/>
+          <w:szCs w:val="17"/>
+        </w:rPr>
+        <w:t>.</w:t>
+      </w:r>
+      <w:r>
+        <w:rPr>
+          <w:rFonts w:ascii="Consolas" w:hAnsi="Consolas" w:cs="Courier New"/>
+          <w:color w:val="660066"/>
+          <w:sz w:val="17"/>
+          <w:szCs w:val="17"/>
+        </w:rPr>
+        <w:t>WriteLine</w:t>
+      </w:r>
+      <w:proofErr w:type="spellEnd"/>
+      <w:r>
+        <w:rPr>
+          <w:rFonts w:ascii="Consolas" w:hAnsi="Consolas" w:cs="Courier New"/>
+          <w:color w:val="666600"/>
+          <w:sz w:val="17"/>
+          <w:szCs w:val="17"/>
+        </w:rPr>
+        <w:t>(</w:t>
+      </w:r>
+      <w:r>
+        <w:rPr>
+          <w:rFonts w:ascii="Consolas" w:hAnsi="Consolas" w:cs="Courier New"/>
+          <w:color w:val="008800"/>
+          <w:sz w:val="17"/>
+          <w:szCs w:val="17"/>
+        </w:rPr>
+        <w:t>"Invalid selection, try again."</w:t>
+      </w:r>
+      <w:r>
+        <w:rPr>
+          <w:rFonts w:ascii="Consolas" w:hAnsi="Consolas" w:cs="Courier New"/>
+          <w:color w:val="666600"/>
+          <w:sz w:val="17"/>
+          <w:szCs w:val="17"/>
+        </w:rPr>
+        <w:t>);</w:t>
+      </w:r>
+    </w:p>
+    <w:p>
+      <w:pPr>
+        <w:pStyle w:val="NormalWeb"/>
+        <w:pBdr>
+          <w:top w:val="single" w:sz="6" w:space="2" w:color="888888"/>
+          <w:left w:val="single" w:sz="6" w:space="2" w:color="888888"/>
+          <w:bottom w:val="single" w:sz="6" w:space="2" w:color="888888"/>
+          <w:right w:val="single" w:sz="6" w:space="2" w:color="888888"/>
+        </w:pBdr>
+        <w:tabs>
+          <w:tab w:val="left" w:pos="916"/>
+          <w:tab w:val="left" w:pos="1832"/>
+          <w:tab w:val="left" w:pos="2748"/>
+          <w:tab w:val="left" w:pos="3664"/>
+          <w:tab w:val="left" w:pos="4580"/>
+          <w:tab w:val="left" w:pos="5496"/>
+          <w:tab w:val="left" w:pos="6412"/>
+          <w:tab w:val="left" w:pos="7328"/>
+          <w:tab w:val="left" w:pos="8244"/>
+          <w:tab w:val="left" w:pos="9160"/>
+          <w:tab w:val="left" w:pos="10076"/>
+          <w:tab w:val="left" w:pos="10992"/>
+          <w:tab w:val="left" w:pos="11908"/>
+          <w:tab w:val="left" w:pos="12824"/>
+          <w:tab w:val="left" w:pos="13740"/>
+          <w:tab w:val="left" w:pos="14656"/>
+        </w:tabs>
+        <w:spacing w:before="0" w:beforeAutospacing="0" w:after="0" w:afterAutospacing="0"/>
+        <w:divId w:val="1680153283"/>
+        <w:rPr>
+          <w:rFonts w:ascii="Consolas" w:hAnsi="Consolas" w:cs="Courier New"/>
+          <w:sz w:val="17"/>
+          <w:szCs w:val="17"/>
+        </w:rPr>
+      </w:pPr>
+      <w:r>
+        <w:rPr>
+          <w:rFonts w:ascii="Consolas" w:hAnsi="Consolas" w:cs="Courier New"/>
+          <w:sz w:val="17"/>
+          <w:szCs w:val="17"/>
+        </w:rPr>
+        <w:t xml:space="preserve">21. </w:t>
+      </w:r>
+      <w:r>
+        <w:rPr>
+          <w:rFonts w:ascii="Consolas" w:hAnsi="Consolas" w:cs="Courier New"/>
+          <w:color w:val="000000"/>
+          <w:sz w:val="17"/>
+          <w:szCs w:val="17"/>
+        </w:rPr>
+        <w:t xml:space="preserve">      </w:t>
+      </w:r>
+      <w:proofErr w:type="gramStart"/>
+      <w:r>
+        <w:rPr>
+          <w:rFonts w:ascii="Consolas" w:hAnsi="Consolas" w:cs="Courier New"/>
+          <w:color w:val="000000"/>
+          <w:sz w:val="17"/>
+          <w:szCs w:val="17"/>
+        </w:rPr>
+        <w:t xml:space="preserve">  </w:t>
+      </w:r>
+      <w:r>
+        <w:rPr>
+          <w:rFonts w:ascii="Consolas" w:hAnsi="Consolas" w:cs="Courier New"/>
+          <w:color w:val="666600"/>
+          <w:sz w:val="17"/>
+          <w:szCs w:val="17"/>
+        </w:rPr>
+        <w:t>}</w:t>
+      </w:r>
+      <w:proofErr w:type="gramEnd"/>
+    </w:p>
+    <w:p>
+      <w:pPr>
+        <w:pStyle w:val="NormalWeb"/>
+        <w:pBdr>
+          <w:top w:val="single" w:sz="6" w:space="2" w:color="888888"/>
+          <w:left w:val="single" w:sz="6" w:space="2" w:color="888888"/>
+          <w:bottom w:val="single" w:sz="6" w:space="2" w:color="888888"/>
+          <w:right w:val="single" w:sz="6" w:space="2" w:color="888888"/>
+        </w:pBdr>
+        <w:tabs>
+          <w:tab w:val="left" w:pos="916"/>
+          <w:tab w:val="left" w:pos="1832"/>
+          <w:tab w:val="left" w:pos="2748"/>
+          <w:tab w:val="left" w:pos="3664"/>
+          <w:tab w:val="left" w:pos="4580"/>
+          <w:tab w:val="left" w:pos="5496"/>
+          <w:tab w:val="left" w:pos="6412"/>
+          <w:tab w:val="left" w:pos="7328"/>
+          <w:tab w:val="left" w:pos="8244"/>
+          <w:tab w:val="left" w:pos="9160"/>
+          <w:tab w:val="left" w:pos="10076"/>
+          <w:tab w:val="left" w:pos="10992"/>
+          <w:tab w:val="left" w:pos="11908"/>
+          <w:tab w:val="left" w:pos="12824"/>
+          <w:tab w:val="left" w:pos="13740"/>
+          <w:tab w:val="left" w:pos="14656"/>
+        </w:tabs>
+        <w:spacing w:before="0" w:beforeAutospacing="0" w:after="0" w:afterAutospacing="0"/>
+        <w:divId w:val="1680153283"/>
+        <w:rPr>
+          <w:rFonts w:ascii="Consolas" w:hAnsi="Consolas" w:cs="Courier New"/>
+          <w:sz w:val="17"/>
+          <w:szCs w:val="17"/>
+        </w:rPr>
+      </w:pPr>
+      <w:r>
+        <w:rPr>
+          <w:rFonts w:ascii="Consolas" w:hAnsi="Consolas" w:cs="Courier New"/>
+          <w:sz w:val="17"/>
+          <w:szCs w:val="17"/>
+        </w:rPr>
+        <w:t xml:space="preserve">22. </w:t>
+      </w:r>
+      <w:r>
+        <w:rPr>
+          <w:rFonts w:ascii="Consolas" w:hAnsi="Consolas" w:cs="Courier New"/>
+          <w:color w:val="000000"/>
+          <w:sz w:val="17"/>
+          <w:szCs w:val="17"/>
+        </w:rPr>
+        <w:t xml:space="preserve">  </w:t>
+      </w:r>
+      <w:proofErr w:type="gramStart"/>
+      <w:r>
+        <w:rPr>
+          <w:rFonts w:ascii="Consolas" w:hAnsi="Consolas" w:cs="Courier New"/>
+          <w:color w:val="000000"/>
+          <w:sz w:val="17"/>
+          <w:szCs w:val="17"/>
+        </w:rPr>
+        <w:t xml:space="preserve">  </w:t>
+      </w:r>
+      <w:r>
+        <w:rPr>
+          <w:rFonts w:ascii="Consolas" w:hAnsi="Consolas" w:cs="Courier New"/>
+          <w:color w:val="666600"/>
+          <w:sz w:val="17"/>
+          <w:szCs w:val="17"/>
+        </w:rPr>
+        <w:t>}</w:t>
+      </w:r>
+      <w:proofErr w:type="gramEnd"/>
+    </w:p>
+    <w:p>
+      <w:pPr>
+        <w:pStyle w:val="NormalWeb"/>
+        <w:pBdr>
+          <w:top w:val="single" w:sz="6" w:space="2" w:color="888888"/>
+          <w:left w:val="single" w:sz="6" w:space="2" w:color="888888"/>
+          <w:bottom w:val="single" w:sz="6" w:space="2" w:color="888888"/>
+          <w:right w:val="single" w:sz="6" w:space="2" w:color="888888"/>
+        </w:pBdr>
+        <w:tabs>
+          <w:tab w:val="left" w:pos="916"/>
+          <w:tab w:val="left" w:pos="1832"/>
+          <w:tab w:val="left" w:pos="2748"/>
+          <w:tab w:val="left" w:pos="3664"/>
+          <w:tab w:val="left" w:pos="4580"/>
+          <w:tab w:val="left" w:pos="5496"/>
+          <w:tab w:val="left" w:pos="6412"/>
+          <w:tab w:val="left" w:pos="7328"/>
+          <w:tab w:val="left" w:pos="8244"/>
+          <w:tab w:val="left" w:pos="9160"/>
+          <w:tab w:val="left" w:pos="10076"/>
+          <w:tab w:val="left" w:pos="10992"/>
+          <w:tab w:val="left" w:pos="11908"/>
+          <w:tab w:val="left" w:pos="12824"/>
+          <w:tab w:val="left" w:pos="13740"/>
+          <w:tab w:val="left" w:pos="14656"/>
+        </w:tabs>
+        <w:spacing w:before="0" w:beforeAutospacing="0" w:after="0" w:afterAutospacing="0"/>
+        <w:divId w:val="1680153283"/>
+        <w:rPr>
+          <w:rFonts w:ascii="Consolas" w:hAnsi="Consolas" w:cs="Courier New"/>
+          <w:sz w:val="17"/>
+          <w:szCs w:val="17"/>
+        </w:rPr>
+      </w:pPr>
+      <w:proofErr w:type="gramStart"/>
+      <w:r>
+        <w:rPr>
+          <w:rFonts w:ascii="Consolas" w:hAnsi="Consolas" w:cs="Courier New"/>
+          <w:sz w:val="17"/>
+          <w:szCs w:val="17"/>
+        </w:rPr>
+        <w:t xml:space="preserve">23. </w:t>
+      </w:r>
+      <w:r>
+        <w:rPr>
+          <w:rFonts w:ascii="Consolas" w:hAnsi="Consolas" w:cs="Courier New"/>
+          <w:color w:val="666600"/>
+          <w:sz w:val="17"/>
+          <w:szCs w:val="17"/>
+        </w:rPr>
+        <w:t>}</w:t>
+      </w:r>
+      <w:proofErr w:type="gramEnd"/>
+    </w:p>
+    <w:p>
+      <w:pPr>
+        <w:pStyle w:val="NormalWeb"/>
+        <w:pBdr>
+          <w:top w:val="single" w:sz="6" w:space="2" w:color="888888"/>
+          <w:left w:val="single" w:sz="6" w:space="2" w:color="888888"/>
+          <w:bottom w:val="single" w:sz="6" w:space="2" w:color="888888"/>
+          <w:right w:val="single" w:sz="6" w:space="2" w:color="888888"/>
+        </w:pBdr>
+        <w:tabs>
+          <w:tab w:val="left" w:pos="916"/>
+          <w:tab w:val="left" w:pos="1832"/>
+          <w:tab w:val="left" w:pos="2748"/>
+          <w:tab w:val="left" w:pos="3664"/>
+          <w:tab w:val="left" w:pos="4580"/>
+          <w:tab w:val="left" w:pos="5496"/>
+          <w:tab w:val="left" w:pos="6412"/>
+          <w:tab w:val="left" w:pos="7328"/>
+          <w:tab w:val="left" w:pos="8244"/>
+          <w:tab w:val="left" w:pos="9160"/>
+          <w:tab w:val="left" w:pos="10076"/>
+          <w:tab w:val="left" w:pos="10992"/>
+          <w:tab w:val="left" w:pos="11908"/>
+          <w:tab w:val="left" w:pos="12824"/>
+          <w:tab w:val="left" w:pos="13740"/>
+          <w:tab w:val="left" w:pos="14656"/>
+        </w:tabs>
+        <w:spacing w:before="0" w:beforeAutospacing="0" w:after="0" w:afterAutospacing="0"/>
+        <w:divId w:val="1680153283"/>
+        <w:rPr>
+          <w:rFonts w:ascii="Consolas" w:hAnsi="Consolas" w:cs="Courier New"/>
+          <w:sz w:val="17"/>
+          <w:szCs w:val="17"/>
+        </w:rPr>
+      </w:pPr>
+      <w:r>
+        <w:rPr>
+          <w:rFonts w:ascii="Consolas" w:hAnsi="Consolas" w:cs="Courier New"/>
+          <w:sz w:val="17"/>
+          <w:szCs w:val="17"/>
+        </w:rPr>
+        <w:t xml:space="preserve">24. </w:t>
+      </w:r>
+      <w:r>
+        <w:rPr>
+          <w:rFonts w:ascii="Consolas" w:hAnsi="Consolas" w:cs="Courier New"/>
+          <w:color w:val="000000"/>
+          <w:sz w:val="17"/>
+          <w:szCs w:val="17"/>
+        </w:rPr>
+        <w:t> </w:t>
+      </w:r>
+    </w:p>
+    <w:p>
+      <w:pPr>
+        <w:rPr>
+          <w:highlight w:val="green"/>
+          <w:rtl/>
+        </w:rPr>
+      </w:pPr>
+    </w:p>
+    <w:p>
+      <w:pPr>
+        <w:rPr>
+          <w:highlight w:val="green"/>
+          <w:rtl/>
+        </w:rPr>
+      </w:pPr>
+    </w:p>
+    <w:p>
+      <w:pPr>
+        <w:rPr>
+          <w:highlight w:val="green"/>
+        </w:rPr>
+      </w:pPr>
     </w:p>
     <w:sectPr>
       <w:headerReference w:type="default" r:id="rId10"/>
@@ -22921,6 +25795,7 @@
   <w:style w:type="character" w:default="1" w:styleId="DefaultParagraphFont">
     <w:name w:val="Default Paragraph Font"/>
     <w:uiPriority w:val="1"/>
+    <w:semiHidden/>
     <w:unhideWhenUsed/>
   </w:style>
   <w:style w:type="table" w:default="1" w:styleId="TableNormal">
@@ -23653,7 +26528,7 @@
 
 <file path=word/webextensions/taskpanes.xml><?xml version="1.0" encoding="utf-8"?>
 <wetp:taskpanes xmlns:wetp="http://schemas.microsoft.com/office/webextensions/taskpanes/2010/11">
-  <wetp:taskpane dockstate="right" visibility="0" width="350" row="1">
+  <wetp:taskpane dockstate="right" visibility="0" width="350" row="3">
     <wetp:webextensionref xmlns:r="http://schemas.openxmlformats.org/officeDocument/2006/relationships" r:id="rId1"/>
   </wetp:taskpane>
 </wetp:taskpanes>

</xml_diff>